<commit_message>
Updated code to accommodate RStudio upgrade. Shortened Abstract.
</commit_message>
<xml_diff>
--- a/2025_earwig_fecundity_Evolutionary_Ecology.docx
+++ b/2025_earwig_fecundity_Evolutionary_Ecology.docx
@@ -98,7 +98,7 @@
         <w:t xml:space="preserve">Forficula auricularia</w:t>
       </w:r>
       <w:r>
-        <w:t xml:space="preserve">). A Bayesian bivariate mixed model separated covariance expressed among females from covariance expressed within females after accounting for brood order and female structural size, and a complementary size-adjusted model tested whether the among-female relationship differed between reproductive bouts. Females produced fewer eggs with smaller mean perimeters in their second brood, and the pooled phenotypic association between egg number and egg perimeter was near zero. The persistent among-female correlation across broods was estimated with insufficient precision to support a firm conclusion. In contrast, the within-female residual correlation estimated by the bivariate model was negative: after accounting for the average brood-order shift, structural size, and stable differences among females, relatively high egg production was associated with relatively small egg perimeters. The among-female pattern also differed across reproductive contexts. Egg number was unrelated to egg perimeter among females in first broods, whereas females producing more eggs in their second brood produced eggs with smaller perimeters. The negative second-brood relationship was robust to how egg number was standardized, whereas the precision of the difference between brood-specific relationships depended somewhat on standardization. Sensitivity analyses based on proportional changes in egg number were directionally consistent with within-female compensation, whereas analyses of absolute changes were not. Thus, a negative egg number–perimeter relationship consistent with a size–number trade-off was most clearly expressed among females during the second reproductive bout, with additional, though model- and scale-dependent, evidence of within-female compensation across broods.</w:t>
+        <w:t xml:space="preserve">). A Bayesian bivariate mixed model separated among-female from within-female covariance after accounting for brood order and structural size, and a complementary size-adjusted model tested whether the among-female relationship differed between reproductive bouts. Females produced fewer eggs with smaller mean perimeters in their second brood, and the pooled association was near zero. The persistent among-female correlation across broods was estimated with insufficient precision for a firm conclusion. In contrast, the within-female residual correlation was negative: after accounting for the brood-order shift, structural size, and stable differences among females, high egg production was associated with small egg perimeters. The among-female pattern also differed across reproductive contexts. Egg number was unrelated to egg perimeter among females in first broods, whereas females producing more eggs in their second brood produced eggs with smaller perimeters. The second-brood relationship was robust to how egg number was standardized, though the precision of the brood difference depended somewhat on scaling. Sensitivity analyses based on proportional changes in egg number were directionally consistent with within-female compensation; analyses of absolute changes were not. Thus, a negative egg number–perimeter relationship consistent with a size–number trade-off was most clearly expressed among females during the second reproductive bout, with additional, scale-dependent evidence of within-female compensation across broods.</w:t>
       </w:r>
     </w:p>
     <w:bookmarkEnd w:id="21"/>
@@ -1931,7 +1931,6 @@
                 <w:trHeight w:val="429" w:hRule="auto"/>
                 <w:tblHeader/>
               </w:trPr>
-              header 1
               <w:tc>
                 <w:tcPr>
                   <w:tcBorders>
@@ -1951,7 +1950,6 @@
                 </w:tcPr>
                 <w:p>
                   <w:pPr>
-                    <w:pStyle w:val="Normal"/>
                     <w:jc w:val="left"/>
                     <w:pBdr>
                       <w:bottom w:val="none" w:sz="0" w:space="0" w:color="000000"/>
@@ -1961,6 +1959,16 @@
                     </w:pBdr>
                     <w:spacing w:after="40" w:before="40" w:line="240"/>
                     <w:ind w:left="40" w:right="40" w:firstLine="0" w:firstLineChars="0"/>
+                    <w:rPr>
+                      <w:rFonts w:ascii="Helvetica" w:hAnsi="Helvetica" w:eastAsia="Helvetica" w:cs="Helvetica"/>
+                      <w:i w:val="false"/>
+                      <w:b w:val="true"/>
+                      <w:u w:val="none"/>
+                      <w:strike w:val="false"/>
+                      <w:sz w:val="19"/>
+                      <w:szCs w:val="19"/>
+                      <w:color w:val="000000"/>
+                    </w:rPr>
                   </w:pPr>
                   <w:r xmlns:w="http://schemas.openxmlformats.org/wordprocessingml/2006/main" xmlns:wp="http://schemas.openxmlformats.org/drawingml/2006/wordprocessingDrawing" xmlns:r="http://schemas.openxmlformats.org/officeDocument/2006/relationships" xmlns:w14="http://schemas.microsoft.com/office/word/2010/wordml">
                     <w:rPr>
@@ -1968,6 +1976,7 @@
                       <w:i w:val="false"/>
                       <w:b w:val="true"/>
                       <w:u w:val="none"/>
+                      <w:strike w:val="false"/>
                       <w:sz w:val="19"/>
                       <w:szCs w:val="19"/>
                       <w:color w:val="000000"/>
@@ -1995,7 +2004,6 @@
                 </w:tcPr>
                 <w:p>
                   <w:pPr>
-                    <w:pStyle w:val="Normal"/>
                     <w:jc w:val="left"/>
                     <w:pBdr>
                       <w:bottom w:val="none" w:sz="0" w:space="0" w:color="000000"/>
@@ -2005,6 +2013,16 @@
                     </w:pBdr>
                     <w:spacing w:after="40" w:before="40" w:line="240"/>
                     <w:ind w:left="40" w:right="40" w:firstLine="0" w:firstLineChars="0"/>
+                    <w:rPr>
+                      <w:rFonts w:ascii="Helvetica" w:hAnsi="Helvetica" w:eastAsia="Helvetica" w:cs="Helvetica"/>
+                      <w:i w:val="false"/>
+                      <w:b w:val="true"/>
+                      <w:u w:val="none"/>
+                      <w:strike w:val="false"/>
+                      <w:sz w:val="19"/>
+                      <w:szCs w:val="19"/>
+                      <w:color w:val="000000"/>
+                    </w:rPr>
                   </w:pPr>
                   <w:r xmlns:w="http://schemas.openxmlformats.org/wordprocessingml/2006/main" xmlns:wp="http://schemas.openxmlformats.org/drawingml/2006/wordprocessingDrawing" xmlns:r="http://schemas.openxmlformats.org/officeDocument/2006/relationships" xmlns:w14="http://schemas.microsoft.com/office/word/2010/wordml">
                     <w:rPr>
@@ -2012,6 +2030,7 @@
                       <w:i w:val="false"/>
                       <w:b w:val="true"/>
                       <w:u w:val="none"/>
+                      <w:strike w:val="false"/>
                       <w:sz w:val="19"/>
                       <w:szCs w:val="19"/>
                       <w:color w:val="000000"/>
@@ -2039,7 +2058,6 @@
                 </w:tcPr>
                 <w:p>
                   <w:pPr>
-                    <w:pStyle w:val="Normal"/>
                     <w:jc w:val="left"/>
                     <w:pBdr>
                       <w:bottom w:val="none" w:sz="0" w:space="0" w:color="000000"/>
@@ -2049,6 +2067,16 @@
                     </w:pBdr>
                     <w:spacing w:after="40" w:before="40" w:line="240"/>
                     <w:ind w:left="40" w:right="40" w:firstLine="0" w:firstLineChars="0"/>
+                    <w:rPr>
+                      <w:rFonts w:ascii="Helvetica" w:hAnsi="Helvetica" w:eastAsia="Helvetica" w:cs="Helvetica"/>
+                      <w:i w:val="false"/>
+                      <w:b w:val="true"/>
+                      <w:u w:val="none"/>
+                      <w:strike w:val="false"/>
+                      <w:sz w:val="19"/>
+                      <w:szCs w:val="19"/>
+                      <w:color w:val="000000"/>
+                    </w:rPr>
                   </w:pPr>
                   <w:r xmlns:w="http://schemas.openxmlformats.org/wordprocessingml/2006/main" xmlns:wp="http://schemas.openxmlformats.org/drawingml/2006/wordprocessingDrawing" xmlns:r="http://schemas.openxmlformats.org/officeDocument/2006/relationships" xmlns:w14="http://schemas.microsoft.com/office/word/2010/wordml">
                     <w:rPr>
@@ -2056,6 +2084,7 @@
                       <w:i w:val="false"/>
                       <w:b w:val="true"/>
                       <w:u w:val="none"/>
+                      <w:strike w:val="false"/>
                       <w:sz w:val="19"/>
                       <w:szCs w:val="19"/>
                       <w:color w:val="000000"/>
@@ -2083,7 +2112,6 @@
                 </w:tcPr>
                 <w:p>
                   <w:pPr>
-                    <w:pStyle w:val="Normal"/>
                     <w:jc w:val="center"/>
                     <w:pBdr>
                       <w:bottom w:val="none" w:sz="0" w:space="0" w:color="000000"/>
@@ -2093,6 +2121,16 @@
                     </w:pBdr>
                     <w:spacing w:after="40" w:before="40" w:line="240"/>
                     <w:ind w:left="40" w:right="40" w:firstLine="0" w:firstLineChars="0"/>
+                    <w:rPr>
+                      <w:rFonts w:ascii="Helvetica" w:hAnsi="Helvetica" w:eastAsia="Helvetica" w:cs="Helvetica"/>
+                      <w:i w:val="false"/>
+                      <w:b w:val="true"/>
+                      <w:u w:val="none"/>
+                      <w:strike w:val="false"/>
+                      <w:sz w:val="19"/>
+                      <w:szCs w:val="19"/>
+                      <w:color w:val="000000"/>
+                    </w:rPr>
                   </w:pPr>
                   <w:r xmlns:w="http://schemas.openxmlformats.org/wordprocessingml/2006/main" xmlns:wp="http://schemas.openxmlformats.org/drawingml/2006/wordprocessingDrawing" xmlns:r="http://schemas.openxmlformats.org/officeDocument/2006/relationships" xmlns:w14="http://schemas.microsoft.com/office/word/2010/wordml">
                     <w:rPr>
@@ -2100,6 +2138,7 @@
                       <w:i w:val="false"/>
                       <w:b w:val="true"/>
                       <w:u w:val="none"/>
+                      <w:strike w:val="false"/>
                       <w:sz w:val="19"/>
                       <w:szCs w:val="19"/>
                       <w:color w:val="000000"/>
@@ -2127,7 +2166,6 @@
                 </w:tcPr>
                 <w:p>
                   <w:pPr>
-                    <w:pStyle w:val="Normal"/>
                     <w:jc w:val="center"/>
                     <w:pBdr>
                       <w:bottom w:val="none" w:sz="0" w:space="0" w:color="000000"/>
@@ -2137,6 +2175,16 @@
                     </w:pBdr>
                     <w:spacing w:after="40" w:before="40" w:line="240"/>
                     <w:ind w:left="40" w:right="40" w:firstLine="0" w:firstLineChars="0"/>
+                    <w:rPr>
+                      <w:rFonts w:ascii="Helvetica" w:hAnsi="Helvetica" w:eastAsia="Helvetica" w:cs="Helvetica"/>
+                      <w:i w:val="false"/>
+                      <w:b w:val="true"/>
+                      <w:u w:val="none"/>
+                      <w:strike w:val="false"/>
+                      <w:sz w:val="19"/>
+                      <w:szCs w:val="19"/>
+                      <w:color w:val="000000"/>
+                    </w:rPr>
                   </w:pPr>
                   <w:r xmlns:w="http://schemas.openxmlformats.org/wordprocessingml/2006/main" xmlns:wp="http://schemas.openxmlformats.org/drawingml/2006/wordprocessingDrawing" xmlns:r="http://schemas.openxmlformats.org/officeDocument/2006/relationships" xmlns:w14="http://schemas.microsoft.com/office/word/2010/wordml">
                     <w:rPr>
@@ -2144,6 +2192,7 @@
                       <w:i w:val="false"/>
                       <w:b w:val="true"/>
                       <w:u w:val="none"/>
+                      <w:strike w:val="false"/>
                       <w:sz w:val="19"/>
                       <w:szCs w:val="19"/>
                       <w:color w:val="000000"/>
@@ -2171,7 +2220,6 @@
                 </w:tcPr>
                 <w:p>
                   <w:pPr>
-                    <w:pStyle w:val="Normal"/>
                     <w:jc w:val="center"/>
                     <w:pBdr>
                       <w:bottom w:val="none" w:sz="0" w:space="0" w:color="000000"/>
@@ -2181,6 +2229,16 @@
                     </w:pBdr>
                     <w:spacing w:after="40" w:before="40" w:line="240"/>
                     <w:ind w:left="40" w:right="40" w:firstLine="0" w:firstLineChars="0"/>
+                    <w:rPr>
+                      <w:rFonts w:ascii="Helvetica" w:hAnsi="Helvetica" w:eastAsia="Helvetica" w:cs="Helvetica"/>
+                      <w:i w:val="false"/>
+                      <w:b w:val="true"/>
+                      <w:u w:val="none"/>
+                      <w:strike w:val="false"/>
+                      <w:sz w:val="19"/>
+                      <w:szCs w:val="19"/>
+                      <w:color w:val="000000"/>
+                    </w:rPr>
                   </w:pPr>
                   <w:r xmlns:w="http://schemas.openxmlformats.org/wordprocessingml/2006/main" xmlns:wp="http://schemas.openxmlformats.org/drawingml/2006/wordprocessingDrawing" xmlns:r="http://schemas.openxmlformats.org/officeDocument/2006/relationships" xmlns:w14="http://schemas.microsoft.com/office/word/2010/wordml">
                     <w:rPr>
@@ -2188,6 +2246,7 @@
                       <w:i w:val="false"/>
                       <w:b w:val="true"/>
                       <w:u w:val="none"/>
+                      <w:strike w:val="false"/>
                       <w:sz w:val="19"/>
                       <w:szCs w:val="19"/>
                       <w:color w:val="000000"/>
@@ -2201,7 +2260,6 @@
               <w:trPr>
                 <w:trHeight w:val="431" w:hRule="auto"/>
               </w:trPr>
-              body 1
               <w:tc>
                 <w:tcPr>
                   <w:vMerge w:val="restart"/>
@@ -2222,7 +2280,6 @@
                 </w:tcPr>
                 <w:p>
                   <w:pPr>
-                    <w:pStyle w:val="Normal"/>
                     <w:jc w:val="left"/>
                     <w:pBdr>
                       <w:bottom w:val="none" w:sz="0" w:space="0" w:color="000000"/>
@@ -2232,6 +2289,16 @@
                     </w:pBdr>
                     <w:spacing w:after="40" w:before="40" w:line="240"/>
                     <w:ind w:left="40" w:right="40" w:firstLine="0" w:firstLineChars="0"/>
+                    <w:rPr>
+                      <w:rFonts w:ascii="Helvetica" w:hAnsi="Helvetica" w:eastAsia="Helvetica" w:cs="Helvetica"/>
+                      <w:i w:val="false"/>
+                      <w:b w:val="false"/>
+                      <w:u w:val="none"/>
+                      <w:strike w:val="false"/>
+                      <w:sz w:val="19"/>
+                      <w:szCs w:val="19"/>
+                      <w:color w:val="000000"/>
+                    </w:rPr>
                   </w:pPr>
                   <w:r xmlns:w="http://schemas.openxmlformats.org/wordprocessingml/2006/main" xmlns:wp="http://schemas.openxmlformats.org/drawingml/2006/wordprocessingDrawing" xmlns:r="http://schemas.openxmlformats.org/officeDocument/2006/relationships" xmlns:w14="http://schemas.microsoft.com/office/word/2010/wordml">
                     <w:rPr>
@@ -2239,6 +2306,7 @@
                       <w:i w:val="false"/>
                       <w:b w:val="false"/>
                       <w:u w:val="none"/>
+                      <w:strike w:val="false"/>
                       <w:sz w:val="19"/>
                       <w:szCs w:val="19"/>
                       <w:color w:val="000000"/>
@@ -2266,7 +2334,6 @@
                 </w:tcPr>
                 <w:p>
                   <w:pPr>
-                    <w:pStyle w:val="Normal"/>
                     <w:jc w:val="left"/>
                     <w:pBdr>
                       <w:bottom w:val="none" w:sz="0" w:space="0" w:color="000000"/>
@@ -2276,6 +2343,16 @@
                     </w:pBdr>
                     <w:spacing w:after="40" w:before="40" w:line="240"/>
                     <w:ind w:left="40" w:right="40" w:firstLine="0" w:firstLineChars="0"/>
+                    <w:rPr>
+                      <w:rFonts w:ascii="Helvetica" w:hAnsi="Helvetica" w:eastAsia="Helvetica" w:cs="Helvetica"/>
+                      <w:i w:val="false"/>
+                      <w:b w:val="false"/>
+                      <w:u w:val="none"/>
+                      <w:strike w:val="false"/>
+                      <w:sz w:val="19"/>
+                      <w:szCs w:val="19"/>
+                      <w:color w:val="000000"/>
+                    </w:rPr>
                   </w:pPr>
                   <w:r xmlns:w="http://schemas.openxmlformats.org/wordprocessingml/2006/main" xmlns:wp="http://schemas.openxmlformats.org/drawingml/2006/wordprocessingDrawing" xmlns:r="http://schemas.openxmlformats.org/officeDocument/2006/relationships" xmlns:w14="http://schemas.microsoft.com/office/word/2010/wordml">
                     <w:rPr>
@@ -2283,6 +2360,7 @@
                       <w:i w:val="false"/>
                       <w:b w:val="false"/>
                       <w:u w:val="none"/>
+                      <w:strike w:val="false"/>
                       <w:sz w:val="19"/>
                       <w:szCs w:val="19"/>
                       <w:color w:val="000000"/>
@@ -2310,7 +2388,6 @@
                 </w:tcPr>
                 <w:p>
                   <w:pPr>
-                    <w:pStyle w:val="Normal"/>
                     <w:jc w:val="left"/>
                     <w:pBdr>
                       <w:bottom w:val="none" w:sz="0" w:space="0" w:color="000000"/>
@@ -2320,6 +2397,16 @@
                     </w:pBdr>
                     <w:spacing w:after="40" w:before="40" w:line="240"/>
                     <w:ind w:left="40" w:right="40" w:firstLine="0" w:firstLineChars="0"/>
+                    <w:rPr>
+                      <w:rFonts w:ascii="Helvetica" w:hAnsi="Helvetica" w:eastAsia="Helvetica" w:cs="Helvetica"/>
+                      <w:i w:val="false"/>
+                      <w:b w:val="false"/>
+                      <w:u w:val="none"/>
+                      <w:strike w:val="false"/>
+                      <w:sz w:val="19"/>
+                      <w:szCs w:val="19"/>
+                      <w:color w:val="000000"/>
+                    </w:rPr>
                   </w:pPr>
                   <w:r xmlns:w="http://schemas.openxmlformats.org/wordprocessingml/2006/main" xmlns:wp="http://schemas.openxmlformats.org/drawingml/2006/wordprocessingDrawing" xmlns:r="http://schemas.openxmlformats.org/officeDocument/2006/relationships" xmlns:w14="http://schemas.microsoft.com/office/word/2010/wordml">
                     <w:rPr>
@@ -2327,6 +2414,7 @@
                       <w:i w:val="false"/>
                       <w:b w:val="false"/>
                       <w:u w:val="none"/>
+                      <w:strike w:val="false"/>
                       <w:sz w:val="19"/>
                       <w:szCs w:val="19"/>
                       <w:color w:val="000000"/>
@@ -2354,7 +2442,6 @@
                 </w:tcPr>
                 <w:p>
                   <w:pPr>
-                    <w:pStyle w:val="Normal"/>
                     <w:jc w:val="center"/>
                     <w:pBdr>
                       <w:bottom w:val="none" w:sz="0" w:space="0" w:color="000000"/>
@@ -2364,6 +2451,16 @@
                     </w:pBdr>
                     <w:spacing w:after="40" w:before="40" w:line="240"/>
                     <w:ind w:left="40" w:right="40" w:firstLine="0" w:firstLineChars="0"/>
+                    <w:rPr>
+                      <w:rFonts w:ascii="Helvetica" w:hAnsi="Helvetica" w:eastAsia="Helvetica" w:cs="Helvetica"/>
+                      <w:i w:val="false"/>
+                      <w:b w:val="false"/>
+                      <w:u w:val="none"/>
+                      <w:strike w:val="false"/>
+                      <w:sz w:val="19"/>
+                      <w:szCs w:val="19"/>
+                      <w:color w:val="000000"/>
+                    </w:rPr>
                   </w:pPr>
                   <w:r xmlns:w="http://schemas.openxmlformats.org/wordprocessingml/2006/main" xmlns:wp="http://schemas.openxmlformats.org/drawingml/2006/wordprocessingDrawing" xmlns:r="http://schemas.openxmlformats.org/officeDocument/2006/relationships" xmlns:w14="http://schemas.microsoft.com/office/word/2010/wordml">
                     <w:rPr>
@@ -2371,6 +2468,7 @@
                       <w:i w:val="false"/>
                       <w:b w:val="false"/>
                       <w:u w:val="none"/>
+                      <w:strike w:val="false"/>
                       <w:sz w:val="19"/>
                       <w:szCs w:val="19"/>
                       <w:color w:val="000000"/>
@@ -2398,7 +2496,6 @@
                 </w:tcPr>
                 <w:p>
                   <w:pPr>
-                    <w:pStyle w:val="Normal"/>
                     <w:jc w:val="center"/>
                     <w:pBdr>
                       <w:bottom w:val="none" w:sz="0" w:space="0" w:color="000000"/>
@@ -2408,6 +2505,16 @@
                     </w:pBdr>
                     <w:spacing w:after="40" w:before="40" w:line="240"/>
                     <w:ind w:left="40" w:right="40" w:firstLine="0" w:firstLineChars="0"/>
+                    <w:rPr>
+                      <w:rFonts w:ascii="Helvetica" w:hAnsi="Helvetica" w:eastAsia="Helvetica" w:cs="Helvetica"/>
+                      <w:i w:val="false"/>
+                      <w:b w:val="false"/>
+                      <w:u w:val="none"/>
+                      <w:strike w:val="false"/>
+                      <w:sz w:val="19"/>
+                      <w:szCs w:val="19"/>
+                      <w:color w:val="000000"/>
+                    </w:rPr>
                   </w:pPr>
                   <w:r xmlns:w="http://schemas.openxmlformats.org/wordprocessingml/2006/main" xmlns:wp="http://schemas.openxmlformats.org/drawingml/2006/wordprocessingDrawing" xmlns:r="http://schemas.openxmlformats.org/officeDocument/2006/relationships" xmlns:w14="http://schemas.microsoft.com/office/word/2010/wordml">
                     <w:rPr>
@@ -2415,6 +2522,7 @@
                       <w:i w:val="false"/>
                       <w:b w:val="false"/>
                       <w:u w:val="none"/>
+                      <w:strike w:val="false"/>
                       <w:sz w:val="19"/>
                       <w:szCs w:val="19"/>
                       <w:color w:val="000000"/>
@@ -2442,7 +2550,6 @@
                 </w:tcPr>
                 <w:p>
                   <w:pPr>
-                    <w:pStyle w:val="Normal"/>
                     <w:jc w:val="center"/>
                     <w:pBdr>
                       <w:bottom w:val="none" w:sz="0" w:space="0" w:color="000000"/>
@@ -2452,6 +2559,16 @@
                     </w:pBdr>
                     <w:spacing w:after="40" w:before="40" w:line="240"/>
                     <w:ind w:left="40" w:right="40" w:firstLine="0" w:firstLineChars="0"/>
+                    <w:rPr>
+                      <w:rFonts w:ascii="Helvetica" w:hAnsi="Helvetica" w:eastAsia="Helvetica" w:cs="Helvetica"/>
+                      <w:i w:val="false"/>
+                      <w:b w:val="false"/>
+                      <w:u w:val="none"/>
+                      <w:strike w:val="false"/>
+                      <w:sz w:val="19"/>
+                      <w:szCs w:val="19"/>
+                      <w:color w:val="000000"/>
+                    </w:rPr>
                   </w:pPr>
                   <w:r xmlns:w="http://schemas.openxmlformats.org/wordprocessingml/2006/main" xmlns:wp="http://schemas.openxmlformats.org/drawingml/2006/wordprocessingDrawing" xmlns:r="http://schemas.openxmlformats.org/officeDocument/2006/relationships" xmlns:w14="http://schemas.microsoft.com/office/word/2010/wordml">
                     <w:rPr>
@@ -2459,6 +2576,7 @@
                       <w:i w:val="false"/>
                       <w:b w:val="false"/>
                       <w:u w:val="none"/>
+                      <w:strike w:val="false"/>
                       <w:sz w:val="19"/>
                       <w:szCs w:val="19"/>
                       <w:color w:val="000000"/>
@@ -2472,7 +2590,6 @@
               <w:trPr>
                 <w:trHeight w:val="431" w:hRule="auto"/>
               </w:trPr>
-              body 2
               <w:tc>
                 <w:tcPr>
                   <w:vMerge/>
@@ -2493,7 +2610,6 @@
                 </w:tcPr>
                 <w:p>
                   <w:pPr>
-                    <w:pStyle w:val="Normal"/>
                     <w:jc w:val="left"/>
                     <w:pBdr>
                       <w:bottom w:val="none" w:sz="0" w:space="0" w:color="000000"/>
@@ -2503,6 +2619,16 @@
                     </w:pBdr>
                     <w:spacing w:after="40" w:before="40" w:line="240"/>
                     <w:ind w:left="40" w:right="40" w:firstLine="0" w:firstLineChars="0"/>
+                    <w:rPr>
+                      <w:rFonts w:ascii="Helvetica" w:hAnsi="Helvetica" w:eastAsia="Helvetica" w:cs="Helvetica"/>
+                      <w:i w:val="false"/>
+                      <w:b w:val="false"/>
+                      <w:u w:val="none"/>
+                      <w:strike w:val="false"/>
+                      <w:sz w:val="19"/>
+                      <w:szCs w:val="19"/>
+                      <w:color w:val="000000"/>
+                    </w:rPr>
                   </w:pPr>
                 </w:p>
               </w:tc>
@@ -2525,7 +2651,6 @@
                 </w:tcPr>
                 <w:p>
                   <w:pPr>
-                    <w:pStyle w:val="Normal"/>
                     <w:jc w:val="left"/>
                     <w:pBdr>
                       <w:bottom w:val="none" w:sz="0" w:space="0" w:color="000000"/>
@@ -2535,6 +2660,16 @@
                     </w:pBdr>
                     <w:spacing w:after="40" w:before="40" w:line="240"/>
                     <w:ind w:left="40" w:right="40" w:firstLine="0" w:firstLineChars="0"/>
+                    <w:rPr>
+                      <w:rFonts w:ascii="Helvetica" w:hAnsi="Helvetica" w:eastAsia="Helvetica" w:cs="Helvetica"/>
+                      <w:i w:val="false"/>
+                      <w:b w:val="false"/>
+                      <w:u w:val="none"/>
+                      <w:strike w:val="false"/>
+                      <w:sz w:val="19"/>
+                      <w:szCs w:val="19"/>
+                      <w:color w:val="000000"/>
+                    </w:rPr>
                   </w:pPr>
                   <w:r xmlns:w="http://schemas.openxmlformats.org/wordprocessingml/2006/main" xmlns:wp="http://schemas.openxmlformats.org/drawingml/2006/wordprocessingDrawing" xmlns:r="http://schemas.openxmlformats.org/officeDocument/2006/relationships" xmlns:w14="http://schemas.microsoft.com/office/word/2010/wordml">
                     <w:rPr>
@@ -2542,6 +2677,7 @@
                       <w:i w:val="false"/>
                       <w:b w:val="false"/>
                       <w:u w:val="none"/>
+                      <w:strike w:val="false"/>
                       <w:sz w:val="19"/>
                       <w:szCs w:val="19"/>
                       <w:color w:val="000000"/>
@@ -2569,7 +2705,6 @@
                 </w:tcPr>
                 <w:p>
                   <w:pPr>
-                    <w:pStyle w:val="Normal"/>
                     <w:jc w:val="left"/>
                     <w:pBdr>
                       <w:bottom w:val="none" w:sz="0" w:space="0" w:color="000000"/>
@@ -2579,6 +2714,16 @@
                     </w:pBdr>
                     <w:spacing w:after="40" w:before="40" w:line="240"/>
                     <w:ind w:left="40" w:right="40" w:firstLine="0" w:firstLineChars="0"/>
+                    <w:rPr>
+                      <w:rFonts w:ascii="Helvetica" w:hAnsi="Helvetica" w:eastAsia="Helvetica" w:cs="Helvetica"/>
+                      <w:i w:val="false"/>
+                      <w:b w:val="false"/>
+                      <w:u w:val="none"/>
+                      <w:strike w:val="false"/>
+                      <w:sz w:val="19"/>
+                      <w:szCs w:val="19"/>
+                      <w:color w:val="000000"/>
+                    </w:rPr>
                   </w:pPr>
                   <w:r xmlns:w="http://schemas.openxmlformats.org/wordprocessingml/2006/main" xmlns:wp="http://schemas.openxmlformats.org/drawingml/2006/wordprocessingDrawing" xmlns:r="http://schemas.openxmlformats.org/officeDocument/2006/relationships" xmlns:w14="http://schemas.microsoft.com/office/word/2010/wordml">
                     <w:rPr>
@@ -2586,6 +2731,7 @@
                       <w:i w:val="false"/>
                       <w:b w:val="false"/>
                       <w:u w:val="none"/>
+                      <w:strike w:val="false"/>
                       <w:sz w:val="19"/>
                       <w:szCs w:val="19"/>
                       <w:color w:val="000000"/>
@@ -2613,7 +2759,6 @@
                 </w:tcPr>
                 <w:p>
                   <w:pPr>
-                    <w:pStyle w:val="Normal"/>
                     <w:jc w:val="center"/>
                     <w:pBdr>
                       <w:bottom w:val="none" w:sz="0" w:space="0" w:color="000000"/>
@@ -2623,6 +2768,16 @@
                     </w:pBdr>
                     <w:spacing w:after="40" w:before="40" w:line="240"/>
                     <w:ind w:left="40" w:right="40" w:firstLine="0" w:firstLineChars="0"/>
+                    <w:rPr>
+                      <w:rFonts w:ascii="Helvetica" w:hAnsi="Helvetica" w:eastAsia="Helvetica" w:cs="Helvetica"/>
+                      <w:i w:val="false"/>
+                      <w:b w:val="false"/>
+                      <w:u w:val="none"/>
+                      <w:strike w:val="false"/>
+                      <w:sz w:val="19"/>
+                      <w:szCs w:val="19"/>
+                      <w:color w:val="000000"/>
+                    </w:rPr>
                   </w:pPr>
                   <w:r xmlns:w="http://schemas.openxmlformats.org/wordprocessingml/2006/main" xmlns:wp="http://schemas.openxmlformats.org/drawingml/2006/wordprocessingDrawing" xmlns:r="http://schemas.openxmlformats.org/officeDocument/2006/relationships" xmlns:w14="http://schemas.microsoft.com/office/word/2010/wordml">
                     <w:rPr>
@@ -2630,6 +2785,7 @@
                       <w:i w:val="false"/>
                       <w:b w:val="false"/>
                       <w:u w:val="none"/>
+                      <w:strike w:val="false"/>
                       <w:sz w:val="19"/>
                       <w:szCs w:val="19"/>
                       <w:color w:val="000000"/>
@@ -2657,7 +2813,6 @@
                 </w:tcPr>
                 <w:p>
                   <w:pPr>
-                    <w:pStyle w:val="Normal"/>
                     <w:jc w:val="center"/>
                     <w:pBdr>
                       <w:bottom w:val="none" w:sz="0" w:space="0" w:color="000000"/>
@@ -2667,6 +2822,16 @@
                     </w:pBdr>
                     <w:spacing w:after="40" w:before="40" w:line="240"/>
                     <w:ind w:left="40" w:right="40" w:firstLine="0" w:firstLineChars="0"/>
+                    <w:rPr>
+                      <w:rFonts w:ascii="Helvetica" w:hAnsi="Helvetica" w:eastAsia="Helvetica" w:cs="Helvetica"/>
+                      <w:i w:val="false"/>
+                      <w:b w:val="false"/>
+                      <w:u w:val="none"/>
+                      <w:strike w:val="false"/>
+                      <w:sz w:val="19"/>
+                      <w:szCs w:val="19"/>
+                      <w:color w:val="000000"/>
+                    </w:rPr>
                   </w:pPr>
                   <w:r xmlns:w="http://schemas.openxmlformats.org/wordprocessingml/2006/main" xmlns:wp="http://schemas.openxmlformats.org/drawingml/2006/wordprocessingDrawing" xmlns:r="http://schemas.openxmlformats.org/officeDocument/2006/relationships" xmlns:w14="http://schemas.microsoft.com/office/word/2010/wordml">
                     <w:rPr>
@@ -2674,6 +2839,7 @@
                       <w:i w:val="false"/>
                       <w:b w:val="false"/>
                       <w:u w:val="none"/>
+                      <w:strike w:val="false"/>
                       <w:sz w:val="19"/>
                       <w:szCs w:val="19"/>
                       <w:color w:val="000000"/>
@@ -2701,7 +2867,6 @@
                 </w:tcPr>
                 <w:p>
                   <w:pPr>
-                    <w:pStyle w:val="Normal"/>
                     <w:jc w:val="center"/>
                     <w:pBdr>
                       <w:bottom w:val="none" w:sz="0" w:space="0" w:color="000000"/>
@@ -2711,6 +2876,16 @@
                     </w:pBdr>
                     <w:spacing w:after="40" w:before="40" w:line="240"/>
                     <w:ind w:left="40" w:right="40" w:firstLine="0" w:firstLineChars="0"/>
+                    <w:rPr>
+                      <w:rFonts w:ascii="Helvetica" w:hAnsi="Helvetica" w:eastAsia="Helvetica" w:cs="Helvetica"/>
+                      <w:i w:val="false"/>
+                      <w:b w:val="false"/>
+                      <w:u w:val="none"/>
+                      <w:strike w:val="false"/>
+                      <w:sz w:val="19"/>
+                      <w:szCs w:val="19"/>
+                      <w:color w:val="000000"/>
+                    </w:rPr>
                   </w:pPr>
                   <w:r xmlns:w="http://schemas.openxmlformats.org/wordprocessingml/2006/main" xmlns:wp="http://schemas.openxmlformats.org/drawingml/2006/wordprocessingDrawing" xmlns:r="http://schemas.openxmlformats.org/officeDocument/2006/relationships" xmlns:w14="http://schemas.microsoft.com/office/word/2010/wordml">
                     <w:rPr>
@@ -2718,6 +2893,7 @@
                       <w:i w:val="false"/>
                       <w:b w:val="false"/>
                       <w:u w:val="none"/>
+                      <w:strike w:val="false"/>
                       <w:sz w:val="19"/>
                       <w:szCs w:val="19"/>
                       <w:color w:val="000000"/>
@@ -2731,7 +2907,6 @@
               <w:trPr>
                 <w:trHeight w:val="430" w:hRule="auto"/>
               </w:trPr>
-              body 3
               <w:tc>
                 <w:tcPr>
                   <w:vMerge w:val="restart"/>
@@ -2752,7 +2927,6 @@
                 </w:tcPr>
                 <w:p>
                   <w:pPr>
-                    <w:pStyle w:val="Normal"/>
                     <w:jc w:val="left"/>
                     <w:pBdr>
                       <w:bottom w:val="none" w:sz="0" w:space="0" w:color="000000"/>
@@ -2762,6 +2936,16 @@
                     </w:pBdr>
                     <w:spacing w:after="40" w:before="40" w:line="240"/>
                     <w:ind w:left="40" w:right="40" w:firstLine="0" w:firstLineChars="0"/>
+                    <w:rPr>
+                      <w:rFonts w:ascii="Helvetica" w:hAnsi="Helvetica" w:eastAsia="Helvetica" w:cs="Helvetica"/>
+                      <w:i w:val="false"/>
+                      <w:b w:val="false"/>
+                      <w:u w:val="none"/>
+                      <w:strike w:val="false"/>
+                      <w:sz w:val="19"/>
+                      <w:szCs w:val="19"/>
+                      <w:color w:val="000000"/>
+                    </w:rPr>
                   </w:pPr>
                   <w:r xmlns:w="http://schemas.openxmlformats.org/wordprocessingml/2006/main" xmlns:wp="http://schemas.openxmlformats.org/drawingml/2006/wordprocessingDrawing" xmlns:r="http://schemas.openxmlformats.org/officeDocument/2006/relationships" xmlns:w14="http://schemas.microsoft.com/office/word/2010/wordml">
                     <w:rPr>
@@ -2769,6 +2953,7 @@
                       <w:i w:val="false"/>
                       <w:b w:val="false"/>
                       <w:u w:val="none"/>
+                      <w:strike w:val="false"/>
                       <w:sz w:val="19"/>
                       <w:szCs w:val="19"/>
                       <w:color w:val="000000"/>
@@ -2796,7 +2981,6 @@
                 </w:tcPr>
                 <w:p>
                   <w:pPr>
-                    <w:pStyle w:val="Normal"/>
                     <w:jc w:val="left"/>
                     <w:pBdr>
                       <w:bottom w:val="none" w:sz="0" w:space="0" w:color="000000"/>
@@ -2806,6 +2990,16 @@
                     </w:pBdr>
                     <w:spacing w:after="40" w:before="40" w:line="240"/>
                     <w:ind w:left="40" w:right="40" w:firstLine="0" w:firstLineChars="0"/>
+                    <w:rPr>
+                      <w:rFonts w:ascii="Helvetica" w:hAnsi="Helvetica" w:eastAsia="Helvetica" w:cs="Helvetica"/>
+                      <w:i w:val="false"/>
+                      <w:b w:val="false"/>
+                      <w:u w:val="none"/>
+                      <w:strike w:val="false"/>
+                      <w:sz w:val="19"/>
+                      <w:szCs w:val="19"/>
+                      <w:color w:val="000000"/>
+                    </w:rPr>
                   </w:pPr>
                   <w:r xmlns:w="http://schemas.openxmlformats.org/wordprocessingml/2006/main" xmlns:wp="http://schemas.openxmlformats.org/drawingml/2006/wordprocessingDrawing" xmlns:r="http://schemas.openxmlformats.org/officeDocument/2006/relationships" xmlns:w14="http://schemas.microsoft.com/office/word/2010/wordml">
                     <w:rPr>
@@ -2813,6 +3007,7 @@
                       <w:i w:val="false"/>
                       <w:b w:val="false"/>
                       <w:u w:val="none"/>
+                      <w:strike w:val="false"/>
                       <w:sz w:val="19"/>
                       <w:szCs w:val="19"/>
                       <w:color w:val="000000"/>
@@ -2840,7 +3035,6 @@
                 </w:tcPr>
                 <w:p>
                   <w:pPr>
-                    <w:pStyle w:val="Normal"/>
                     <w:jc w:val="left"/>
                     <w:pBdr>
                       <w:bottom w:val="none" w:sz="0" w:space="0" w:color="000000"/>
@@ -2850,6 +3044,16 @@
                     </w:pBdr>
                     <w:spacing w:after="40" w:before="40" w:line="240"/>
                     <w:ind w:left="40" w:right="40" w:firstLine="0" w:firstLineChars="0"/>
+                    <w:rPr>
+                      <w:rFonts w:ascii="Helvetica" w:hAnsi="Helvetica" w:eastAsia="Helvetica" w:cs="Helvetica"/>
+                      <w:i w:val="false"/>
+                      <w:b w:val="false"/>
+                      <w:u w:val="none"/>
+                      <w:strike w:val="false"/>
+                      <w:sz w:val="19"/>
+                      <w:szCs w:val="19"/>
+                      <w:color w:val="000000"/>
+                    </w:rPr>
                   </w:pPr>
                   <w:r xmlns:w="http://schemas.openxmlformats.org/wordprocessingml/2006/main" xmlns:wp="http://schemas.openxmlformats.org/drawingml/2006/wordprocessingDrawing" xmlns:r="http://schemas.openxmlformats.org/officeDocument/2006/relationships" xmlns:w14="http://schemas.microsoft.com/office/word/2010/wordml">
                     <w:rPr>
@@ -2857,6 +3061,7 @@
                       <w:i w:val="false"/>
                       <w:b w:val="false"/>
                       <w:u w:val="none"/>
+                      <w:strike w:val="false"/>
                       <w:sz w:val="19"/>
                       <w:szCs w:val="19"/>
                       <w:color w:val="000000"/>
@@ -2884,7 +3089,6 @@
                 </w:tcPr>
                 <w:p>
                   <w:pPr>
-                    <w:pStyle w:val="Normal"/>
                     <w:jc w:val="center"/>
                     <w:pBdr>
                       <w:bottom w:val="none" w:sz="0" w:space="0" w:color="000000"/>
@@ -2894,6 +3098,16 @@
                     </w:pBdr>
                     <w:spacing w:after="40" w:before="40" w:line="240"/>
                     <w:ind w:left="40" w:right="40" w:firstLine="0" w:firstLineChars="0"/>
+                    <w:rPr>
+                      <w:rFonts w:ascii="Helvetica" w:hAnsi="Helvetica" w:eastAsia="Helvetica" w:cs="Helvetica"/>
+                      <w:i w:val="false"/>
+                      <w:b w:val="false"/>
+                      <w:u w:val="none"/>
+                      <w:strike w:val="false"/>
+                      <w:sz w:val="19"/>
+                      <w:szCs w:val="19"/>
+                      <w:color w:val="000000"/>
+                    </w:rPr>
                   </w:pPr>
                   <w:r xmlns:w="http://schemas.openxmlformats.org/wordprocessingml/2006/main" xmlns:wp="http://schemas.openxmlformats.org/drawingml/2006/wordprocessingDrawing" xmlns:r="http://schemas.openxmlformats.org/officeDocument/2006/relationships" xmlns:w14="http://schemas.microsoft.com/office/word/2010/wordml">
                     <w:rPr>
@@ -2901,6 +3115,7 @@
                       <w:i w:val="false"/>
                       <w:b w:val="false"/>
                       <w:u w:val="none"/>
+                      <w:strike w:val="false"/>
                       <w:sz w:val="19"/>
                       <w:szCs w:val="19"/>
                       <w:color w:val="000000"/>
@@ -2928,7 +3143,6 @@
                 </w:tcPr>
                 <w:p>
                   <w:pPr>
-                    <w:pStyle w:val="Normal"/>
                     <w:jc w:val="center"/>
                     <w:pBdr>
                       <w:bottom w:val="none" w:sz="0" w:space="0" w:color="000000"/>
@@ -2938,6 +3152,16 @@
                     </w:pBdr>
                     <w:spacing w:after="40" w:before="40" w:line="240"/>
                     <w:ind w:left="40" w:right="40" w:firstLine="0" w:firstLineChars="0"/>
+                    <w:rPr>
+                      <w:rFonts w:ascii="Helvetica" w:hAnsi="Helvetica" w:eastAsia="Helvetica" w:cs="Helvetica"/>
+                      <w:i w:val="false"/>
+                      <w:b w:val="false"/>
+                      <w:u w:val="none"/>
+                      <w:strike w:val="false"/>
+                      <w:sz w:val="19"/>
+                      <w:szCs w:val="19"/>
+                      <w:color w:val="000000"/>
+                    </w:rPr>
                   </w:pPr>
                   <w:r xmlns:w="http://schemas.openxmlformats.org/wordprocessingml/2006/main" xmlns:wp="http://schemas.openxmlformats.org/drawingml/2006/wordprocessingDrawing" xmlns:r="http://schemas.openxmlformats.org/officeDocument/2006/relationships" xmlns:w14="http://schemas.microsoft.com/office/word/2010/wordml">
                     <w:rPr>
@@ -2945,6 +3169,7 @@
                       <w:i w:val="false"/>
                       <w:b w:val="false"/>
                       <w:u w:val="none"/>
+                      <w:strike w:val="false"/>
                       <w:sz w:val="19"/>
                       <w:szCs w:val="19"/>
                       <w:color w:val="000000"/>
@@ -2972,7 +3197,6 @@
                 </w:tcPr>
                 <w:p>
                   <w:pPr>
-                    <w:pStyle w:val="Normal"/>
                     <w:jc w:val="center"/>
                     <w:pBdr>
                       <w:bottom w:val="none" w:sz="0" w:space="0" w:color="000000"/>
@@ -2982,6 +3206,16 @@
                     </w:pBdr>
                     <w:spacing w:after="40" w:before="40" w:line="240"/>
                     <w:ind w:left="40" w:right="40" w:firstLine="0" w:firstLineChars="0"/>
+                    <w:rPr>
+                      <w:rFonts w:ascii="Helvetica" w:hAnsi="Helvetica" w:eastAsia="Helvetica" w:cs="Helvetica"/>
+                      <w:i w:val="false"/>
+                      <w:b w:val="false"/>
+                      <w:u w:val="none"/>
+                      <w:strike w:val="false"/>
+                      <w:sz w:val="19"/>
+                      <w:szCs w:val="19"/>
+                      <w:color w:val="000000"/>
+                    </w:rPr>
                   </w:pPr>
                   <w:r xmlns:w="http://schemas.openxmlformats.org/wordprocessingml/2006/main" xmlns:wp="http://schemas.openxmlformats.org/drawingml/2006/wordprocessingDrawing" xmlns:r="http://schemas.openxmlformats.org/officeDocument/2006/relationships" xmlns:w14="http://schemas.microsoft.com/office/word/2010/wordml">
                     <w:rPr>
@@ -2989,6 +3223,7 @@
                       <w:i w:val="false"/>
                       <w:b w:val="false"/>
                       <w:u w:val="none"/>
+                      <w:strike w:val="false"/>
                       <w:sz w:val="19"/>
                       <w:szCs w:val="19"/>
                       <w:color w:val="000000"/>
@@ -3002,7 +3237,6 @@
               <w:trPr>
                 <w:trHeight w:val="430" w:hRule="auto"/>
               </w:trPr>
-              body 4
               <w:tc>
                 <w:tcPr>
                   <w:vMerge/>
@@ -3023,7 +3257,6 @@
                 </w:tcPr>
                 <w:p>
                   <w:pPr>
-                    <w:pStyle w:val="Normal"/>
                     <w:jc w:val="left"/>
                     <w:pBdr>
                       <w:bottom w:val="none" w:sz="0" w:space="0" w:color="000000"/>
@@ -3033,6 +3266,16 @@
                     </w:pBdr>
                     <w:spacing w:after="40" w:before="40" w:line="240"/>
                     <w:ind w:left="40" w:right="40" w:firstLine="0" w:firstLineChars="0"/>
+                    <w:rPr>
+                      <w:rFonts w:ascii="Helvetica" w:hAnsi="Helvetica" w:eastAsia="Helvetica" w:cs="Helvetica"/>
+                      <w:i w:val="false"/>
+                      <w:b w:val="false"/>
+                      <w:u w:val="none"/>
+                      <w:strike w:val="false"/>
+                      <w:sz w:val="19"/>
+                      <w:szCs w:val="19"/>
+                      <w:color w:val="000000"/>
+                    </w:rPr>
                   </w:pPr>
                 </w:p>
               </w:tc>
@@ -3055,7 +3298,6 @@
                 </w:tcPr>
                 <w:p>
                   <w:pPr>
-                    <w:pStyle w:val="Normal"/>
                     <w:jc w:val="left"/>
                     <w:pBdr>
                       <w:bottom w:val="none" w:sz="0" w:space="0" w:color="000000"/>
@@ -3065,6 +3307,16 @@
                     </w:pBdr>
                     <w:spacing w:after="40" w:before="40" w:line="240"/>
                     <w:ind w:left="40" w:right="40" w:firstLine="0" w:firstLineChars="0"/>
+                    <w:rPr>
+                      <w:rFonts w:ascii="Helvetica" w:hAnsi="Helvetica" w:eastAsia="Helvetica" w:cs="Helvetica"/>
+                      <w:i w:val="false"/>
+                      <w:b w:val="false"/>
+                      <w:u w:val="none"/>
+                      <w:strike w:val="false"/>
+                      <w:sz w:val="19"/>
+                      <w:szCs w:val="19"/>
+                      <w:color w:val="000000"/>
+                    </w:rPr>
                   </w:pPr>
                   <w:r xmlns:w="http://schemas.openxmlformats.org/wordprocessingml/2006/main" xmlns:wp="http://schemas.openxmlformats.org/drawingml/2006/wordprocessingDrawing" xmlns:r="http://schemas.openxmlformats.org/officeDocument/2006/relationships" xmlns:w14="http://schemas.microsoft.com/office/word/2010/wordml">
                     <w:rPr>
@@ -3072,6 +3324,7 @@
                       <w:i w:val="false"/>
                       <w:b w:val="false"/>
                       <w:u w:val="none"/>
+                      <w:strike w:val="false"/>
                       <w:sz w:val="19"/>
                       <w:szCs w:val="19"/>
                       <w:color w:val="000000"/>
@@ -3099,7 +3352,6 @@
                 </w:tcPr>
                 <w:p>
                   <w:pPr>
-                    <w:pStyle w:val="Normal"/>
                     <w:jc w:val="left"/>
                     <w:pBdr>
                       <w:bottom w:val="none" w:sz="0" w:space="0" w:color="000000"/>
@@ -3109,6 +3361,16 @@
                     </w:pBdr>
                     <w:spacing w:after="40" w:before="40" w:line="240"/>
                     <w:ind w:left="40" w:right="40" w:firstLine="0" w:firstLineChars="0"/>
+                    <w:rPr>
+                      <w:rFonts w:ascii="Helvetica" w:hAnsi="Helvetica" w:eastAsia="Helvetica" w:cs="Helvetica"/>
+                      <w:i w:val="false"/>
+                      <w:b w:val="false"/>
+                      <w:u w:val="none"/>
+                      <w:strike w:val="false"/>
+                      <w:sz w:val="19"/>
+                      <w:szCs w:val="19"/>
+                      <w:color w:val="000000"/>
+                    </w:rPr>
                   </w:pPr>
                   <w:r xmlns:w="http://schemas.openxmlformats.org/wordprocessingml/2006/main" xmlns:wp="http://schemas.openxmlformats.org/drawingml/2006/wordprocessingDrawing" xmlns:r="http://schemas.openxmlformats.org/officeDocument/2006/relationships" xmlns:w14="http://schemas.microsoft.com/office/word/2010/wordml">
                     <w:rPr>
@@ -3116,6 +3378,7 @@
                       <w:i w:val="false"/>
                       <w:b w:val="false"/>
                       <w:u w:val="none"/>
+                      <w:strike w:val="false"/>
                       <w:sz w:val="19"/>
                       <w:szCs w:val="19"/>
                       <w:color w:val="000000"/>
@@ -3143,7 +3406,6 @@
                 </w:tcPr>
                 <w:p>
                   <w:pPr>
-                    <w:pStyle w:val="Normal"/>
                     <w:jc w:val="center"/>
                     <w:pBdr>
                       <w:bottom w:val="none" w:sz="0" w:space="0" w:color="000000"/>
@@ -3153,6 +3415,16 @@
                     </w:pBdr>
                     <w:spacing w:after="40" w:before="40" w:line="240"/>
                     <w:ind w:left="40" w:right="40" w:firstLine="0" w:firstLineChars="0"/>
+                    <w:rPr>
+                      <w:rFonts w:ascii="Helvetica" w:hAnsi="Helvetica" w:eastAsia="Helvetica" w:cs="Helvetica"/>
+                      <w:i w:val="false"/>
+                      <w:b w:val="false"/>
+                      <w:u w:val="none"/>
+                      <w:strike w:val="false"/>
+                      <w:sz w:val="19"/>
+                      <w:szCs w:val="19"/>
+                      <w:color w:val="000000"/>
+                    </w:rPr>
                   </w:pPr>
                   <w:r xmlns:w="http://schemas.openxmlformats.org/wordprocessingml/2006/main" xmlns:wp="http://schemas.openxmlformats.org/drawingml/2006/wordprocessingDrawing" xmlns:r="http://schemas.openxmlformats.org/officeDocument/2006/relationships" xmlns:w14="http://schemas.microsoft.com/office/word/2010/wordml">
                     <w:rPr>
@@ -3160,6 +3432,7 @@
                       <w:i w:val="false"/>
                       <w:b w:val="false"/>
                       <w:u w:val="none"/>
+                      <w:strike w:val="false"/>
                       <w:sz w:val="19"/>
                       <w:szCs w:val="19"/>
                       <w:color w:val="000000"/>
@@ -3187,7 +3460,6 @@
                 </w:tcPr>
                 <w:p>
                   <w:pPr>
-                    <w:pStyle w:val="Normal"/>
                     <w:jc w:val="center"/>
                     <w:pBdr>
                       <w:bottom w:val="none" w:sz="0" w:space="0" w:color="000000"/>
@@ -3197,6 +3469,16 @@
                     </w:pBdr>
                     <w:spacing w:after="40" w:before="40" w:line="240"/>
                     <w:ind w:left="40" w:right="40" w:firstLine="0" w:firstLineChars="0"/>
+                    <w:rPr>
+                      <w:rFonts w:ascii="Helvetica" w:hAnsi="Helvetica" w:eastAsia="Helvetica" w:cs="Helvetica"/>
+                      <w:i w:val="false"/>
+                      <w:b w:val="false"/>
+                      <w:u w:val="none"/>
+                      <w:strike w:val="false"/>
+                      <w:sz w:val="19"/>
+                      <w:szCs w:val="19"/>
+                      <w:color w:val="000000"/>
+                    </w:rPr>
                   </w:pPr>
                   <w:r xmlns:w="http://schemas.openxmlformats.org/wordprocessingml/2006/main" xmlns:wp="http://schemas.openxmlformats.org/drawingml/2006/wordprocessingDrawing" xmlns:r="http://schemas.openxmlformats.org/officeDocument/2006/relationships" xmlns:w14="http://schemas.microsoft.com/office/word/2010/wordml">
                     <w:rPr>
@@ -3204,6 +3486,7 @@
                       <w:i w:val="false"/>
                       <w:b w:val="false"/>
                       <w:u w:val="none"/>
+                      <w:strike w:val="false"/>
                       <w:sz w:val="19"/>
                       <w:szCs w:val="19"/>
                       <w:color w:val="000000"/>
@@ -3231,7 +3514,6 @@
                 </w:tcPr>
                 <w:p>
                   <w:pPr>
-                    <w:pStyle w:val="Normal"/>
                     <w:jc w:val="center"/>
                     <w:pBdr>
                       <w:bottom w:val="none" w:sz="0" w:space="0" w:color="000000"/>
@@ -3241,6 +3523,16 @@
                     </w:pBdr>
                     <w:spacing w:after="40" w:before="40" w:line="240"/>
                     <w:ind w:left="40" w:right="40" w:firstLine="0" w:firstLineChars="0"/>
+                    <w:rPr>
+                      <w:rFonts w:ascii="Helvetica" w:hAnsi="Helvetica" w:eastAsia="Helvetica" w:cs="Helvetica"/>
+                      <w:i w:val="false"/>
+                      <w:b w:val="false"/>
+                      <w:u w:val="none"/>
+                      <w:strike w:val="false"/>
+                      <w:sz w:val="19"/>
+                      <w:szCs w:val="19"/>
+                      <w:color w:val="000000"/>
+                    </w:rPr>
                   </w:pPr>
                   <w:r xmlns:w="http://schemas.openxmlformats.org/wordprocessingml/2006/main" xmlns:wp="http://schemas.openxmlformats.org/drawingml/2006/wordprocessingDrawing" xmlns:r="http://schemas.openxmlformats.org/officeDocument/2006/relationships" xmlns:w14="http://schemas.microsoft.com/office/word/2010/wordml">
                     <w:rPr>
@@ -3248,6 +3540,7 @@
                       <w:i w:val="false"/>
                       <w:b w:val="false"/>
                       <w:u w:val="none"/>
+                      <w:strike w:val="false"/>
                       <w:sz w:val="19"/>
                       <w:szCs w:val="19"/>
                       <w:color w:val="000000"/>
@@ -3261,7 +3554,6 @@
               <w:trPr>
                 <w:trHeight w:val="430" w:hRule="auto"/>
               </w:trPr>
-              body 5
               <w:tc>
                 <w:tcPr>
                   <w:vMerge/>
@@ -3282,7 +3574,6 @@
                 </w:tcPr>
                 <w:p>
                   <w:pPr>
-                    <w:pStyle w:val="Normal"/>
                     <w:jc w:val="left"/>
                     <w:pBdr>
                       <w:bottom w:val="none" w:sz="0" w:space="0" w:color="000000"/>
@@ -3292,6 +3583,16 @@
                     </w:pBdr>
                     <w:spacing w:after="40" w:before="40" w:line="240"/>
                     <w:ind w:left="40" w:right="40" w:firstLine="0" w:firstLineChars="0"/>
+                    <w:rPr>
+                      <w:rFonts w:ascii="Helvetica" w:hAnsi="Helvetica" w:eastAsia="Helvetica" w:cs="Helvetica"/>
+                      <w:i w:val="false"/>
+                      <w:b w:val="false"/>
+                      <w:u w:val="none"/>
+                      <w:strike w:val="false"/>
+                      <w:sz w:val="19"/>
+                      <w:szCs w:val="19"/>
+                      <w:color w:val="000000"/>
+                    </w:rPr>
                   </w:pPr>
                 </w:p>
               </w:tc>
@@ -3314,7 +3615,6 @@
                 </w:tcPr>
                 <w:p>
                   <w:pPr>
-                    <w:pStyle w:val="Normal"/>
                     <w:jc w:val="left"/>
                     <w:pBdr>
                       <w:bottom w:val="none" w:sz="0" w:space="0" w:color="000000"/>
@@ -3324,6 +3624,16 @@
                     </w:pBdr>
                     <w:spacing w:after="40" w:before="40" w:line="240"/>
                     <w:ind w:left="40" w:right="40" w:firstLine="0" w:firstLineChars="0"/>
+                    <w:rPr>
+                      <w:rFonts w:ascii="Helvetica" w:hAnsi="Helvetica" w:eastAsia="Helvetica" w:cs="Helvetica"/>
+                      <w:i w:val="false"/>
+                      <w:b w:val="false"/>
+                      <w:u w:val="none"/>
+                      <w:strike w:val="false"/>
+                      <w:sz w:val="19"/>
+                      <w:szCs w:val="19"/>
+                      <w:color w:val="000000"/>
+                    </w:rPr>
                   </w:pPr>
                   <w:r xmlns:w="http://schemas.openxmlformats.org/wordprocessingml/2006/main" xmlns:wp="http://schemas.openxmlformats.org/drawingml/2006/wordprocessingDrawing" xmlns:r="http://schemas.openxmlformats.org/officeDocument/2006/relationships" xmlns:w14="http://schemas.microsoft.com/office/word/2010/wordml">
                     <w:rPr>
@@ -3331,6 +3641,7 @@
                       <w:i w:val="false"/>
                       <w:b w:val="false"/>
                       <w:u w:val="none"/>
+                      <w:strike w:val="false"/>
                       <w:sz w:val="19"/>
                       <w:szCs w:val="19"/>
                       <w:color w:val="000000"/>
@@ -3358,7 +3669,6 @@
                 </w:tcPr>
                 <w:p>
                   <w:pPr>
-                    <w:pStyle w:val="Normal"/>
                     <w:jc w:val="left"/>
                     <w:pBdr>
                       <w:bottom w:val="none" w:sz="0" w:space="0" w:color="000000"/>
@@ -3368,6 +3678,16 @@
                     </w:pBdr>
                     <w:spacing w:after="40" w:before="40" w:line="240"/>
                     <w:ind w:left="40" w:right="40" w:firstLine="0" w:firstLineChars="0"/>
+                    <w:rPr>
+                      <w:rFonts w:ascii="Helvetica" w:hAnsi="Helvetica" w:eastAsia="Helvetica" w:cs="Helvetica"/>
+                      <w:i w:val="false"/>
+                      <w:b w:val="false"/>
+                      <w:u w:val="none"/>
+                      <w:strike w:val="false"/>
+                      <w:sz w:val="19"/>
+                      <w:szCs w:val="19"/>
+                      <w:color w:val="000000"/>
+                    </w:rPr>
                   </w:pPr>
                   <w:r xmlns:w="http://schemas.openxmlformats.org/wordprocessingml/2006/main" xmlns:wp="http://schemas.openxmlformats.org/drawingml/2006/wordprocessingDrawing" xmlns:r="http://schemas.openxmlformats.org/officeDocument/2006/relationships" xmlns:w14="http://schemas.microsoft.com/office/word/2010/wordml">
                     <w:rPr>
@@ -3375,6 +3695,7 @@
                       <w:i w:val="false"/>
                       <w:b w:val="false"/>
                       <w:u w:val="none"/>
+                      <w:strike w:val="false"/>
                       <w:sz w:val="19"/>
                       <w:szCs w:val="19"/>
                       <w:color w:val="000000"/>
@@ -3402,7 +3723,6 @@
                 </w:tcPr>
                 <w:p>
                   <w:pPr>
-                    <w:pStyle w:val="Normal"/>
                     <w:jc w:val="center"/>
                     <w:pBdr>
                       <w:bottom w:val="none" w:sz="0" w:space="0" w:color="000000"/>
@@ -3412,6 +3732,16 @@
                     </w:pBdr>
                     <w:spacing w:after="40" w:before="40" w:line="240"/>
                     <w:ind w:left="40" w:right="40" w:firstLine="0" w:firstLineChars="0"/>
+                    <w:rPr>
+                      <w:rFonts w:ascii="Helvetica" w:hAnsi="Helvetica" w:eastAsia="Helvetica" w:cs="Helvetica"/>
+                      <w:i w:val="false"/>
+                      <w:b w:val="false"/>
+                      <w:u w:val="none"/>
+                      <w:strike w:val="false"/>
+                      <w:sz w:val="19"/>
+                      <w:szCs w:val="19"/>
+                      <w:color w:val="000000"/>
+                    </w:rPr>
                   </w:pPr>
                   <w:r xmlns:w="http://schemas.openxmlformats.org/wordprocessingml/2006/main" xmlns:wp="http://schemas.openxmlformats.org/drawingml/2006/wordprocessingDrawing" xmlns:r="http://schemas.openxmlformats.org/officeDocument/2006/relationships" xmlns:w14="http://schemas.microsoft.com/office/word/2010/wordml">
                     <w:rPr>
@@ -3419,6 +3749,7 @@
                       <w:i w:val="false"/>
                       <w:b w:val="false"/>
                       <w:u w:val="none"/>
+                      <w:strike w:val="false"/>
                       <w:sz w:val="19"/>
                       <w:szCs w:val="19"/>
                       <w:color w:val="000000"/>
@@ -3446,7 +3777,6 @@
                 </w:tcPr>
                 <w:p>
                   <w:pPr>
-                    <w:pStyle w:val="Normal"/>
                     <w:jc w:val="center"/>
                     <w:pBdr>
                       <w:bottom w:val="none" w:sz="0" w:space="0" w:color="000000"/>
@@ -3456,6 +3786,16 @@
                     </w:pBdr>
                     <w:spacing w:after="40" w:before="40" w:line="240"/>
                     <w:ind w:left="40" w:right="40" w:firstLine="0" w:firstLineChars="0"/>
+                    <w:rPr>
+                      <w:rFonts w:ascii="Helvetica" w:hAnsi="Helvetica" w:eastAsia="Helvetica" w:cs="Helvetica"/>
+                      <w:i w:val="false"/>
+                      <w:b w:val="false"/>
+                      <w:u w:val="none"/>
+                      <w:strike w:val="false"/>
+                      <w:sz w:val="19"/>
+                      <w:szCs w:val="19"/>
+                      <w:color w:val="000000"/>
+                    </w:rPr>
                   </w:pPr>
                   <w:r xmlns:w="http://schemas.openxmlformats.org/wordprocessingml/2006/main" xmlns:wp="http://schemas.openxmlformats.org/drawingml/2006/wordprocessingDrawing" xmlns:r="http://schemas.openxmlformats.org/officeDocument/2006/relationships" xmlns:w14="http://schemas.microsoft.com/office/word/2010/wordml">
                     <w:rPr>
@@ -3463,6 +3803,7 @@
                       <w:i w:val="false"/>
                       <w:b w:val="false"/>
                       <w:u w:val="none"/>
+                      <w:strike w:val="false"/>
                       <w:sz w:val="19"/>
                       <w:szCs w:val="19"/>
                       <w:color w:val="000000"/>
@@ -3490,7 +3831,6 @@
                 </w:tcPr>
                 <w:p>
                   <w:pPr>
-                    <w:pStyle w:val="Normal"/>
                     <w:jc w:val="center"/>
                     <w:pBdr>
                       <w:bottom w:val="none" w:sz="0" w:space="0" w:color="000000"/>
@@ -3500,6 +3840,16 @@
                     </w:pBdr>
                     <w:spacing w:after="40" w:before="40" w:line="240"/>
                     <w:ind w:left="40" w:right="40" w:firstLine="0" w:firstLineChars="0"/>
+                    <w:rPr>
+                      <w:rFonts w:ascii="Helvetica" w:hAnsi="Helvetica" w:eastAsia="Helvetica" w:cs="Helvetica"/>
+                      <w:i w:val="false"/>
+                      <w:b w:val="false"/>
+                      <w:u w:val="none"/>
+                      <w:strike w:val="false"/>
+                      <w:sz w:val="19"/>
+                      <w:szCs w:val="19"/>
+                      <w:color w:val="000000"/>
+                    </w:rPr>
                   </w:pPr>
                   <w:r xmlns:w="http://schemas.openxmlformats.org/wordprocessingml/2006/main" xmlns:wp="http://schemas.openxmlformats.org/drawingml/2006/wordprocessingDrawing" xmlns:r="http://schemas.openxmlformats.org/officeDocument/2006/relationships" xmlns:w14="http://schemas.microsoft.com/office/word/2010/wordml">
                     <w:rPr>
@@ -3507,6 +3857,7 @@
                       <w:i w:val="false"/>
                       <w:b w:val="false"/>
                       <w:u w:val="none"/>
+                      <w:strike w:val="false"/>
                       <w:sz w:val="19"/>
                       <w:szCs w:val="19"/>
                       <w:color w:val="000000"/>
@@ -3520,7 +3871,6 @@
               <w:trPr>
                 <w:trHeight w:val="430" w:hRule="auto"/>
               </w:trPr>
-              body 6
               <w:tc>
                 <w:tcPr>
                   <w:vMerge/>
@@ -3541,7 +3891,6 @@
                 </w:tcPr>
                 <w:p>
                   <w:pPr>
-                    <w:pStyle w:val="Normal"/>
                     <w:jc w:val="left"/>
                     <w:pBdr>
                       <w:bottom w:val="none" w:sz="0" w:space="0" w:color="000000"/>
@@ -3551,6 +3900,16 @@
                     </w:pBdr>
                     <w:spacing w:after="40" w:before="40" w:line="240"/>
                     <w:ind w:left="40" w:right="40" w:firstLine="0" w:firstLineChars="0"/>
+                    <w:rPr>
+                      <w:rFonts w:ascii="Helvetica" w:hAnsi="Helvetica" w:eastAsia="Helvetica" w:cs="Helvetica"/>
+                      <w:i w:val="false"/>
+                      <w:b w:val="false"/>
+                      <w:u w:val="none"/>
+                      <w:strike w:val="false"/>
+                      <w:sz w:val="19"/>
+                      <w:szCs w:val="19"/>
+                      <w:color w:val="000000"/>
+                    </w:rPr>
                   </w:pPr>
                 </w:p>
               </w:tc>
@@ -3573,7 +3932,6 @@
                 </w:tcPr>
                 <w:p>
                   <w:pPr>
-                    <w:pStyle w:val="Normal"/>
                     <w:jc w:val="left"/>
                     <w:pBdr>
                       <w:bottom w:val="none" w:sz="0" w:space="0" w:color="000000"/>
@@ -3583,6 +3941,16 @@
                     </w:pBdr>
                     <w:spacing w:after="40" w:before="40" w:line="240"/>
                     <w:ind w:left="40" w:right="40" w:firstLine="0" w:firstLineChars="0"/>
+                    <w:rPr>
+                      <w:rFonts w:ascii="Helvetica" w:hAnsi="Helvetica" w:eastAsia="Helvetica" w:cs="Helvetica"/>
+                      <w:i w:val="false"/>
+                      <w:b w:val="false"/>
+                      <w:u w:val="none"/>
+                      <w:strike w:val="false"/>
+                      <w:sz w:val="19"/>
+                      <w:szCs w:val="19"/>
+                      <w:color w:val="000000"/>
+                    </w:rPr>
                   </w:pPr>
                   <w:r xmlns:w="http://schemas.openxmlformats.org/wordprocessingml/2006/main" xmlns:wp="http://schemas.openxmlformats.org/drawingml/2006/wordprocessingDrawing" xmlns:r="http://schemas.openxmlformats.org/officeDocument/2006/relationships" xmlns:w14="http://schemas.microsoft.com/office/word/2010/wordml">
                     <w:rPr>
@@ -3590,6 +3958,7 @@
                       <w:i w:val="false"/>
                       <w:b w:val="false"/>
                       <w:u w:val="none"/>
+                      <w:strike w:val="false"/>
                       <w:sz w:val="19"/>
                       <w:szCs w:val="19"/>
                       <w:color w:val="000000"/>
@@ -3617,7 +3986,6 @@
                 </w:tcPr>
                 <w:p>
                   <w:pPr>
-                    <w:pStyle w:val="Normal"/>
                     <w:jc w:val="left"/>
                     <w:pBdr>
                       <w:bottom w:val="none" w:sz="0" w:space="0" w:color="000000"/>
@@ -3627,6 +3995,16 @@
                     </w:pBdr>
                     <w:spacing w:after="40" w:before="40" w:line="240"/>
                     <w:ind w:left="40" w:right="40" w:firstLine="0" w:firstLineChars="0"/>
+                    <w:rPr>
+                      <w:rFonts w:ascii="Helvetica" w:hAnsi="Helvetica" w:eastAsia="Helvetica" w:cs="Helvetica"/>
+                      <w:i w:val="false"/>
+                      <w:b w:val="false"/>
+                      <w:u w:val="none"/>
+                      <w:strike w:val="false"/>
+                      <w:sz w:val="19"/>
+                      <w:szCs w:val="19"/>
+                      <w:color w:val="000000"/>
+                    </w:rPr>
                   </w:pPr>
                   <w:r xmlns:w="http://schemas.openxmlformats.org/wordprocessingml/2006/main" xmlns:wp="http://schemas.openxmlformats.org/drawingml/2006/wordprocessingDrawing" xmlns:r="http://schemas.openxmlformats.org/officeDocument/2006/relationships" xmlns:w14="http://schemas.microsoft.com/office/word/2010/wordml">
                     <w:rPr>
@@ -3634,6 +4012,7 @@
                       <w:i w:val="false"/>
                       <w:b w:val="false"/>
                       <w:u w:val="none"/>
+                      <w:strike w:val="false"/>
                       <w:sz w:val="19"/>
                       <w:szCs w:val="19"/>
                       <w:color w:val="000000"/>
@@ -3661,7 +4040,6 @@
                 </w:tcPr>
                 <w:p>
                   <w:pPr>
-                    <w:pStyle w:val="Normal"/>
                     <w:jc w:val="center"/>
                     <w:pBdr>
                       <w:bottom w:val="none" w:sz="0" w:space="0" w:color="000000"/>
@@ -3671,6 +4049,16 @@
                     </w:pBdr>
                     <w:spacing w:after="40" w:before="40" w:line="240"/>
                     <w:ind w:left="40" w:right="40" w:firstLine="0" w:firstLineChars="0"/>
+                    <w:rPr>
+                      <w:rFonts w:ascii="Helvetica" w:hAnsi="Helvetica" w:eastAsia="Helvetica" w:cs="Helvetica"/>
+                      <w:i w:val="false"/>
+                      <w:b w:val="false"/>
+                      <w:u w:val="none"/>
+                      <w:strike w:val="false"/>
+                      <w:sz w:val="19"/>
+                      <w:szCs w:val="19"/>
+                      <w:color w:val="000000"/>
+                    </w:rPr>
                   </w:pPr>
                   <w:r xmlns:w="http://schemas.openxmlformats.org/wordprocessingml/2006/main" xmlns:wp="http://schemas.openxmlformats.org/drawingml/2006/wordprocessingDrawing" xmlns:r="http://schemas.openxmlformats.org/officeDocument/2006/relationships" xmlns:w14="http://schemas.microsoft.com/office/word/2010/wordml">
                     <w:rPr>
@@ -3678,6 +4066,7 @@
                       <w:i w:val="false"/>
                       <w:b w:val="false"/>
                       <w:u w:val="none"/>
+                      <w:strike w:val="false"/>
                       <w:sz w:val="19"/>
                       <w:szCs w:val="19"/>
                       <w:color w:val="000000"/>
@@ -3705,7 +4094,6 @@
                 </w:tcPr>
                 <w:p>
                   <w:pPr>
-                    <w:pStyle w:val="Normal"/>
                     <w:jc w:val="center"/>
                     <w:pBdr>
                       <w:bottom w:val="none" w:sz="0" w:space="0" w:color="000000"/>
@@ -3715,6 +4103,16 @@
                     </w:pBdr>
                     <w:spacing w:after="40" w:before="40" w:line="240"/>
                     <w:ind w:left="40" w:right="40" w:firstLine="0" w:firstLineChars="0"/>
+                    <w:rPr>
+                      <w:rFonts w:ascii="Helvetica" w:hAnsi="Helvetica" w:eastAsia="Helvetica" w:cs="Helvetica"/>
+                      <w:i w:val="false"/>
+                      <w:b w:val="false"/>
+                      <w:u w:val="none"/>
+                      <w:strike w:val="false"/>
+                      <w:sz w:val="19"/>
+                      <w:szCs w:val="19"/>
+                      <w:color w:val="000000"/>
+                    </w:rPr>
                   </w:pPr>
                   <w:r xmlns:w="http://schemas.openxmlformats.org/wordprocessingml/2006/main" xmlns:wp="http://schemas.openxmlformats.org/drawingml/2006/wordprocessingDrawing" xmlns:r="http://schemas.openxmlformats.org/officeDocument/2006/relationships" xmlns:w14="http://schemas.microsoft.com/office/word/2010/wordml">
                     <w:rPr>
@@ -3722,6 +4120,7 @@
                       <w:i w:val="false"/>
                       <w:b w:val="false"/>
                       <w:u w:val="none"/>
+                      <w:strike w:val="false"/>
                       <w:sz w:val="19"/>
                       <w:szCs w:val="19"/>
                       <w:color w:val="000000"/>
@@ -3749,7 +4148,6 @@
                 </w:tcPr>
                 <w:p>
                   <w:pPr>
-                    <w:pStyle w:val="Normal"/>
                     <w:jc w:val="center"/>
                     <w:pBdr>
                       <w:bottom w:val="none" w:sz="0" w:space="0" w:color="000000"/>
@@ -3759,6 +4157,16 @@
                     </w:pBdr>
                     <w:spacing w:after="40" w:before="40" w:line="240"/>
                     <w:ind w:left="40" w:right="40" w:firstLine="0" w:firstLineChars="0"/>
+                    <w:rPr>
+                      <w:rFonts w:ascii="Helvetica" w:hAnsi="Helvetica" w:eastAsia="Helvetica" w:cs="Helvetica"/>
+                      <w:i w:val="false"/>
+                      <w:b w:val="false"/>
+                      <w:u w:val="none"/>
+                      <w:strike w:val="false"/>
+                      <w:sz w:val="19"/>
+                      <w:szCs w:val="19"/>
+                      <w:color w:val="000000"/>
+                    </w:rPr>
                   </w:pPr>
                   <w:r xmlns:w="http://schemas.openxmlformats.org/wordprocessingml/2006/main" xmlns:wp="http://schemas.openxmlformats.org/drawingml/2006/wordprocessingDrawing" xmlns:r="http://schemas.openxmlformats.org/officeDocument/2006/relationships" xmlns:w14="http://schemas.microsoft.com/office/word/2010/wordml">
                     <w:rPr>
@@ -3766,6 +4174,7 @@
                       <w:i w:val="false"/>
                       <w:b w:val="false"/>
                       <w:u w:val="none"/>
+                      <w:strike w:val="false"/>
                       <w:sz w:val="19"/>
                       <w:szCs w:val="19"/>
                       <w:color w:val="000000"/>
@@ -3779,7 +4188,6 @@
               <w:trPr>
                 <w:trHeight w:val="430" w:hRule="auto"/>
               </w:trPr>
-              body 7
               <w:tc>
                 <w:tcPr>
                   <w:vMerge/>
@@ -3800,7 +4208,6 @@
                 </w:tcPr>
                 <w:p>
                   <w:pPr>
-                    <w:pStyle w:val="Normal"/>
                     <w:jc w:val="left"/>
                     <w:pBdr>
                       <w:bottom w:val="none" w:sz="0" w:space="0" w:color="000000"/>
@@ -3810,6 +4217,16 @@
                     </w:pBdr>
                     <w:spacing w:after="40" w:before="40" w:line="240"/>
                     <w:ind w:left="40" w:right="40" w:firstLine="0" w:firstLineChars="0"/>
+                    <w:rPr>
+                      <w:rFonts w:ascii="Helvetica" w:hAnsi="Helvetica" w:eastAsia="Helvetica" w:cs="Helvetica"/>
+                      <w:i w:val="false"/>
+                      <w:b w:val="false"/>
+                      <w:u w:val="none"/>
+                      <w:strike w:val="false"/>
+                      <w:sz w:val="19"/>
+                      <w:szCs w:val="19"/>
+                      <w:color w:val="000000"/>
+                    </w:rPr>
                   </w:pPr>
                 </w:p>
               </w:tc>
@@ -3832,7 +4249,6 @@
                 </w:tcPr>
                 <w:p>
                   <w:pPr>
-                    <w:pStyle w:val="Normal"/>
                     <w:jc w:val="left"/>
                     <w:pBdr>
                       <w:bottom w:val="none" w:sz="0" w:space="0" w:color="000000"/>
@@ -3842,6 +4258,16 @@
                     </w:pBdr>
                     <w:spacing w:after="40" w:before="40" w:line="240"/>
                     <w:ind w:left="40" w:right="40" w:firstLine="0" w:firstLineChars="0"/>
+                    <w:rPr>
+                      <w:rFonts w:ascii="Helvetica" w:hAnsi="Helvetica" w:eastAsia="Helvetica" w:cs="Helvetica"/>
+                      <w:i w:val="false"/>
+                      <w:b w:val="false"/>
+                      <w:u w:val="none"/>
+                      <w:strike w:val="false"/>
+                      <w:sz w:val="19"/>
+                      <w:szCs w:val="19"/>
+                      <w:color w:val="000000"/>
+                    </w:rPr>
                   </w:pPr>
                   <w:r xmlns:w="http://schemas.openxmlformats.org/wordprocessingml/2006/main" xmlns:wp="http://schemas.openxmlformats.org/drawingml/2006/wordprocessingDrawing" xmlns:r="http://schemas.openxmlformats.org/officeDocument/2006/relationships" xmlns:w14="http://schemas.microsoft.com/office/word/2010/wordml">
                     <w:rPr>
@@ -3849,6 +4275,7 @@
                       <w:i w:val="false"/>
                       <w:b w:val="false"/>
                       <w:u w:val="none"/>
+                      <w:strike w:val="false"/>
                       <w:sz w:val="19"/>
                       <w:szCs w:val="19"/>
                       <w:color w:val="000000"/>
@@ -3876,7 +4303,6 @@
                 </w:tcPr>
                 <w:p>
                   <w:pPr>
-                    <w:pStyle w:val="Normal"/>
                     <w:jc w:val="left"/>
                     <w:pBdr>
                       <w:bottom w:val="none" w:sz="0" w:space="0" w:color="000000"/>
@@ -3886,6 +4312,16 @@
                     </w:pBdr>
                     <w:spacing w:after="40" w:before="40" w:line="240"/>
                     <w:ind w:left="40" w:right="40" w:firstLine="0" w:firstLineChars="0"/>
+                    <w:rPr>
+                      <w:rFonts w:ascii="Helvetica" w:hAnsi="Helvetica" w:eastAsia="Helvetica" w:cs="Helvetica"/>
+                      <w:i w:val="false"/>
+                      <w:b w:val="false"/>
+                      <w:u w:val="none"/>
+                      <w:strike w:val="false"/>
+                      <w:sz w:val="19"/>
+                      <w:szCs w:val="19"/>
+                      <w:color w:val="000000"/>
+                    </w:rPr>
                   </w:pPr>
                   <w:r xmlns:w="http://schemas.openxmlformats.org/wordprocessingml/2006/main" xmlns:wp="http://schemas.openxmlformats.org/drawingml/2006/wordprocessingDrawing" xmlns:r="http://schemas.openxmlformats.org/officeDocument/2006/relationships" xmlns:w14="http://schemas.microsoft.com/office/word/2010/wordml">
                     <w:rPr>
@@ -3893,6 +4329,7 @@
                       <w:i w:val="false"/>
                       <w:b w:val="false"/>
                       <w:u w:val="none"/>
+                      <w:strike w:val="false"/>
                       <w:sz w:val="19"/>
                       <w:szCs w:val="19"/>
                       <w:color w:val="000000"/>
@@ -3920,7 +4357,6 @@
                 </w:tcPr>
                 <w:p>
                   <w:pPr>
-                    <w:pStyle w:val="Normal"/>
                     <w:jc w:val="center"/>
                     <w:pBdr>
                       <w:bottom w:val="none" w:sz="0" w:space="0" w:color="000000"/>
@@ -3930,6 +4366,16 @@
                     </w:pBdr>
                     <w:spacing w:after="40" w:before="40" w:line="240"/>
                     <w:ind w:left="40" w:right="40" w:firstLine="0" w:firstLineChars="0"/>
+                    <w:rPr>
+                      <w:rFonts w:ascii="Helvetica" w:hAnsi="Helvetica" w:eastAsia="Helvetica" w:cs="Helvetica"/>
+                      <w:i w:val="false"/>
+                      <w:b w:val="false"/>
+                      <w:u w:val="none"/>
+                      <w:strike w:val="false"/>
+                      <w:sz w:val="19"/>
+                      <w:szCs w:val="19"/>
+                      <w:color w:val="000000"/>
+                    </w:rPr>
                   </w:pPr>
                   <w:r xmlns:w="http://schemas.openxmlformats.org/wordprocessingml/2006/main" xmlns:wp="http://schemas.openxmlformats.org/drawingml/2006/wordprocessingDrawing" xmlns:r="http://schemas.openxmlformats.org/officeDocument/2006/relationships" xmlns:w14="http://schemas.microsoft.com/office/word/2010/wordml">
                     <w:rPr>
@@ -3937,6 +4383,7 @@
                       <w:i w:val="false"/>
                       <w:b w:val="false"/>
                       <w:u w:val="none"/>
+                      <w:strike w:val="false"/>
                       <w:sz w:val="19"/>
                       <w:szCs w:val="19"/>
                       <w:color w:val="000000"/>
@@ -3964,7 +4411,6 @@
                 </w:tcPr>
                 <w:p>
                   <w:pPr>
-                    <w:pStyle w:val="Normal"/>
                     <w:jc w:val="center"/>
                     <w:pBdr>
                       <w:bottom w:val="none" w:sz="0" w:space="0" w:color="000000"/>
@@ -3974,6 +4420,16 @@
                     </w:pBdr>
                     <w:spacing w:after="40" w:before="40" w:line="240"/>
                     <w:ind w:left="40" w:right="40" w:firstLine="0" w:firstLineChars="0"/>
+                    <w:rPr>
+                      <w:rFonts w:ascii="Helvetica" w:hAnsi="Helvetica" w:eastAsia="Helvetica" w:cs="Helvetica"/>
+                      <w:i w:val="false"/>
+                      <w:b w:val="false"/>
+                      <w:u w:val="none"/>
+                      <w:strike w:val="false"/>
+                      <w:sz w:val="19"/>
+                      <w:szCs w:val="19"/>
+                      <w:color w:val="000000"/>
+                    </w:rPr>
                   </w:pPr>
                   <w:r xmlns:w="http://schemas.openxmlformats.org/wordprocessingml/2006/main" xmlns:wp="http://schemas.openxmlformats.org/drawingml/2006/wordprocessingDrawing" xmlns:r="http://schemas.openxmlformats.org/officeDocument/2006/relationships" xmlns:w14="http://schemas.microsoft.com/office/word/2010/wordml">
                     <w:rPr>
@@ -3981,6 +4437,7 @@
                       <w:i w:val="false"/>
                       <w:b w:val="false"/>
                       <w:u w:val="none"/>
+                      <w:strike w:val="false"/>
                       <w:sz w:val="19"/>
                       <w:szCs w:val="19"/>
                       <w:color w:val="000000"/>
@@ -4008,7 +4465,6 @@
                 </w:tcPr>
                 <w:p>
                   <w:pPr>
-                    <w:pStyle w:val="Normal"/>
                     <w:jc w:val="center"/>
                     <w:pBdr>
                       <w:bottom w:val="none" w:sz="0" w:space="0" w:color="000000"/>
@@ -4018,6 +4474,16 @@
                     </w:pBdr>
                     <w:spacing w:after="40" w:before="40" w:line="240"/>
                     <w:ind w:left="40" w:right="40" w:firstLine="0" w:firstLineChars="0"/>
+                    <w:rPr>
+                      <w:rFonts w:ascii="Helvetica" w:hAnsi="Helvetica" w:eastAsia="Helvetica" w:cs="Helvetica"/>
+                      <w:i w:val="false"/>
+                      <w:b w:val="false"/>
+                      <w:u w:val="none"/>
+                      <w:strike w:val="false"/>
+                      <w:sz w:val="19"/>
+                      <w:szCs w:val="19"/>
+                      <w:color w:val="000000"/>
+                    </w:rPr>
                   </w:pPr>
                   <w:r xmlns:w="http://schemas.openxmlformats.org/wordprocessingml/2006/main" xmlns:wp="http://schemas.openxmlformats.org/drawingml/2006/wordprocessingDrawing" xmlns:r="http://schemas.openxmlformats.org/officeDocument/2006/relationships" xmlns:w14="http://schemas.microsoft.com/office/word/2010/wordml">
                     <w:rPr>
@@ -4025,6 +4491,7 @@
                       <w:i w:val="false"/>
                       <w:b w:val="false"/>
                       <w:u w:val="none"/>
+                      <w:strike w:val="false"/>
                       <w:sz w:val="19"/>
                       <w:szCs w:val="19"/>
                       <w:color w:val="000000"/>
@@ -4038,7 +4505,6 @@
               <w:trPr>
                 <w:trHeight w:val="430" w:hRule="auto"/>
               </w:trPr>
-              body 8
               <w:tc>
                 <w:tcPr>
                   <w:vMerge/>
@@ -4059,7 +4525,6 @@
                 </w:tcPr>
                 <w:p>
                   <w:pPr>
-                    <w:pStyle w:val="Normal"/>
                     <w:jc w:val="left"/>
                     <w:pBdr>
                       <w:bottom w:val="none" w:sz="0" w:space="0" w:color="000000"/>
@@ -4069,6 +4534,16 @@
                     </w:pBdr>
                     <w:spacing w:after="40" w:before="40" w:line="240"/>
                     <w:ind w:left="40" w:right="40" w:firstLine="0" w:firstLineChars="0"/>
+                    <w:rPr>
+                      <w:rFonts w:ascii="Helvetica" w:hAnsi="Helvetica" w:eastAsia="Helvetica" w:cs="Helvetica"/>
+                      <w:i w:val="false"/>
+                      <w:b w:val="false"/>
+                      <w:u w:val="none"/>
+                      <w:strike w:val="false"/>
+                      <w:sz w:val="19"/>
+                      <w:szCs w:val="19"/>
+                      <w:color w:val="000000"/>
+                    </w:rPr>
                   </w:pPr>
                 </w:p>
               </w:tc>
@@ -4091,7 +4566,6 @@
                 </w:tcPr>
                 <w:p>
                   <w:pPr>
-                    <w:pStyle w:val="Normal"/>
                     <w:jc w:val="left"/>
                     <w:pBdr>
                       <w:bottom w:val="none" w:sz="0" w:space="0" w:color="000000"/>
@@ -4101,6 +4575,16 @@
                     </w:pBdr>
                     <w:spacing w:after="40" w:before="40" w:line="240"/>
                     <w:ind w:left="40" w:right="40" w:firstLine="0" w:firstLineChars="0"/>
+                    <w:rPr>
+                      <w:rFonts w:ascii="Helvetica" w:hAnsi="Helvetica" w:eastAsia="Helvetica" w:cs="Helvetica"/>
+                      <w:i w:val="false"/>
+                      <w:b w:val="false"/>
+                      <w:u w:val="none"/>
+                      <w:strike w:val="false"/>
+                      <w:sz w:val="19"/>
+                      <w:szCs w:val="19"/>
+                      <w:color w:val="000000"/>
+                    </w:rPr>
                   </w:pPr>
                   <w:r xmlns:w="http://schemas.openxmlformats.org/wordprocessingml/2006/main" xmlns:wp="http://schemas.openxmlformats.org/drawingml/2006/wordprocessingDrawing" xmlns:r="http://schemas.openxmlformats.org/officeDocument/2006/relationships" xmlns:w14="http://schemas.microsoft.com/office/word/2010/wordml">
                     <w:rPr>
@@ -4108,6 +4592,7 @@
                       <w:i w:val="false"/>
                       <w:b w:val="false"/>
                       <w:u w:val="none"/>
+                      <w:strike w:val="false"/>
                       <w:sz w:val="19"/>
                       <w:szCs w:val="19"/>
                       <w:color w:val="000000"/>
@@ -4135,7 +4620,6 @@
                 </w:tcPr>
                 <w:p>
                   <w:pPr>
-                    <w:pStyle w:val="Normal"/>
                     <w:jc w:val="left"/>
                     <w:pBdr>
                       <w:bottom w:val="none" w:sz="0" w:space="0" w:color="000000"/>
@@ -4145,6 +4629,16 @@
                     </w:pBdr>
                     <w:spacing w:after="40" w:before="40" w:line="240"/>
                     <w:ind w:left="40" w:right="40" w:firstLine="0" w:firstLineChars="0"/>
+                    <w:rPr>
+                      <w:rFonts w:ascii="Helvetica" w:hAnsi="Helvetica" w:eastAsia="Helvetica" w:cs="Helvetica"/>
+                      <w:i w:val="false"/>
+                      <w:b w:val="false"/>
+                      <w:u w:val="none"/>
+                      <w:strike w:val="false"/>
+                      <w:sz w:val="19"/>
+                      <w:szCs w:val="19"/>
+                      <w:color w:val="000000"/>
+                    </w:rPr>
                   </w:pPr>
                   <w:r xmlns:w="http://schemas.openxmlformats.org/wordprocessingml/2006/main" xmlns:wp="http://schemas.openxmlformats.org/drawingml/2006/wordprocessingDrawing" xmlns:r="http://schemas.openxmlformats.org/officeDocument/2006/relationships" xmlns:w14="http://schemas.microsoft.com/office/word/2010/wordml">
                     <w:rPr>
@@ -4152,6 +4646,7 @@
                       <w:i w:val="false"/>
                       <w:b w:val="false"/>
                       <w:u w:val="none"/>
+                      <w:strike w:val="false"/>
                       <w:sz w:val="19"/>
                       <w:szCs w:val="19"/>
                       <w:color w:val="000000"/>
@@ -4179,7 +4674,6 @@
                 </w:tcPr>
                 <w:p>
                   <w:pPr>
-                    <w:pStyle w:val="Normal"/>
                     <w:jc w:val="center"/>
                     <w:pBdr>
                       <w:bottom w:val="none" w:sz="0" w:space="0" w:color="000000"/>
@@ -4189,6 +4683,16 @@
                     </w:pBdr>
                     <w:spacing w:after="40" w:before="40" w:line="240"/>
                     <w:ind w:left="40" w:right="40" w:firstLine="0" w:firstLineChars="0"/>
+                    <w:rPr>
+                      <w:rFonts w:ascii="Helvetica" w:hAnsi="Helvetica" w:eastAsia="Helvetica" w:cs="Helvetica"/>
+                      <w:i w:val="false"/>
+                      <w:b w:val="false"/>
+                      <w:u w:val="none"/>
+                      <w:strike w:val="false"/>
+                      <w:sz w:val="19"/>
+                      <w:szCs w:val="19"/>
+                      <w:color w:val="000000"/>
+                    </w:rPr>
                   </w:pPr>
                   <w:r xmlns:w="http://schemas.openxmlformats.org/wordprocessingml/2006/main" xmlns:wp="http://schemas.openxmlformats.org/drawingml/2006/wordprocessingDrawing" xmlns:r="http://schemas.openxmlformats.org/officeDocument/2006/relationships" xmlns:w14="http://schemas.microsoft.com/office/word/2010/wordml">
                     <w:rPr>
@@ -4196,6 +4700,7 @@
                       <w:i w:val="false"/>
                       <w:b w:val="false"/>
                       <w:u w:val="none"/>
+                      <w:strike w:val="false"/>
                       <w:sz w:val="19"/>
                       <w:szCs w:val="19"/>
                       <w:color w:val="000000"/>
@@ -4223,7 +4728,6 @@
                 </w:tcPr>
                 <w:p>
                   <w:pPr>
-                    <w:pStyle w:val="Normal"/>
                     <w:jc w:val="center"/>
                     <w:pBdr>
                       <w:bottom w:val="none" w:sz="0" w:space="0" w:color="000000"/>
@@ -4233,6 +4737,16 @@
                     </w:pBdr>
                     <w:spacing w:after="40" w:before="40" w:line="240"/>
                     <w:ind w:left="40" w:right="40" w:firstLine="0" w:firstLineChars="0"/>
+                    <w:rPr>
+                      <w:rFonts w:ascii="Helvetica" w:hAnsi="Helvetica" w:eastAsia="Helvetica" w:cs="Helvetica"/>
+                      <w:i w:val="false"/>
+                      <w:b w:val="false"/>
+                      <w:u w:val="none"/>
+                      <w:strike w:val="false"/>
+                      <w:sz w:val="19"/>
+                      <w:szCs w:val="19"/>
+                      <w:color w:val="000000"/>
+                    </w:rPr>
                   </w:pPr>
                   <w:r xmlns:w="http://schemas.openxmlformats.org/wordprocessingml/2006/main" xmlns:wp="http://schemas.openxmlformats.org/drawingml/2006/wordprocessingDrawing" xmlns:r="http://schemas.openxmlformats.org/officeDocument/2006/relationships" xmlns:w14="http://schemas.microsoft.com/office/word/2010/wordml">
                     <w:rPr>
@@ -4240,6 +4754,7 @@
                       <w:i w:val="false"/>
                       <w:b w:val="false"/>
                       <w:u w:val="none"/>
+                      <w:strike w:val="false"/>
                       <w:sz w:val="19"/>
                       <w:szCs w:val="19"/>
                       <w:color w:val="000000"/>
@@ -4267,7 +4782,6 @@
                 </w:tcPr>
                 <w:p>
                   <w:pPr>
-                    <w:pStyle w:val="Normal"/>
                     <w:jc w:val="center"/>
                     <w:pBdr>
                       <w:bottom w:val="none" w:sz="0" w:space="0" w:color="000000"/>
@@ -4277,6 +4791,16 @@
                     </w:pBdr>
                     <w:spacing w:after="40" w:before="40" w:line="240"/>
                     <w:ind w:left="40" w:right="40" w:firstLine="0" w:firstLineChars="0"/>
+                    <w:rPr>
+                      <w:rFonts w:ascii="Helvetica" w:hAnsi="Helvetica" w:eastAsia="Helvetica" w:cs="Helvetica"/>
+                      <w:i w:val="false"/>
+                      <w:b w:val="false"/>
+                      <w:u w:val="none"/>
+                      <w:strike w:val="false"/>
+                      <w:sz w:val="19"/>
+                      <w:szCs w:val="19"/>
+                      <w:color w:val="000000"/>
+                    </w:rPr>
                   </w:pPr>
                   <w:r xmlns:w="http://schemas.openxmlformats.org/wordprocessingml/2006/main" xmlns:wp="http://schemas.openxmlformats.org/drawingml/2006/wordprocessingDrawing" xmlns:r="http://schemas.openxmlformats.org/officeDocument/2006/relationships" xmlns:w14="http://schemas.microsoft.com/office/word/2010/wordml">
                     <w:rPr>
@@ -4284,6 +4808,7 @@
                       <w:i w:val="false"/>
                       <w:b w:val="false"/>
                       <w:u w:val="none"/>
+                      <w:strike w:val="false"/>
                       <w:sz w:val="19"/>
                       <w:szCs w:val="19"/>
                       <w:color w:val="000000"/>
@@ -4297,7 +4822,6 @@
               <w:trPr>
                 <w:trHeight w:val="433" w:hRule="auto"/>
               </w:trPr>
-              body 9
               <w:tc>
                 <w:tcPr>
                   <w:vMerge w:val="restart"/>
@@ -4318,7 +4842,6 @@
                 </w:tcPr>
                 <w:p>
                   <w:pPr>
-                    <w:pStyle w:val="Normal"/>
                     <w:jc w:val="left"/>
                     <w:pBdr>
                       <w:bottom w:val="none" w:sz="0" w:space="0" w:color="000000"/>
@@ -4328,6 +4851,16 @@
                     </w:pBdr>
                     <w:spacing w:after="40" w:before="40" w:line="240"/>
                     <w:ind w:left="40" w:right="40" w:firstLine="0" w:firstLineChars="0"/>
+                    <w:rPr>
+                      <w:rFonts w:ascii="Helvetica" w:hAnsi="Helvetica" w:eastAsia="Helvetica" w:cs="Helvetica"/>
+                      <w:i w:val="false"/>
+                      <w:b w:val="false"/>
+                      <w:u w:val="none"/>
+                      <w:strike w:val="false"/>
+                      <w:sz w:val="19"/>
+                      <w:szCs w:val="19"/>
+                      <w:color w:val="000000"/>
+                    </w:rPr>
                   </w:pPr>
                   <w:r xmlns:w="http://schemas.openxmlformats.org/wordprocessingml/2006/main" xmlns:wp="http://schemas.openxmlformats.org/drawingml/2006/wordprocessingDrawing" xmlns:r="http://schemas.openxmlformats.org/officeDocument/2006/relationships" xmlns:w14="http://schemas.microsoft.com/office/word/2010/wordml">
                     <w:rPr>
@@ -4335,6 +4868,7 @@
                       <w:i w:val="false"/>
                       <w:b w:val="false"/>
                       <w:u w:val="none"/>
+                      <w:strike w:val="false"/>
                       <w:sz w:val="19"/>
                       <w:szCs w:val="19"/>
                       <w:color w:val="000000"/>
@@ -4362,7 +4896,6 @@
                 </w:tcPr>
                 <w:p>
                   <w:pPr>
-                    <w:pStyle w:val="Normal"/>
                     <w:jc w:val="left"/>
                     <w:pBdr>
                       <w:bottom w:val="none" w:sz="0" w:space="0" w:color="000000"/>
@@ -4372,6 +4905,16 @@
                     </w:pBdr>
                     <w:spacing w:after="40" w:before="40" w:line="240"/>
                     <w:ind w:left="40" w:right="40" w:firstLine="0" w:firstLineChars="0"/>
+                    <w:rPr>
+                      <w:rFonts w:ascii="Helvetica" w:hAnsi="Helvetica" w:eastAsia="Helvetica" w:cs="Helvetica"/>
+                      <w:i w:val="false"/>
+                      <w:b w:val="false"/>
+                      <w:u w:val="none"/>
+                      <w:strike w:val="false"/>
+                      <w:sz w:val="19"/>
+                      <w:szCs w:val="19"/>
+                      <w:color w:val="000000"/>
+                    </w:rPr>
                   </w:pPr>
                   <w:r xmlns:w="http://schemas.openxmlformats.org/wordprocessingml/2006/main" xmlns:wp="http://schemas.openxmlformats.org/drawingml/2006/wordprocessingDrawing" xmlns:r="http://schemas.openxmlformats.org/officeDocument/2006/relationships" xmlns:w14="http://schemas.microsoft.com/office/word/2010/wordml">
                     <w:rPr>
@@ -4379,6 +4922,7 @@
                       <w:i w:val="false"/>
                       <w:b w:val="false"/>
                       <w:u w:val="none"/>
+                      <w:strike w:val="false"/>
                       <w:sz w:val="19"/>
                       <w:szCs w:val="19"/>
                       <w:color w:val="000000"/>
@@ -4406,7 +4950,6 @@
                 </w:tcPr>
                 <w:p>
                   <w:pPr>
-                    <w:pStyle w:val="Normal"/>
                     <w:jc w:val="left"/>
                     <w:pBdr>
                       <w:bottom w:val="none" w:sz="0" w:space="0" w:color="000000"/>
@@ -4416,6 +4959,16 @@
                     </w:pBdr>
                     <w:spacing w:after="40" w:before="40" w:line="240"/>
                     <w:ind w:left="40" w:right="40" w:firstLine="0" w:firstLineChars="0"/>
+                    <w:rPr>
+                      <w:rFonts w:ascii="Helvetica" w:hAnsi="Helvetica" w:eastAsia="Helvetica" w:cs="Helvetica"/>
+                      <w:i w:val="false"/>
+                      <w:b w:val="false"/>
+                      <w:u w:val="none"/>
+                      <w:strike w:val="false"/>
+                      <w:sz w:val="19"/>
+                      <w:szCs w:val="19"/>
+                      <w:color w:val="000000"/>
+                    </w:rPr>
                   </w:pPr>
                   <w:r xmlns:w="http://schemas.openxmlformats.org/wordprocessingml/2006/main" xmlns:wp="http://schemas.openxmlformats.org/drawingml/2006/wordprocessingDrawing" xmlns:r="http://schemas.openxmlformats.org/officeDocument/2006/relationships" xmlns:w14="http://schemas.microsoft.com/office/word/2010/wordml">
                     <w:rPr>
@@ -4423,6 +4976,7 @@
                       <w:i w:val="false"/>
                       <w:b w:val="false"/>
                       <w:u w:val="none"/>
+                      <w:strike w:val="false"/>
                       <w:sz w:val="19"/>
                       <w:szCs w:val="19"/>
                       <w:color w:val="000000"/>
@@ -4450,7 +5004,6 @@
                 </w:tcPr>
                 <w:p>
                   <w:pPr>
-                    <w:pStyle w:val="Normal"/>
                     <w:jc w:val="center"/>
                     <w:pBdr>
                       <w:bottom w:val="none" w:sz="0" w:space="0" w:color="000000"/>
@@ -4460,6 +5013,16 @@
                     </w:pBdr>
                     <w:spacing w:after="40" w:before="40" w:line="240"/>
                     <w:ind w:left="40" w:right="40" w:firstLine="0" w:firstLineChars="0"/>
+                    <w:rPr>
+                      <w:rFonts w:ascii="Helvetica" w:hAnsi="Helvetica" w:eastAsia="Helvetica" w:cs="Helvetica"/>
+                      <w:i w:val="false"/>
+                      <w:b w:val="false"/>
+                      <w:u w:val="none"/>
+                      <w:strike w:val="false"/>
+                      <w:sz w:val="19"/>
+                      <w:szCs w:val="19"/>
+                      <w:color w:val="000000"/>
+                    </w:rPr>
                   </w:pPr>
                   <w:r xmlns:w="http://schemas.openxmlformats.org/wordprocessingml/2006/main" xmlns:wp="http://schemas.openxmlformats.org/drawingml/2006/wordprocessingDrawing" xmlns:r="http://schemas.openxmlformats.org/officeDocument/2006/relationships" xmlns:w14="http://schemas.microsoft.com/office/word/2010/wordml">
                     <w:rPr>
@@ -4467,6 +5030,7 @@
                       <w:i w:val="false"/>
                       <w:b w:val="false"/>
                       <w:u w:val="none"/>
+                      <w:strike w:val="false"/>
                       <w:sz w:val="19"/>
                       <w:szCs w:val="19"/>
                       <w:color w:val="000000"/>
@@ -4494,7 +5058,6 @@
                 </w:tcPr>
                 <w:p>
                   <w:pPr>
-                    <w:pStyle w:val="Normal"/>
                     <w:jc w:val="center"/>
                     <w:pBdr>
                       <w:bottom w:val="none" w:sz="0" w:space="0" w:color="000000"/>
@@ -4504,6 +5067,16 @@
                     </w:pBdr>
                     <w:spacing w:after="40" w:before="40" w:line="240"/>
                     <w:ind w:left="40" w:right="40" w:firstLine="0" w:firstLineChars="0"/>
+                    <w:rPr>
+                      <w:rFonts w:ascii="Helvetica" w:hAnsi="Helvetica" w:eastAsia="Helvetica" w:cs="Helvetica"/>
+                      <w:i w:val="false"/>
+                      <w:b w:val="false"/>
+                      <w:u w:val="none"/>
+                      <w:strike w:val="false"/>
+                      <w:sz w:val="19"/>
+                      <w:szCs w:val="19"/>
+                      <w:color w:val="000000"/>
+                    </w:rPr>
                   </w:pPr>
                   <w:r xmlns:w="http://schemas.openxmlformats.org/wordprocessingml/2006/main" xmlns:wp="http://schemas.openxmlformats.org/drawingml/2006/wordprocessingDrawing" xmlns:r="http://schemas.openxmlformats.org/officeDocument/2006/relationships" xmlns:w14="http://schemas.microsoft.com/office/word/2010/wordml">
                     <w:rPr>
@@ -4511,6 +5084,7 @@
                       <w:i w:val="false"/>
                       <w:b w:val="false"/>
                       <w:u w:val="none"/>
+                      <w:strike w:val="false"/>
                       <w:sz w:val="19"/>
                       <w:szCs w:val="19"/>
                       <w:color w:val="000000"/>
@@ -4538,7 +5112,6 @@
                 </w:tcPr>
                 <w:p>
                   <w:pPr>
-                    <w:pStyle w:val="Normal"/>
                     <w:jc w:val="center"/>
                     <w:pBdr>
                       <w:bottom w:val="none" w:sz="0" w:space="0" w:color="000000"/>
@@ -4548,6 +5121,16 @@
                     </w:pBdr>
                     <w:spacing w:after="40" w:before="40" w:line="240"/>
                     <w:ind w:left="40" w:right="40" w:firstLine="0" w:firstLineChars="0"/>
+                    <w:rPr>
+                      <w:rFonts w:ascii="Helvetica" w:hAnsi="Helvetica" w:eastAsia="Helvetica" w:cs="Helvetica"/>
+                      <w:i w:val="false"/>
+                      <w:b w:val="false"/>
+                      <w:u w:val="none"/>
+                      <w:strike w:val="false"/>
+                      <w:sz w:val="19"/>
+                      <w:szCs w:val="19"/>
+                      <w:color w:val="000000"/>
+                    </w:rPr>
                   </w:pPr>
                   <w:r xmlns:w="http://schemas.openxmlformats.org/wordprocessingml/2006/main" xmlns:wp="http://schemas.openxmlformats.org/drawingml/2006/wordprocessingDrawing" xmlns:r="http://schemas.openxmlformats.org/officeDocument/2006/relationships" xmlns:w14="http://schemas.microsoft.com/office/word/2010/wordml">
                     <w:rPr>
@@ -4555,6 +5138,7 @@
                       <w:i w:val="false"/>
                       <w:b w:val="false"/>
                       <w:u w:val="none"/>
+                      <w:strike w:val="false"/>
                       <w:sz w:val="19"/>
                       <w:szCs w:val="19"/>
                       <w:color w:val="000000"/>
@@ -4568,7 +5152,6 @@
               <w:trPr>
                 <w:trHeight w:val="433" w:hRule="auto"/>
               </w:trPr>
-              body10
               <w:tc>
                 <w:tcPr>
                   <w:vMerge/>
@@ -4589,7 +5172,6 @@
                 </w:tcPr>
                 <w:p>
                   <w:pPr>
-                    <w:pStyle w:val="Normal"/>
                     <w:jc w:val="left"/>
                     <w:pBdr>
                       <w:bottom w:val="none" w:sz="0" w:space="0" w:color="000000"/>
@@ -4599,6 +5181,16 @@
                     </w:pBdr>
                     <w:spacing w:after="40" w:before="40" w:line="240"/>
                     <w:ind w:left="40" w:right="40" w:firstLine="0" w:firstLineChars="0"/>
+                    <w:rPr>
+                      <w:rFonts w:ascii="Helvetica" w:hAnsi="Helvetica" w:eastAsia="Helvetica" w:cs="Helvetica"/>
+                      <w:i w:val="false"/>
+                      <w:b w:val="false"/>
+                      <w:u w:val="none"/>
+                      <w:strike w:val="false"/>
+                      <w:sz w:val="19"/>
+                      <w:szCs w:val="19"/>
+                      <w:color w:val="000000"/>
+                    </w:rPr>
                   </w:pPr>
                 </w:p>
               </w:tc>
@@ -4621,7 +5213,6 @@
                 </w:tcPr>
                 <w:p>
                   <w:pPr>
-                    <w:pStyle w:val="Normal"/>
                     <w:jc w:val="left"/>
                     <w:pBdr>
                       <w:bottom w:val="none" w:sz="0" w:space="0" w:color="000000"/>
@@ -4631,6 +5222,16 @@
                     </w:pBdr>
                     <w:spacing w:after="40" w:before="40" w:line="240"/>
                     <w:ind w:left="40" w:right="40" w:firstLine="0" w:firstLineChars="0"/>
+                    <w:rPr>
+                      <w:rFonts w:ascii="Helvetica" w:hAnsi="Helvetica" w:eastAsia="Helvetica" w:cs="Helvetica"/>
+                      <w:i w:val="false"/>
+                      <w:b w:val="false"/>
+                      <w:u w:val="none"/>
+                      <w:strike w:val="false"/>
+                      <w:sz w:val="19"/>
+                      <w:szCs w:val="19"/>
+                      <w:color w:val="000000"/>
+                    </w:rPr>
                   </w:pPr>
                   <w:r xmlns:w="http://schemas.openxmlformats.org/wordprocessingml/2006/main" xmlns:wp="http://schemas.openxmlformats.org/drawingml/2006/wordprocessingDrawing" xmlns:r="http://schemas.openxmlformats.org/officeDocument/2006/relationships" xmlns:w14="http://schemas.microsoft.com/office/word/2010/wordml">
                     <w:rPr>
@@ -4638,6 +5239,7 @@
                       <w:i w:val="false"/>
                       <w:b w:val="false"/>
                       <w:u w:val="none"/>
+                      <w:strike w:val="false"/>
                       <w:sz w:val="19"/>
                       <w:szCs w:val="19"/>
                       <w:color w:val="000000"/>
@@ -4665,7 +5267,6 @@
                 </w:tcPr>
                 <w:p>
                   <w:pPr>
-                    <w:pStyle w:val="Normal"/>
                     <w:jc w:val="left"/>
                     <w:pBdr>
                       <w:bottom w:val="none" w:sz="0" w:space="0" w:color="000000"/>
@@ -4675,6 +5276,16 @@
                     </w:pBdr>
                     <w:spacing w:after="40" w:before="40" w:line="240"/>
                     <w:ind w:left="40" w:right="40" w:firstLine="0" w:firstLineChars="0"/>
+                    <w:rPr>
+                      <w:rFonts w:ascii="Helvetica" w:hAnsi="Helvetica" w:eastAsia="Helvetica" w:cs="Helvetica"/>
+                      <w:i w:val="false"/>
+                      <w:b w:val="false"/>
+                      <w:u w:val="none"/>
+                      <w:strike w:val="false"/>
+                      <w:sz w:val="19"/>
+                      <w:szCs w:val="19"/>
+                      <w:color w:val="000000"/>
+                    </w:rPr>
                   </w:pPr>
                   <w:r xmlns:w="http://schemas.openxmlformats.org/wordprocessingml/2006/main" xmlns:wp="http://schemas.openxmlformats.org/drawingml/2006/wordprocessingDrawing" xmlns:r="http://schemas.openxmlformats.org/officeDocument/2006/relationships" xmlns:w14="http://schemas.microsoft.com/office/word/2010/wordml">
                     <w:rPr>
@@ -4682,6 +5293,7 @@
                       <w:i w:val="false"/>
                       <w:b w:val="false"/>
                       <w:u w:val="none"/>
+                      <w:strike w:val="false"/>
                       <w:sz w:val="19"/>
                       <w:szCs w:val="19"/>
                       <w:color w:val="000000"/>
@@ -4709,7 +5321,6 @@
                 </w:tcPr>
                 <w:p>
                   <w:pPr>
-                    <w:pStyle w:val="Normal"/>
                     <w:jc w:val="center"/>
                     <w:pBdr>
                       <w:bottom w:val="none" w:sz="0" w:space="0" w:color="000000"/>
@@ -4719,6 +5330,16 @@
                     </w:pBdr>
                     <w:spacing w:after="40" w:before="40" w:line="240"/>
                     <w:ind w:left="40" w:right="40" w:firstLine="0" w:firstLineChars="0"/>
+                    <w:rPr>
+                      <w:rFonts w:ascii="Helvetica" w:hAnsi="Helvetica" w:eastAsia="Helvetica" w:cs="Helvetica"/>
+                      <w:i w:val="false"/>
+                      <w:b w:val="false"/>
+                      <w:u w:val="none"/>
+                      <w:strike w:val="false"/>
+                      <w:sz w:val="19"/>
+                      <w:szCs w:val="19"/>
+                      <w:color w:val="000000"/>
+                    </w:rPr>
                   </w:pPr>
                   <w:r xmlns:w="http://schemas.openxmlformats.org/wordprocessingml/2006/main" xmlns:wp="http://schemas.openxmlformats.org/drawingml/2006/wordprocessingDrawing" xmlns:r="http://schemas.openxmlformats.org/officeDocument/2006/relationships" xmlns:w14="http://schemas.microsoft.com/office/word/2010/wordml">
                     <w:rPr>
@@ -4726,6 +5347,7 @@
                       <w:i w:val="false"/>
                       <w:b w:val="false"/>
                       <w:u w:val="none"/>
+                      <w:strike w:val="false"/>
                       <w:sz w:val="19"/>
                       <w:szCs w:val="19"/>
                       <w:color w:val="000000"/>
@@ -4753,7 +5375,6 @@
                 </w:tcPr>
                 <w:p>
                   <w:pPr>
-                    <w:pStyle w:val="Normal"/>
                     <w:jc w:val="center"/>
                     <w:pBdr>
                       <w:bottom w:val="none" w:sz="0" w:space="0" w:color="000000"/>
@@ -4763,6 +5384,16 @@
                     </w:pBdr>
                     <w:spacing w:after="40" w:before="40" w:line="240"/>
                     <w:ind w:left="40" w:right="40" w:firstLine="0" w:firstLineChars="0"/>
+                    <w:rPr>
+                      <w:rFonts w:ascii="Helvetica" w:hAnsi="Helvetica" w:eastAsia="Helvetica" w:cs="Helvetica"/>
+                      <w:i w:val="false"/>
+                      <w:b w:val="false"/>
+                      <w:u w:val="none"/>
+                      <w:strike w:val="false"/>
+                      <w:sz w:val="19"/>
+                      <w:szCs w:val="19"/>
+                      <w:color w:val="000000"/>
+                    </w:rPr>
                   </w:pPr>
                   <w:r xmlns:w="http://schemas.openxmlformats.org/wordprocessingml/2006/main" xmlns:wp="http://schemas.openxmlformats.org/drawingml/2006/wordprocessingDrawing" xmlns:r="http://schemas.openxmlformats.org/officeDocument/2006/relationships" xmlns:w14="http://schemas.microsoft.com/office/word/2010/wordml">
                     <w:rPr>
@@ -4770,6 +5401,7 @@
                       <w:i w:val="false"/>
                       <w:b w:val="false"/>
                       <w:u w:val="none"/>
+                      <w:strike w:val="false"/>
                       <w:sz w:val="19"/>
                       <w:szCs w:val="19"/>
                       <w:color w:val="000000"/>
@@ -4797,7 +5429,6 @@
                 </w:tcPr>
                 <w:p>
                   <w:pPr>
-                    <w:pStyle w:val="Normal"/>
                     <w:jc w:val="center"/>
                     <w:pBdr>
                       <w:bottom w:val="none" w:sz="0" w:space="0" w:color="000000"/>
@@ -4807,6 +5438,16 @@
                     </w:pBdr>
                     <w:spacing w:after="40" w:before="40" w:line="240"/>
                     <w:ind w:left="40" w:right="40" w:firstLine="0" w:firstLineChars="0"/>
+                    <w:rPr>
+                      <w:rFonts w:ascii="Helvetica" w:hAnsi="Helvetica" w:eastAsia="Helvetica" w:cs="Helvetica"/>
+                      <w:i w:val="false"/>
+                      <w:b w:val="false"/>
+                      <w:u w:val="none"/>
+                      <w:strike w:val="false"/>
+                      <w:sz w:val="19"/>
+                      <w:szCs w:val="19"/>
+                      <w:color w:val="000000"/>
+                    </w:rPr>
                   </w:pPr>
                   <w:r xmlns:w="http://schemas.openxmlformats.org/wordprocessingml/2006/main" xmlns:wp="http://schemas.openxmlformats.org/drawingml/2006/wordprocessingDrawing" xmlns:r="http://schemas.openxmlformats.org/officeDocument/2006/relationships" xmlns:w14="http://schemas.microsoft.com/office/word/2010/wordml">
                     <w:rPr>
@@ -4814,6 +5455,7 @@
                       <w:i w:val="false"/>
                       <w:b w:val="false"/>
                       <w:u w:val="none"/>
+                      <w:strike w:val="false"/>
                       <w:sz w:val="19"/>
                       <w:szCs w:val="19"/>
                       <w:color w:val="000000"/>
@@ -4827,12 +5469,11 @@
               <w:trPr>
                 <w:trHeight w:val="429" w:hRule="auto"/>
               </w:trPr>
-              body11
               <w:tc>
                 <w:tcPr>
                   <w:vMerge w:val="restart"/>
                   <w:tcBorders>
-                    <w:bottom w:val="none" w:sz="0" w:space="0" w:color="000000"/>
+                    <w:bottom w:val="single" w:sz="12" w:space="0" w:color="666666"/>
                     <w:top w:val="none" w:sz="0" w:space="0" w:color="000000"/>
                     <w:left w:val="none" w:sz="0" w:space="0" w:color="000000"/>
                     <w:right w:val="none" w:sz="0" w:space="0" w:color="000000"/>
@@ -4848,7 +5489,6 @@
                 </w:tcPr>
                 <w:p>
                   <w:pPr>
-                    <w:pStyle w:val="Normal"/>
                     <w:jc w:val="left"/>
                     <w:pBdr>
                       <w:bottom w:val="none" w:sz="0" w:space="0" w:color="000000"/>
@@ -4858,6 +5498,16 @@
                     </w:pBdr>
                     <w:spacing w:after="40" w:before="40" w:line="240"/>
                     <w:ind w:left="40" w:right="40" w:firstLine="0" w:firstLineChars="0"/>
+                    <w:rPr>
+                      <w:rFonts w:ascii="Helvetica" w:hAnsi="Helvetica" w:eastAsia="Helvetica" w:cs="Helvetica"/>
+                      <w:i w:val="false"/>
+                      <w:b w:val="false"/>
+                      <w:u w:val="none"/>
+                      <w:strike w:val="false"/>
+                      <w:sz w:val="19"/>
+                      <w:szCs w:val="19"/>
+                      <w:color w:val="000000"/>
+                    </w:rPr>
                   </w:pPr>
                   <w:r xmlns:w="http://schemas.openxmlformats.org/wordprocessingml/2006/main" xmlns:wp="http://schemas.openxmlformats.org/drawingml/2006/wordprocessingDrawing" xmlns:r="http://schemas.openxmlformats.org/officeDocument/2006/relationships" xmlns:w14="http://schemas.microsoft.com/office/word/2010/wordml">
                     <w:rPr>
@@ -4865,6 +5515,7 @@
                       <w:i w:val="false"/>
                       <w:b w:val="false"/>
                       <w:u w:val="none"/>
+                      <w:strike w:val="false"/>
                       <w:sz w:val="19"/>
                       <w:szCs w:val="19"/>
                       <w:color w:val="000000"/>
@@ -4892,7 +5543,6 @@
                 </w:tcPr>
                 <w:p>
                   <w:pPr>
-                    <w:pStyle w:val="Normal"/>
                     <w:jc w:val="left"/>
                     <w:pBdr>
                       <w:bottom w:val="none" w:sz="0" w:space="0" w:color="000000"/>
@@ -4902,6 +5552,16 @@
                     </w:pBdr>
                     <w:spacing w:after="40" w:before="40" w:line="240"/>
                     <w:ind w:left="40" w:right="40" w:firstLine="0" w:firstLineChars="0"/>
+                    <w:rPr>
+                      <w:rFonts w:ascii="Helvetica" w:hAnsi="Helvetica" w:eastAsia="Helvetica" w:cs="Helvetica"/>
+                      <w:i w:val="false"/>
+                      <w:b w:val="false"/>
+                      <w:u w:val="none"/>
+                      <w:strike w:val="false"/>
+                      <w:sz w:val="19"/>
+                      <w:szCs w:val="19"/>
+                      <w:color w:val="000000"/>
+                    </w:rPr>
                   </w:pPr>
                   <w:r xmlns:w="http://schemas.openxmlformats.org/wordprocessingml/2006/main" xmlns:wp="http://schemas.openxmlformats.org/drawingml/2006/wordprocessingDrawing" xmlns:r="http://schemas.openxmlformats.org/officeDocument/2006/relationships" xmlns:w14="http://schemas.microsoft.com/office/word/2010/wordml">
                     <w:rPr>
@@ -4909,6 +5569,7 @@
                       <w:i w:val="false"/>
                       <w:b w:val="false"/>
                       <w:u w:val="none"/>
+                      <w:strike w:val="false"/>
                       <w:sz w:val="19"/>
                       <w:szCs w:val="19"/>
                       <w:color w:val="000000"/>
@@ -4936,7 +5597,6 @@
                 </w:tcPr>
                 <w:p>
                   <w:pPr>
-                    <w:pStyle w:val="Normal"/>
                     <w:jc w:val="left"/>
                     <w:pBdr>
                       <w:bottom w:val="none" w:sz="0" w:space="0" w:color="000000"/>
@@ -4946,6 +5606,16 @@
                     </w:pBdr>
                     <w:spacing w:after="40" w:before="40" w:line="240"/>
                     <w:ind w:left="40" w:right="40" w:firstLine="0" w:firstLineChars="0"/>
+                    <w:rPr>
+                      <w:rFonts w:ascii="Helvetica" w:hAnsi="Helvetica" w:eastAsia="Helvetica" w:cs="Helvetica"/>
+                      <w:i w:val="false"/>
+                      <w:b w:val="false"/>
+                      <w:u w:val="none"/>
+                      <w:strike w:val="false"/>
+                      <w:sz w:val="19"/>
+                      <w:szCs w:val="19"/>
+                      <w:color w:val="000000"/>
+                    </w:rPr>
                   </w:pPr>
                   <w:r xmlns:w="http://schemas.openxmlformats.org/wordprocessingml/2006/main" xmlns:wp="http://schemas.openxmlformats.org/drawingml/2006/wordprocessingDrawing" xmlns:r="http://schemas.openxmlformats.org/officeDocument/2006/relationships" xmlns:w14="http://schemas.microsoft.com/office/word/2010/wordml">
                     <w:rPr>
@@ -4953,6 +5623,7 @@
                       <w:i w:val="false"/>
                       <w:b w:val="false"/>
                       <w:u w:val="none"/>
+                      <w:strike w:val="false"/>
                       <w:sz w:val="19"/>
                       <w:szCs w:val="19"/>
                       <w:color w:val="000000"/>
@@ -4980,7 +5651,6 @@
                 </w:tcPr>
                 <w:p>
                   <w:pPr>
-                    <w:pStyle w:val="Normal"/>
                     <w:jc w:val="center"/>
                     <w:pBdr>
                       <w:bottom w:val="none" w:sz="0" w:space="0" w:color="000000"/>
@@ -4990,6 +5660,16 @@
                     </w:pBdr>
                     <w:spacing w:after="40" w:before="40" w:line="240"/>
                     <w:ind w:left="40" w:right="40" w:firstLine="0" w:firstLineChars="0"/>
+                    <w:rPr>
+                      <w:rFonts w:ascii="Helvetica" w:hAnsi="Helvetica" w:eastAsia="Helvetica" w:cs="Helvetica"/>
+                      <w:i w:val="false"/>
+                      <w:b w:val="false"/>
+                      <w:u w:val="none"/>
+                      <w:strike w:val="false"/>
+                      <w:sz w:val="19"/>
+                      <w:szCs w:val="19"/>
+                      <w:color w:val="000000"/>
+                    </w:rPr>
                   </w:pPr>
                   <w:r xmlns:w="http://schemas.openxmlformats.org/wordprocessingml/2006/main" xmlns:wp="http://schemas.openxmlformats.org/drawingml/2006/wordprocessingDrawing" xmlns:r="http://schemas.openxmlformats.org/officeDocument/2006/relationships" xmlns:w14="http://schemas.microsoft.com/office/word/2010/wordml">
                     <w:rPr>
@@ -4997,6 +5677,7 @@
                       <w:i w:val="false"/>
                       <w:b w:val="false"/>
                       <w:u w:val="none"/>
+                      <w:strike w:val="false"/>
                       <w:sz w:val="19"/>
                       <w:szCs w:val="19"/>
                       <w:color w:val="000000"/>
@@ -5024,7 +5705,6 @@
                 </w:tcPr>
                 <w:p>
                   <w:pPr>
-                    <w:pStyle w:val="Normal"/>
                     <w:jc w:val="center"/>
                     <w:pBdr>
                       <w:bottom w:val="none" w:sz="0" w:space="0" w:color="000000"/>
@@ -5034,6 +5714,16 @@
                     </w:pBdr>
                     <w:spacing w:after="40" w:before="40" w:line="240"/>
                     <w:ind w:left="40" w:right="40" w:firstLine="0" w:firstLineChars="0"/>
+                    <w:rPr>
+                      <w:rFonts w:ascii="Helvetica" w:hAnsi="Helvetica" w:eastAsia="Helvetica" w:cs="Helvetica"/>
+                      <w:i w:val="false"/>
+                      <w:b w:val="false"/>
+                      <w:u w:val="none"/>
+                      <w:strike w:val="false"/>
+                      <w:sz w:val="19"/>
+                      <w:szCs w:val="19"/>
+                      <w:color w:val="000000"/>
+                    </w:rPr>
                   </w:pPr>
                   <w:r xmlns:w="http://schemas.openxmlformats.org/wordprocessingml/2006/main" xmlns:wp="http://schemas.openxmlformats.org/drawingml/2006/wordprocessingDrawing" xmlns:r="http://schemas.openxmlformats.org/officeDocument/2006/relationships" xmlns:w14="http://schemas.microsoft.com/office/word/2010/wordml">
                     <w:rPr>
@@ -5041,6 +5731,7 @@
                       <w:i w:val="false"/>
                       <w:b w:val="false"/>
                       <w:u w:val="none"/>
+                      <w:strike w:val="false"/>
                       <w:sz w:val="19"/>
                       <w:szCs w:val="19"/>
                       <w:color w:val="000000"/>
@@ -5068,7 +5759,6 @@
                 </w:tcPr>
                 <w:p>
                   <w:pPr>
-                    <w:pStyle w:val="Normal"/>
                     <w:jc w:val="center"/>
                     <w:pBdr>
                       <w:bottom w:val="none" w:sz="0" w:space="0" w:color="000000"/>
@@ -5078,6 +5768,16 @@
                     </w:pBdr>
                     <w:spacing w:after="40" w:before="40" w:line="240"/>
                     <w:ind w:left="40" w:right="40" w:firstLine="0" w:firstLineChars="0"/>
+                    <w:rPr>
+                      <w:rFonts w:ascii="Helvetica" w:hAnsi="Helvetica" w:eastAsia="Helvetica" w:cs="Helvetica"/>
+                      <w:i w:val="false"/>
+                      <w:b w:val="false"/>
+                      <w:u w:val="none"/>
+                      <w:strike w:val="false"/>
+                      <w:sz w:val="19"/>
+                      <w:szCs w:val="19"/>
+                      <w:color w:val="000000"/>
+                    </w:rPr>
                   </w:pPr>
                   <w:r xmlns:w="http://schemas.openxmlformats.org/wordprocessingml/2006/main" xmlns:wp="http://schemas.openxmlformats.org/drawingml/2006/wordprocessingDrawing" xmlns:r="http://schemas.openxmlformats.org/officeDocument/2006/relationships" xmlns:w14="http://schemas.microsoft.com/office/word/2010/wordml">
                     <w:rPr>
@@ -5085,6 +5785,7 @@
                       <w:i w:val="false"/>
                       <w:b w:val="false"/>
                       <w:u w:val="none"/>
+                      <w:strike w:val="false"/>
                       <w:sz w:val="19"/>
                       <w:szCs w:val="19"/>
                       <w:color w:val="000000"/>
@@ -5098,13 +5799,12 @@
               <w:trPr>
                 <w:trHeight w:val="431" w:hRule="auto"/>
               </w:trPr>
-              body12
               <w:tc>
                 <w:tcPr>
                   <w:vMerge/>
                   <w:tcBorders>
                     <w:bottom w:val="none" w:sz="0" w:space="0" w:color="000000"/>
-                    <w:top w:val="none" w:sz="0" w:space="0" w:color="000000"/>
+                    <w:top w:val="single" w:sz="12" w:space="0" w:color="666666"/>
                     <w:left w:val="none" w:sz="0" w:space="0" w:color="000000"/>
                     <w:right w:val="none" w:sz="0" w:space="0" w:color="000000"/>
                   </w:tcBorders>
@@ -5119,7 +5819,6 @@
                 </w:tcPr>
                 <w:p>
                   <w:pPr>
-                    <w:pStyle w:val="Normal"/>
                     <w:jc w:val="left"/>
                     <w:pBdr>
                       <w:bottom w:val="none" w:sz="0" w:space="0" w:color="000000"/>
@@ -5129,6 +5828,16 @@
                     </w:pBdr>
                     <w:spacing w:after="40" w:before="40" w:line="240"/>
                     <w:ind w:left="40" w:right="40" w:firstLine="0" w:firstLineChars="0"/>
+                    <w:rPr>
+                      <w:rFonts w:ascii="Helvetica" w:hAnsi="Helvetica" w:eastAsia="Helvetica" w:cs="Helvetica"/>
+                      <w:i w:val="false"/>
+                      <w:b w:val="false"/>
+                      <w:u w:val="none"/>
+                      <w:strike w:val="false"/>
+                      <w:sz w:val="19"/>
+                      <w:szCs w:val="19"/>
+                      <w:color w:val="000000"/>
+                    </w:rPr>
                   </w:pPr>
                 </w:p>
               </w:tc>
@@ -5151,7 +5860,6 @@
                 </w:tcPr>
                 <w:p>
                   <w:pPr>
-                    <w:pStyle w:val="Normal"/>
                     <w:jc w:val="left"/>
                     <w:pBdr>
                       <w:bottom w:val="none" w:sz="0" w:space="0" w:color="000000"/>
@@ -5161,6 +5869,16 @@
                     </w:pBdr>
                     <w:spacing w:after="40" w:before="40" w:line="240"/>
                     <w:ind w:left="40" w:right="40" w:firstLine="0" w:firstLineChars="0"/>
+                    <w:rPr>
+                      <w:rFonts w:ascii="Helvetica" w:hAnsi="Helvetica" w:eastAsia="Helvetica" w:cs="Helvetica"/>
+                      <w:i w:val="false"/>
+                      <w:b w:val="false"/>
+                      <w:u w:val="none"/>
+                      <w:strike w:val="false"/>
+                      <w:sz w:val="19"/>
+                      <w:szCs w:val="19"/>
+                      <w:color w:val="000000"/>
+                    </w:rPr>
                   </w:pPr>
                   <w:r xmlns:w="http://schemas.openxmlformats.org/wordprocessingml/2006/main" xmlns:wp="http://schemas.openxmlformats.org/drawingml/2006/wordprocessingDrawing" xmlns:r="http://schemas.openxmlformats.org/officeDocument/2006/relationships" xmlns:w14="http://schemas.microsoft.com/office/word/2010/wordml">
                     <w:rPr>
@@ -5168,6 +5886,7 @@
                       <w:i w:val="false"/>
                       <w:b w:val="false"/>
                       <w:u w:val="none"/>
+                      <w:strike w:val="false"/>
                       <w:sz w:val="19"/>
                       <w:szCs w:val="19"/>
                       <w:color w:val="000000"/>
@@ -5195,7 +5914,6 @@
                 </w:tcPr>
                 <w:p>
                   <w:pPr>
-                    <w:pStyle w:val="Normal"/>
                     <w:jc w:val="left"/>
                     <w:pBdr>
                       <w:bottom w:val="none" w:sz="0" w:space="0" w:color="000000"/>
@@ -5205,6 +5923,16 @@
                     </w:pBdr>
                     <w:spacing w:after="40" w:before="40" w:line="240"/>
                     <w:ind w:left="40" w:right="40" w:firstLine="0" w:firstLineChars="0"/>
+                    <w:rPr>
+                      <w:rFonts w:ascii="Helvetica" w:hAnsi="Helvetica" w:eastAsia="Helvetica" w:cs="Helvetica"/>
+                      <w:i w:val="false"/>
+                      <w:b w:val="false"/>
+                      <w:u w:val="none"/>
+                      <w:strike w:val="false"/>
+                      <w:sz w:val="19"/>
+                      <w:szCs w:val="19"/>
+                      <w:color w:val="000000"/>
+                    </w:rPr>
                   </w:pPr>
                   <w:r xmlns:w="http://schemas.openxmlformats.org/wordprocessingml/2006/main" xmlns:wp="http://schemas.openxmlformats.org/drawingml/2006/wordprocessingDrawing" xmlns:r="http://schemas.openxmlformats.org/officeDocument/2006/relationships" xmlns:w14="http://schemas.microsoft.com/office/word/2010/wordml">
                     <w:rPr>
@@ -5212,6 +5940,7 @@
                       <w:i w:val="false"/>
                       <w:b w:val="false"/>
                       <w:u w:val="none"/>
+                      <w:strike w:val="false"/>
                       <w:sz w:val="19"/>
                       <w:szCs w:val="19"/>
                       <w:color w:val="000000"/>
@@ -5239,7 +5968,6 @@
                 </w:tcPr>
                 <w:p>
                   <w:pPr>
-                    <w:pStyle w:val="Normal"/>
                     <w:jc w:val="center"/>
                     <w:pBdr>
                       <w:bottom w:val="none" w:sz="0" w:space="0" w:color="000000"/>
@@ -5249,6 +5977,16 @@
                     </w:pBdr>
                     <w:spacing w:after="40" w:before="40" w:line="240"/>
                     <w:ind w:left="40" w:right="40" w:firstLine="0" w:firstLineChars="0"/>
+                    <w:rPr>
+                      <w:rFonts w:ascii="Helvetica" w:hAnsi="Helvetica" w:eastAsia="Helvetica" w:cs="Helvetica"/>
+                      <w:i w:val="false"/>
+                      <w:b w:val="false"/>
+                      <w:u w:val="none"/>
+                      <w:strike w:val="false"/>
+                      <w:sz w:val="19"/>
+                      <w:szCs w:val="19"/>
+                      <w:color w:val="000000"/>
+                    </w:rPr>
                   </w:pPr>
                   <w:r xmlns:w="http://schemas.openxmlformats.org/wordprocessingml/2006/main" xmlns:wp="http://schemas.openxmlformats.org/drawingml/2006/wordprocessingDrawing" xmlns:r="http://schemas.openxmlformats.org/officeDocument/2006/relationships" xmlns:w14="http://schemas.microsoft.com/office/word/2010/wordml">
                     <w:rPr>
@@ -5256,6 +5994,7 @@
                       <w:i w:val="false"/>
                       <w:b w:val="false"/>
                       <w:u w:val="none"/>
+                      <w:strike w:val="false"/>
                       <w:sz w:val="19"/>
                       <w:szCs w:val="19"/>
                       <w:color w:val="000000"/>
@@ -5283,7 +6022,6 @@
                 </w:tcPr>
                 <w:p>
                   <w:pPr>
-                    <w:pStyle w:val="Normal"/>
                     <w:jc w:val="center"/>
                     <w:pBdr>
                       <w:bottom w:val="none" w:sz="0" w:space="0" w:color="000000"/>
@@ -5293,6 +6031,16 @@
                     </w:pBdr>
                     <w:spacing w:after="40" w:before="40" w:line="240"/>
                     <w:ind w:left="40" w:right="40" w:firstLine="0" w:firstLineChars="0"/>
+                    <w:rPr>
+                      <w:rFonts w:ascii="Helvetica" w:hAnsi="Helvetica" w:eastAsia="Helvetica" w:cs="Helvetica"/>
+                      <w:i w:val="false"/>
+                      <w:b w:val="false"/>
+                      <w:u w:val="none"/>
+                      <w:strike w:val="false"/>
+                      <w:sz w:val="19"/>
+                      <w:szCs w:val="19"/>
+                      <w:color w:val="000000"/>
+                    </w:rPr>
                   </w:pPr>
                   <w:r xmlns:w="http://schemas.openxmlformats.org/wordprocessingml/2006/main" xmlns:wp="http://schemas.openxmlformats.org/drawingml/2006/wordprocessingDrawing" xmlns:r="http://schemas.openxmlformats.org/officeDocument/2006/relationships" xmlns:w14="http://schemas.microsoft.com/office/word/2010/wordml">
                     <w:rPr>
@@ -5300,6 +6048,7 @@
                       <w:i w:val="false"/>
                       <w:b w:val="false"/>
                       <w:u w:val="none"/>
+                      <w:strike w:val="false"/>
                       <w:sz w:val="19"/>
                       <w:szCs w:val="19"/>
                       <w:color w:val="000000"/>
@@ -5327,7 +6076,6 @@
                 </w:tcPr>
                 <w:p>
                   <w:pPr>
-                    <w:pStyle w:val="Normal"/>
                     <w:jc w:val="center"/>
                     <w:pBdr>
                       <w:bottom w:val="none" w:sz="0" w:space="0" w:color="000000"/>
@@ -5337,6 +6085,16 @@
                     </w:pBdr>
                     <w:spacing w:after="40" w:before="40" w:line="240"/>
                     <w:ind w:left="40" w:right="40" w:firstLine="0" w:firstLineChars="0"/>
+                    <w:rPr>
+                      <w:rFonts w:ascii="Helvetica" w:hAnsi="Helvetica" w:eastAsia="Helvetica" w:cs="Helvetica"/>
+                      <w:i w:val="false"/>
+                      <w:b w:val="false"/>
+                      <w:u w:val="none"/>
+                      <w:strike w:val="false"/>
+                      <w:sz w:val="19"/>
+                      <w:szCs w:val="19"/>
+                      <w:color w:val="000000"/>
+                    </w:rPr>
                   </w:pPr>
                   <w:r xmlns:w="http://schemas.openxmlformats.org/wordprocessingml/2006/main" xmlns:wp="http://schemas.openxmlformats.org/drawingml/2006/wordprocessingDrawing" xmlns:r="http://schemas.openxmlformats.org/officeDocument/2006/relationships" xmlns:w14="http://schemas.microsoft.com/office/word/2010/wordml">
                     <w:rPr>
@@ -5344,6 +6102,7 @@
                       <w:i w:val="false"/>
                       <w:b w:val="false"/>
                       <w:u w:val="none"/>
+                      <w:strike w:val="false"/>
                       <w:sz w:val="19"/>
                       <w:szCs w:val="19"/>
                       <w:color w:val="000000"/>
@@ -5357,7 +6116,6 @@
               <w:trPr>
                 <w:trHeight w:val="431" w:hRule="auto"/>
               </w:trPr>
-              body13
               <w:tc>
                 <w:tcPr>
                   <w:vMerge/>
@@ -5378,7 +6136,6 @@
                 </w:tcPr>
                 <w:p>
                   <w:pPr>
-                    <w:pStyle w:val="Normal"/>
                     <w:jc w:val="left"/>
                     <w:pBdr>
                       <w:bottom w:val="none" w:sz="0" w:space="0" w:color="000000"/>
@@ -5388,6 +6145,16 @@
                     </w:pBdr>
                     <w:spacing w:after="40" w:before="40" w:line="240"/>
                     <w:ind w:left="40" w:right="40" w:firstLine="0" w:firstLineChars="0"/>
+                    <w:rPr>
+                      <w:rFonts w:ascii="Helvetica" w:hAnsi="Helvetica" w:eastAsia="Helvetica" w:cs="Helvetica"/>
+                      <w:i w:val="false"/>
+                      <w:b w:val="false"/>
+                      <w:u w:val="none"/>
+                      <w:strike w:val="false"/>
+                      <w:sz w:val="19"/>
+                      <w:szCs w:val="19"/>
+                      <w:color w:val="000000"/>
+                    </w:rPr>
                   </w:pPr>
                 </w:p>
               </w:tc>
@@ -5410,7 +6177,6 @@
                 </w:tcPr>
                 <w:p>
                   <w:pPr>
-                    <w:pStyle w:val="Normal"/>
                     <w:jc w:val="left"/>
                     <w:pBdr>
                       <w:bottom w:val="none" w:sz="0" w:space="0" w:color="000000"/>
@@ -5420,6 +6186,16 @@
                     </w:pBdr>
                     <w:spacing w:after="40" w:before="40" w:line="240"/>
                     <w:ind w:left="40" w:right="40" w:firstLine="0" w:firstLineChars="0"/>
+                    <w:rPr>
+                      <w:rFonts w:ascii="Helvetica" w:hAnsi="Helvetica" w:eastAsia="Helvetica" w:cs="Helvetica"/>
+                      <w:i w:val="false"/>
+                      <w:b w:val="false"/>
+                      <w:u w:val="none"/>
+                      <w:strike w:val="false"/>
+                      <w:sz w:val="19"/>
+                      <w:szCs w:val="19"/>
+                      <w:color w:val="000000"/>
+                    </w:rPr>
                   </w:pPr>
                   <w:r xmlns:w="http://schemas.openxmlformats.org/wordprocessingml/2006/main" xmlns:wp="http://schemas.openxmlformats.org/drawingml/2006/wordprocessingDrawing" xmlns:r="http://schemas.openxmlformats.org/officeDocument/2006/relationships" xmlns:w14="http://schemas.microsoft.com/office/word/2010/wordml">
                     <w:rPr>
@@ -5427,6 +6203,7 @@
                       <w:i w:val="false"/>
                       <w:b w:val="false"/>
                       <w:u w:val="none"/>
+                      <w:strike w:val="false"/>
                       <w:sz w:val="19"/>
                       <w:szCs w:val="19"/>
                       <w:color w:val="000000"/>
@@ -5454,7 +6231,6 @@
                 </w:tcPr>
                 <w:p>
                   <w:pPr>
-                    <w:pStyle w:val="Normal"/>
                     <w:jc w:val="left"/>
                     <w:pBdr>
                       <w:bottom w:val="none" w:sz="0" w:space="0" w:color="000000"/>
@@ -5464,6 +6240,16 @@
                     </w:pBdr>
                     <w:spacing w:after="40" w:before="40" w:line="240"/>
                     <w:ind w:left="40" w:right="40" w:firstLine="0" w:firstLineChars="0"/>
+                    <w:rPr>
+                      <w:rFonts w:ascii="Helvetica" w:hAnsi="Helvetica" w:eastAsia="Helvetica" w:cs="Helvetica"/>
+                      <w:i w:val="false"/>
+                      <w:b w:val="false"/>
+                      <w:u w:val="none"/>
+                      <w:strike w:val="false"/>
+                      <w:sz w:val="19"/>
+                      <w:szCs w:val="19"/>
+                      <w:color w:val="000000"/>
+                    </w:rPr>
                   </w:pPr>
                   <w:r xmlns:w="http://schemas.openxmlformats.org/wordprocessingml/2006/main" xmlns:wp="http://schemas.openxmlformats.org/drawingml/2006/wordprocessingDrawing" xmlns:r="http://schemas.openxmlformats.org/officeDocument/2006/relationships" xmlns:w14="http://schemas.microsoft.com/office/word/2010/wordml">
                     <w:rPr>
@@ -5471,6 +6257,7 @@
                       <w:i w:val="false"/>
                       <w:b w:val="false"/>
                       <w:u w:val="none"/>
+                      <w:strike w:val="false"/>
                       <w:sz w:val="19"/>
                       <w:szCs w:val="19"/>
                       <w:color w:val="000000"/>
@@ -5498,7 +6285,6 @@
                 </w:tcPr>
                 <w:p>
                   <w:pPr>
-                    <w:pStyle w:val="Normal"/>
                     <w:jc w:val="center"/>
                     <w:pBdr>
                       <w:bottom w:val="none" w:sz="0" w:space="0" w:color="000000"/>
@@ -5508,6 +6294,16 @@
                     </w:pBdr>
                     <w:spacing w:after="40" w:before="40" w:line="240"/>
                     <w:ind w:left="40" w:right="40" w:firstLine="0" w:firstLineChars="0"/>
+                    <w:rPr>
+                      <w:rFonts w:ascii="Helvetica" w:hAnsi="Helvetica" w:eastAsia="Helvetica" w:cs="Helvetica"/>
+                      <w:i w:val="false"/>
+                      <w:b w:val="false"/>
+                      <w:u w:val="none"/>
+                      <w:strike w:val="false"/>
+                      <w:sz w:val="19"/>
+                      <w:szCs w:val="19"/>
+                      <w:color w:val="000000"/>
+                    </w:rPr>
                   </w:pPr>
                   <w:r xmlns:w="http://schemas.openxmlformats.org/wordprocessingml/2006/main" xmlns:wp="http://schemas.openxmlformats.org/drawingml/2006/wordprocessingDrawing" xmlns:r="http://schemas.openxmlformats.org/officeDocument/2006/relationships" xmlns:w14="http://schemas.microsoft.com/office/word/2010/wordml">
                     <w:rPr>
@@ -5515,6 +6311,7 @@
                       <w:i w:val="false"/>
                       <w:b w:val="false"/>
                       <w:u w:val="none"/>
+                      <w:strike w:val="false"/>
                       <w:sz w:val="19"/>
                       <w:szCs w:val="19"/>
                       <w:color w:val="000000"/>
@@ -5542,7 +6339,6 @@
                 </w:tcPr>
                 <w:p>
                   <w:pPr>
-                    <w:pStyle w:val="Normal"/>
                     <w:jc w:val="center"/>
                     <w:pBdr>
                       <w:bottom w:val="none" w:sz="0" w:space="0" w:color="000000"/>
@@ -5552,6 +6348,16 @@
                     </w:pBdr>
                     <w:spacing w:after="40" w:before="40" w:line="240"/>
                     <w:ind w:left="40" w:right="40" w:firstLine="0" w:firstLineChars="0"/>
+                    <w:rPr>
+                      <w:rFonts w:ascii="Helvetica" w:hAnsi="Helvetica" w:eastAsia="Helvetica" w:cs="Helvetica"/>
+                      <w:i w:val="false"/>
+                      <w:b w:val="false"/>
+                      <w:u w:val="none"/>
+                      <w:strike w:val="false"/>
+                      <w:sz w:val="19"/>
+                      <w:szCs w:val="19"/>
+                      <w:color w:val="000000"/>
+                    </w:rPr>
                   </w:pPr>
                   <w:r xmlns:w="http://schemas.openxmlformats.org/wordprocessingml/2006/main" xmlns:wp="http://schemas.openxmlformats.org/drawingml/2006/wordprocessingDrawing" xmlns:r="http://schemas.openxmlformats.org/officeDocument/2006/relationships" xmlns:w14="http://schemas.microsoft.com/office/word/2010/wordml">
                     <w:rPr>
@@ -5559,6 +6365,7 @@
                       <w:i w:val="false"/>
                       <w:b w:val="false"/>
                       <w:u w:val="none"/>
+                      <w:strike w:val="false"/>
                       <w:sz w:val="19"/>
                       <w:szCs w:val="19"/>
                       <w:color w:val="000000"/>
@@ -5586,7 +6393,6 @@
                 </w:tcPr>
                 <w:p>
                   <w:pPr>
-                    <w:pStyle w:val="Normal"/>
                     <w:jc w:val="center"/>
                     <w:pBdr>
                       <w:bottom w:val="none" w:sz="0" w:space="0" w:color="000000"/>
@@ -5596,6 +6402,16 @@
                     </w:pBdr>
                     <w:spacing w:after="40" w:before="40" w:line="240"/>
                     <w:ind w:left="40" w:right="40" w:firstLine="0" w:firstLineChars="0"/>
+                    <w:rPr>
+                      <w:rFonts w:ascii="Helvetica" w:hAnsi="Helvetica" w:eastAsia="Helvetica" w:cs="Helvetica"/>
+                      <w:i w:val="false"/>
+                      <w:b w:val="false"/>
+                      <w:u w:val="none"/>
+                      <w:strike w:val="false"/>
+                      <w:sz w:val="19"/>
+                      <w:szCs w:val="19"/>
+                      <w:color w:val="000000"/>
+                    </w:rPr>
                   </w:pPr>
                   <w:r xmlns:w="http://schemas.openxmlformats.org/wordprocessingml/2006/main" xmlns:wp="http://schemas.openxmlformats.org/drawingml/2006/wordprocessingDrawing" xmlns:r="http://schemas.openxmlformats.org/officeDocument/2006/relationships" xmlns:w14="http://schemas.microsoft.com/office/word/2010/wordml">
                     <w:rPr>
@@ -5603,6 +6419,7 @@
                       <w:i w:val="false"/>
                       <w:b w:val="false"/>
                       <w:u w:val="none"/>
+                      <w:strike w:val="false"/>
                       <w:sz w:val="19"/>
                       <w:szCs w:val="19"/>
                       <w:color w:val="000000"/>
@@ -5616,7 +6433,6 @@
               <w:trPr>
                 <w:trHeight w:val="431" w:hRule="auto"/>
               </w:trPr>
-              body14
               <w:tc>
                 <w:tcPr>
                   <w:vMerge/>
@@ -5637,7 +6453,6 @@
                 </w:tcPr>
                 <w:p>
                   <w:pPr>
-                    <w:pStyle w:val="Normal"/>
                     <w:jc w:val="left"/>
                     <w:pBdr>
                       <w:bottom w:val="none" w:sz="0" w:space="0" w:color="000000"/>
@@ -5647,6 +6462,16 @@
                     </w:pBdr>
                     <w:spacing w:after="40" w:before="40" w:line="240"/>
                     <w:ind w:left="40" w:right="40" w:firstLine="0" w:firstLineChars="0"/>
+                    <w:rPr>
+                      <w:rFonts w:ascii="Helvetica" w:hAnsi="Helvetica" w:eastAsia="Helvetica" w:cs="Helvetica"/>
+                      <w:i w:val="false"/>
+                      <w:b w:val="false"/>
+                      <w:u w:val="none"/>
+                      <w:strike w:val="false"/>
+                      <w:sz w:val="19"/>
+                      <w:szCs w:val="19"/>
+                      <w:color w:val="000000"/>
+                    </w:rPr>
                   </w:pPr>
                 </w:p>
               </w:tc>
@@ -5669,7 +6494,6 @@
                 </w:tcPr>
                 <w:p>
                   <w:pPr>
-                    <w:pStyle w:val="Normal"/>
                     <w:jc w:val="left"/>
                     <w:pBdr>
                       <w:bottom w:val="none" w:sz="0" w:space="0" w:color="000000"/>
@@ -5679,6 +6503,16 @@
                     </w:pBdr>
                     <w:spacing w:after="40" w:before="40" w:line="240"/>
                     <w:ind w:left="40" w:right="40" w:firstLine="0" w:firstLineChars="0"/>
+                    <w:rPr>
+                      <w:rFonts w:ascii="Helvetica" w:hAnsi="Helvetica" w:eastAsia="Helvetica" w:cs="Helvetica"/>
+                      <w:i w:val="false"/>
+                      <w:b w:val="false"/>
+                      <w:u w:val="none"/>
+                      <w:strike w:val="false"/>
+                      <w:sz w:val="19"/>
+                      <w:szCs w:val="19"/>
+                      <w:color w:val="000000"/>
+                    </w:rPr>
                   </w:pPr>
                   <w:r xmlns:w="http://schemas.openxmlformats.org/wordprocessingml/2006/main" xmlns:wp="http://schemas.openxmlformats.org/drawingml/2006/wordprocessingDrawing" xmlns:r="http://schemas.openxmlformats.org/officeDocument/2006/relationships" xmlns:w14="http://schemas.microsoft.com/office/word/2010/wordml">
                     <w:rPr>
@@ -5686,6 +6520,7 @@
                       <w:i w:val="false"/>
                       <w:b w:val="false"/>
                       <w:u w:val="none"/>
+                      <w:strike w:val="false"/>
                       <w:sz w:val="19"/>
                       <w:szCs w:val="19"/>
                       <w:color w:val="000000"/>
@@ -5713,7 +6548,6 @@
                 </w:tcPr>
                 <w:p>
                   <w:pPr>
-                    <w:pStyle w:val="Normal"/>
                     <w:jc w:val="left"/>
                     <w:pBdr>
                       <w:bottom w:val="none" w:sz="0" w:space="0" w:color="000000"/>
@@ -5723,6 +6557,16 @@
                     </w:pBdr>
                     <w:spacing w:after="40" w:before="40" w:line="240"/>
                     <w:ind w:left="40" w:right="40" w:firstLine="0" w:firstLineChars="0"/>
+                    <w:rPr>
+                      <w:rFonts w:ascii="Helvetica" w:hAnsi="Helvetica" w:eastAsia="Helvetica" w:cs="Helvetica"/>
+                      <w:i w:val="false"/>
+                      <w:b w:val="false"/>
+                      <w:u w:val="none"/>
+                      <w:strike w:val="false"/>
+                      <w:sz w:val="19"/>
+                      <w:szCs w:val="19"/>
+                      <w:color w:val="000000"/>
+                    </w:rPr>
                   </w:pPr>
                   <w:r xmlns:w="http://schemas.openxmlformats.org/wordprocessingml/2006/main" xmlns:wp="http://schemas.openxmlformats.org/drawingml/2006/wordprocessingDrawing" xmlns:r="http://schemas.openxmlformats.org/officeDocument/2006/relationships" xmlns:w14="http://schemas.microsoft.com/office/word/2010/wordml">
                     <w:rPr>
@@ -5730,6 +6574,7 @@
                       <w:i w:val="false"/>
                       <w:b w:val="false"/>
                       <w:u w:val="none"/>
+                      <w:strike w:val="false"/>
                       <w:sz w:val="19"/>
                       <w:szCs w:val="19"/>
                       <w:color w:val="000000"/>
@@ -5757,7 +6602,6 @@
                 </w:tcPr>
                 <w:p>
                   <w:pPr>
-                    <w:pStyle w:val="Normal"/>
                     <w:jc w:val="center"/>
                     <w:pBdr>
                       <w:bottom w:val="none" w:sz="0" w:space="0" w:color="000000"/>
@@ -5767,6 +6611,16 @@
                     </w:pBdr>
                     <w:spacing w:after="40" w:before="40" w:line="240"/>
                     <w:ind w:left="40" w:right="40" w:firstLine="0" w:firstLineChars="0"/>
+                    <w:rPr>
+                      <w:rFonts w:ascii="Helvetica" w:hAnsi="Helvetica" w:eastAsia="Helvetica" w:cs="Helvetica"/>
+                      <w:i w:val="false"/>
+                      <w:b w:val="false"/>
+                      <w:u w:val="none"/>
+                      <w:strike w:val="false"/>
+                      <w:sz w:val="19"/>
+                      <w:szCs w:val="19"/>
+                      <w:color w:val="000000"/>
+                    </w:rPr>
                   </w:pPr>
                   <w:r xmlns:w="http://schemas.openxmlformats.org/wordprocessingml/2006/main" xmlns:wp="http://schemas.openxmlformats.org/drawingml/2006/wordprocessingDrawing" xmlns:r="http://schemas.openxmlformats.org/officeDocument/2006/relationships" xmlns:w14="http://schemas.microsoft.com/office/word/2010/wordml">
                     <w:rPr>
@@ -5774,6 +6628,7 @@
                       <w:i w:val="false"/>
                       <w:b w:val="false"/>
                       <w:u w:val="none"/>
+                      <w:strike w:val="false"/>
                       <w:sz w:val="19"/>
                       <w:szCs w:val="19"/>
                       <w:color w:val="000000"/>
@@ -5801,7 +6656,6 @@
                 </w:tcPr>
                 <w:p>
                   <w:pPr>
-                    <w:pStyle w:val="Normal"/>
                     <w:jc w:val="center"/>
                     <w:pBdr>
                       <w:bottom w:val="none" w:sz="0" w:space="0" w:color="000000"/>
@@ -5811,6 +6665,16 @@
                     </w:pBdr>
                     <w:spacing w:after="40" w:before="40" w:line="240"/>
                     <w:ind w:left="40" w:right="40" w:firstLine="0" w:firstLineChars="0"/>
+                    <w:rPr>
+                      <w:rFonts w:ascii="Helvetica" w:hAnsi="Helvetica" w:eastAsia="Helvetica" w:cs="Helvetica"/>
+                      <w:i w:val="false"/>
+                      <w:b w:val="false"/>
+                      <w:u w:val="none"/>
+                      <w:strike w:val="false"/>
+                      <w:sz w:val="19"/>
+                      <w:szCs w:val="19"/>
+                      <w:color w:val="000000"/>
+                    </w:rPr>
                   </w:pPr>
                   <w:r xmlns:w="http://schemas.openxmlformats.org/wordprocessingml/2006/main" xmlns:wp="http://schemas.openxmlformats.org/drawingml/2006/wordprocessingDrawing" xmlns:r="http://schemas.openxmlformats.org/officeDocument/2006/relationships" xmlns:w14="http://schemas.microsoft.com/office/word/2010/wordml">
                     <w:rPr>
@@ -5818,6 +6682,7 @@
                       <w:i w:val="false"/>
                       <w:b w:val="false"/>
                       <w:u w:val="none"/>
+                      <w:strike w:val="false"/>
                       <w:sz w:val="19"/>
                       <w:szCs w:val="19"/>
                       <w:color w:val="000000"/>
@@ -5845,7 +6710,6 @@
                 </w:tcPr>
                 <w:p>
                   <w:pPr>
-                    <w:pStyle w:val="Normal"/>
                     <w:jc w:val="center"/>
                     <w:pBdr>
                       <w:bottom w:val="none" w:sz="0" w:space="0" w:color="000000"/>
@@ -5855,6 +6719,16 @@
                     </w:pBdr>
                     <w:spacing w:after="40" w:before="40" w:line="240"/>
                     <w:ind w:left="40" w:right="40" w:firstLine="0" w:firstLineChars="0"/>
+                    <w:rPr>
+                      <w:rFonts w:ascii="Helvetica" w:hAnsi="Helvetica" w:eastAsia="Helvetica" w:cs="Helvetica"/>
+                      <w:i w:val="false"/>
+                      <w:b w:val="false"/>
+                      <w:u w:val="none"/>
+                      <w:strike w:val="false"/>
+                      <w:sz w:val="19"/>
+                      <w:szCs w:val="19"/>
+                      <w:color w:val="000000"/>
+                    </w:rPr>
                   </w:pPr>
                   <w:r xmlns:w="http://schemas.openxmlformats.org/wordprocessingml/2006/main" xmlns:wp="http://schemas.openxmlformats.org/drawingml/2006/wordprocessingDrawing" xmlns:r="http://schemas.openxmlformats.org/officeDocument/2006/relationships" xmlns:w14="http://schemas.microsoft.com/office/word/2010/wordml">
                     <w:rPr>
@@ -5862,6 +6736,7 @@
                       <w:i w:val="false"/>
                       <w:b w:val="false"/>
                       <w:u w:val="none"/>
+                      <w:strike w:val="false"/>
                       <w:sz w:val="19"/>
                       <w:szCs w:val="19"/>
                       <w:color w:val="000000"/>

</xml_diff>

<commit_message>
More tweaks and response to reviewers document comnpleted.
</commit_message>
<xml_diff>
--- a/2025_earwig_fecundity_Evolutionary_Ecology.docx
+++ b/2025_earwig_fecundity_Evolutionary_Ecology.docx
@@ -104,7 +104,7 @@
         <w:t xml:space="preserve"> </w:t>
       </w:r>
       <w:r>
-        <w:t xml:space="preserve">species complex). The initial clutch was removed at collection; females consequently did not provide the maternal egg care that normally follows oviposition. Females produced fewer eggs with smaller mean perimeters in replacement clutches. After accounting for this average shift and for structural size, a Bayesian bivariate model estimated negative within-female covariance between egg number and perimeter. Among females, egg number was unrelated to perimeter in initial clutches but negatively related to perimeter in replacement clutches. The negative replacement-clutch relationship persisted after removing a conspicuous observation, removing that female entirely, and using a robust Student-</w:t>
+        <w:t xml:space="preserve">species complex). I removed the initial clutch at collection; females consequently did not provide the maternal egg care that normally follows oviposition. Females produced fewer eggs with smaller mean perimeters in replacement clutches. After accounting for this average shift and for structural size, a Bayesian bivariate model estimated negative within-female covariance between egg number and perimeter. Among females, egg number was unrelated to perimeter in initial clutches but negatively related to perimeter in replacement clutches. The negative replacement-clutch relationship persisted after removing a conspicuous observation, removing that female entirely, and using a robust Student-</w:t>
       </w:r>
       <w:r>
         <w:rPr>
@@ -176,10 +176,19 @@
         <w:t xml:space="preserve"> </w:t>
       </w:r>
       <w:r>
-        <w:t xml:space="preserve">(Van Noordwijk and Jong 1986; Houle 1991; Careau and Wilson 2017)</w:t>
-      </w:r>
-      <w:r>
-        <w:t xml:space="preserve">. When variation in acquisition is large, well-resourced females may produce both more and larger offspring, masking a negative allocation relationship even after a proxy such as structural size is included: body size cannot capture every difference in current reserves, feeding history, or physiological state. Repeated measurements address a different part of this problem by separating two hierarchical levels. Among-female covariance asks whether females that generally produce more eggs also generally produce larger or smaller eggs. Within-female covariance asks whether a given female’s departure from her expected egg number is associated with a corresponding departure in egg dimensions, after accounting for systematic differences between reproductive events and persistent differences among females</w:t>
+        <w:t xml:space="preserve">(Van Noordwijk and de Jong 1986; Houle 1991; Careau and Wilson 2017)</w:t>
+      </w:r>
+      <w:r>
+        <w:t xml:space="preserve">. When variation in acquisition is large, well-resourced females may produce both more and larger offspring, masking a negative allocation relationship. I therefore control for structural size, because female body size is a major determinant of potential fecundity in insects</w:t>
+      </w:r>
+      <w:r>
+        <w:t xml:space="preserve"> </w:t>
+      </w:r>
+      <w:r>
+        <w:t xml:space="preserve">(Honek 1993)</w:t>
+      </w:r>
+      <w:r>
+        <w:t xml:space="preserve">. This adjustment is not a measure of female condition: a mass-based condition index would need to be interpreted relative to structural size, and structural size alone cannot capture current reserves, feeding history, or physiological state. Repeated measurements address a different part of this problem by separating two hierarchical levels. Among-female covariance asks whether females that generally produce more eggs also generally produce larger or smaller eggs. Within-female covariance asks whether a given female’s departure from her expected egg number is associated with a corresponding departure in egg dimensions, after accounting for systematic differences between reproductive events and persistent differences among females</w:t>
       </w:r>
       <w:r>
         <w:t xml:space="preserve"> </w:t>
@@ -295,7 +304,7 @@
         <w:t xml:space="preserve">(González-Miguéns et al. 2020)</w:t>
       </w:r>
       <w:r>
-        <w:t xml:space="preserve">. Because individuals were not assigned to lineage molecularly, I refer to the study population as the</w:t>
+        <w:t xml:space="preserve">. Because I did not assign individuals to lineage molecularly, I refer to the study population as the</w:t>
       </w:r>
       <w:r>
         <w:t xml:space="preserve"> </w:t>
@@ -311,7 +320,7 @@
         <w:t xml:space="preserve"> </w:t>
       </w:r>
       <w:r>
-        <w:t xml:space="preserve">species complex throughout, and taxonomic uncertainty limits comparisons with genetically characterized populations. Females were brought to the laboratory, assigned unique identification codes, and housed individually in 90-mm Petri dishes containing a thin layer of moist sand. Each female received a cotton-plugged water vial and TetraMin Tropical fish flakes</w:t>
+        <w:t xml:space="preserve">species complex throughout, and taxonomic uncertainty limits comparisons with genetically characterized populations. I brought females to the laboratory, assigned unique identification codes, and housed them individually in 90-mm Petri dishes containing a thin layer of moist sand. Each female received a cotton-plugged water vial and TetraMin Tropical fish flakes</w:t>
       </w:r>
       <w:r>
         <w:t xml:space="preserve"> </w:t>
@@ -324,7 +333,7 @@
         <w:t xml:space="preserve">ad libitum</w:t>
       </w:r>
       <w:r>
-        <w:t xml:space="preserve">. Females were maintained at 10 °C in constant darkness. Of the 351 females, 238 laid an initial clutch. I haphazardly selected 55 females, without reference to clutch size or egg dimensions, for attempted replacement oviposition; this was a logistical subsample rather than a random sample of all initial-clutch layers. Nine were excluded because they laid eggs the day after transfer, indicating that they were still completing their initial clutch when treatment began. One female escaped after producing a replacement clutch and lacked a pronotum measurement. The final analysis therefore comprised 45 females with complete egg and structural-size data for both reproductive events.</w:t>
+        <w:t xml:space="preserve">. Females were maintained at 10 °C in constant darkness. Of the 351 females, 238 laid an initial clutch. I haphazardly selected 55 of these females for attempted replacement oviposition. I excluded nine because eggs found the day after transfer showed that they had not finished laying their initial clutch when the treatment began. One female escaped after replacement oviposition and could not be measured for pronotum length. The final analysis therefore comprised 45 females with complete egg and structural-size data for both reproductive events.</w:t>
       </w:r>
     </w:p>
     <w:p>
@@ -332,7 +341,7 @@
         <w:pStyle w:val="BodyText"/>
       </w:pPr>
       <w:r>
-        <w:t xml:space="preserve">Females were checked for oviposition twice daily, between 08:00–09:00 and 16:30–17:00. When eggs were found during the morning check, they were photographed that morning. For 12 females in the wider study, eggs were first found during the afternoon check but could not be photographed before I had to leave campus; these unphotographed clutches did not contribute egg measurements. Thus, inclusion reflected discovery and photography logistics rather than a biologically motivated 12-h threshold or evidence that egg dimensions change rapidly after oviposition. For photographed clutches, I recorded the date, removed all recovered eggs from the sand, and placed them on filter paper in a new Petri dish. Eggs were photographed at 0.68× magnification under a Leica S6D stereomicroscope using Enersight software, which added a scale bar, and were then discarded. Removal meant that females did not perform the maternal egg-care phase that would normally follow oviposition. Hatching success, developmental time, embryo viability, and the occurrence of trophic eggs were not measured.</w:t>
+        <w:t xml:space="preserve">I checked females for oviposition twice daily, between 08:00–09:00 and 16:30–17:00. When eggs were present, I recorded the date, removed all recovered eggs from the sand, placed them on filter paper in a new Petri dish, and photographed them at 0.68× magnification under a Leica S6D stereomicroscope using Enersight software, which added a scale bar. I then discarded the eggs. After collection of their initial clutch, females selected for the experiment were transferred to the replacement-oviposition conditions described below. Because the eggs were removed, females did not perform the maternal egg-care phase that would normally follow oviposition. Hatching success, developmental time, embryo viability, and the occurrence of trophic eggs were not measured.</w:t>
       </w:r>
     </w:p>
     <w:p>
@@ -340,7 +349,7 @@
         <w:pStyle w:val="BodyText"/>
       </w:pPr>
       <w:r>
-        <w:t xml:space="preserve">To induce replacement oviposition after removal of the initial clutch, females were transferred to 23 °C under a 12 h light:12 h dark cycle. Each dish contained water, fish flakes, and a shelter constructed from four 4-cm straws. After two weeks, each female was paired with a haphazardly selected stock male for one week and then with a second stock male for another week. Stock males were drawn from a pool of 20 adults collected from the same Parc Outremont population and maintained communally with</w:t>
+        <w:t xml:space="preserve">To induce replacement oviposition after removal of the initial clutch, I transferred females to 23 °C under a 12 h light:12 h dark cycle. Each dish contained water, fish flakes, and a shelter constructed from four 4-cm straws. After two weeks, I paired each female with a haphazardly selected stock male for one week and then with a second stock male for another week. I drew stock males from a pool of 20 adults collected from the same Parc Outremont population and maintained communally with</w:t>
       </w:r>
       <w:r>
         <w:t xml:space="preserve"> </w:t>
@@ -356,7 +365,7 @@
         <w:t xml:space="preserve"> </w:t>
       </w:r>
       <w:r>
-        <w:t xml:space="preserve">food and water at 23 °C; individual males could therefore have been assigned to more than one female. The sequential exposure supplied females with access to sperm before replacement oviposition, but mating events were not recorded and the design did not test whether remating was necessary. Females were subsequently returned to 10 °C and constant darkness until they oviposited again, approximately one month after the initial clutch. The 10 °C setting reproduced the conditions used for initial oviposition in this Montréal sample, rather than representing the temperature generally used to induce additional clutches in European populations. Replacement-clutch eggs were collected and photographed using the same procedure. Females were euthanised by freezing after replacement oviposition, and their pronota were photographed to obtain an index of adult structural size.</w:t>
+        <w:t xml:space="preserve">food and water at 23 °C; I could therefore have assigned individual males to more than one female. The sequential exposure supplied females with access to sperm before replacement oviposition, but I did not record mating events and the design did not test whether remating was necessary. I subsequently returned females to 10 °C and constant darkness until they oviposited again, approximately one month after the initial clutch. The 10 °C setting reproduced the conditions I used for initial oviposition in this Montréal sample, rather than representing the temperature generally used to induce additional clutches in European populations. I collected and photographed replacement-clutch eggs using the same procedure. I euthanised females by freezing after replacement oviposition, and photographed their pronota to obtain an index of adult structural size.</w:t>
       </w:r>
     </w:p>
     <w:p>
@@ -399,7 +408,7 @@
         <w:t xml:space="preserve"> </w:t>
       </w:r>
       <w:r>
-        <w:t xml:space="preserve">= 0.93, 95% CI [0.926, 0.937]). I therefore averaged the three perimeter estimates for each egg and then calculated mean egg perimeter for each female and event. Egg number was counted from the photographed eggs. Perimeter was selected because egg outlines and scale bars were available consistently across the image archive and repeated tracing quantified measurement reliability; egg mass was unavailable after eggs had been photographed and discarded. Perimeter captures two-dimensional egg dimensions but not mass, volume, composition, or energetic content. Throughout,</w:t>
+        <w:t xml:space="preserve">= 0.93, 95% CI [0.926, 0.937]). I therefore averaged the three perimeter estimates for each egg and then calculated mean egg perimeter for each female and event. I counted egg number from the photographed eggs. I selected perimeter because egg outlines and scale bars were available consistently across the image archive and repeated tracing quantified measurement reliability; I could not measure egg mass after I had photographed and discarded the eggs. Perimeter captures two-dimensional egg dimensions but not mass, volume, composition, or energetic content. Throughout,</w:t>
       </w:r>
       <w:r>
         <w:t xml:space="preserve"> </w:t>
@@ -419,7 +428,7 @@
         <w:pStyle w:val="BodyText"/>
       </w:pPr>
       <w:r>
-        <w:t xml:space="preserve">I also measured each female’s pronotum length three times to the nearest 0.001 mm, with measurements made in separate sessions, and estimated repeatability using female identity as the grouping factor. Pronotum measurements were highly repeatable (</w:t>
+        <w:t xml:space="preserve">I also measured each female’s pronotum length three times to the nearest 0.001 mm, making measurements in separate sessions, and estimated repeatability using female identity as the grouping factor. Pronotum measurements were highly repeatable (</w:t>
       </w:r>
       <w:r>
         <w:rPr>
@@ -432,7 +441,16 @@
         <w:t xml:space="preserve"> </w:t>
       </w:r>
       <w:r>
-        <w:t xml:space="preserve">= 0.98, 95% CI [0.97, 0.99]), so I used the mean value as an index of adult structural size. Pronotum length was preferred to body mass because adult earwigs do not molt and pronotum dimensions were therefore fixed before collection and could not be altered by the intervening reproductive or laboratory conditions</w:t>
+        <w:t xml:space="preserve">= 0.98, 95% CI [0.97, 0.99]), so I used the mean value as an index of adult structural size. I included structural size because it is an important determinant of female fecundity in insects</w:t>
+      </w:r>
+      <w:r>
+        <w:t xml:space="preserve"> </w:t>
+      </w:r>
+      <w:r>
+        <w:t xml:space="preserve">(Honek 1993)</w:t>
+      </w:r>
+      <w:r>
+        <w:t xml:space="preserve">. I preferred pronotum length to body mass because adult earwigs do not molt and pronotum dimensions were therefore fixed before collection and could not be altered by the intervening reproductive or laboratory conditions</w:t>
       </w:r>
       <w:r>
         <w:t xml:space="preserve"> </w:t>
@@ -441,7 +459,7 @@
         <w:t xml:space="preserve">(Meunier 2024)</w:t>
       </w:r>
       <w:r>
-        <w:t xml:space="preserve">.</w:t>
+        <w:t xml:space="preserve">. Pronotum length was included to control size-related variation in fecundity, not as a measure of female condition.</w:t>
       </w:r>
     </w:p>
     <w:bookmarkStart w:id="23" w:name="statistical-analysis"/>
@@ -490,7 +508,7 @@
         <w:t xml:space="preserve"> </w:t>
       </w:r>
       <w:r>
-        <w:t xml:space="preserve">backend. Egg number and mean egg perimeter were log-transformed for the primary covariance analyses because proportional differences are biologically relevant and egg number was right-skewed. Both transformed traits were standardized to means of zero and standard deviations of one. Pronotum length was also log-transformed and standardized. Because structural body size could influence both egg number and egg dimensions, standardized log pronotum length was included as an additive covariate in the primary models. The reproductive-event term contrasts initial with replacement clutches. It simultaneously includes experimental clutch loss, absence of maternal care after the initial clutch, temperature and photoperiod changes, time in a common feeding environment, advancing age, access to new males, and the physiological consequences of prior oviposition. It is therefore a contextual contrast, not the causal effect of natural clutch order or any single treatment component.</w:t>
+        <w:t xml:space="preserve">backend. Egg number and mean egg perimeter were log-transformed for the primary covariance analyses because proportional differences are biologically relevant and egg number was right-skewed. Both transformed traits were standardized to means of zero and standard deviations of one. Pronotum length was also log-transformed and standardized. Because structural body size could influence both egg number and egg dimensions, standardized log pronotum length was included as an additive covariate in the primary models. This covariate controlled size-related variation in fecundity and egg dimensions; it was not intended to measure female condition. The reproductive-event term contrasts initial with replacement clutches. It simultaneously includes experimental clutch loss, absence of maternal care after the initial clutch, temperature and photoperiod changes, time in a common feeding environment, advancing age, access to new males, and the physiological consequences of prior oviposition. It is therefore a contextual contrast, not the causal effect of natural clutch order or any single treatment component.</w:t>
       </w:r>
     </w:p>
     <w:p>
@@ -506,7 +524,7 @@
         <w:pStyle w:val="BodyText"/>
       </w:pPr>
       <w:r>
-        <w:t xml:space="preserve">The primary hierarchical analysis was a Bayesian bivariate Gaussian mixed model. Standardized log egg number and standardized log mean egg perimeter were fitted jointly as response variables. Reproductive event and standardized log pronotum length were included as fixed effects in each submodel, and female identity was included as a correlated random intercept across responses. The correlation between female intercepts estimated persistent among-female covariance across events conditional on structural body size. The residual correlation estimated average within-female covariance after accounting for the event shift, structural body size, and persistent female differences. This residual correlation is a jointly estimated model parameter rather than a directly observed change score, and one correlation was estimated across both contexts.</w:t>
+        <w:t xml:space="preserve">I conducted a Bayesian bivariate Gaussian mixed model as the primary hierarchical analysis. I fitted standardized log egg number and standardized log mean egg perimeter jointly as response variables. I included reproductive event and standardized log pronotum length as fixed effects in each submodel, and female identity as a correlated random intercept across responses. The correlation between female intercepts estimated persistent among-female covariance across events conditional on structural body size. The residual correlation estimated average within-female covariance after accounting for the event shift, structural body size, and persistent female differences. This residual correlation is a jointly estimated model parameter rather than a directly observed change score, and I estimated one correlation across both contexts.</w:t>
       </w:r>
     </w:p>
     <w:p>
@@ -514,7 +532,7 @@
         <w:pStyle w:val="BodyText"/>
       </w:pPr>
       <w:r>
-        <w:t xml:space="preserve">I next tested whether the size-adjusted among-female relationship differed between reproductive events. Standardized log mean egg perimeter was predicted by event, standardized log egg number, their interaction, and standardized log pronotum length, with female identity included as a random intercept. Log egg number was standardized once using its pooled mean and standard deviation, so the predictor had the same scale in both events and the interaction directly compared event-specific slopes. Each slope therefore describes an among-female association within one reproductive context. As a scaling sensitivity analysis, I refitted the model after standardizing log egg number separately within each event.</w:t>
+        <w:t xml:space="preserve">I tested whether the size-adjusted among-female relationship differed between reproductive events. I modeled standardized log mean egg perimeter as predicted by event, standardized log egg number, their interaction, and standardized log pronotum length, with female identity included as a random intercept. I standardized log egg number once using its pooled mean and standard deviation, so the predictor had the same scale in both events and the interaction directly compared event-specific slopes. Each slope therefore describes an among-female association within one reproductive context. As a scaling sensitivity analysis, I refitted the model after standardizing log egg number separately within each event.</w:t>
       </w:r>
     </w:p>
     <w:p>
@@ -522,7 +540,7 @@
         <w:pStyle w:val="BodyText"/>
       </w:pPr>
       <w:r>
-        <w:t xml:space="preserve">Following a reviewer’s concern about the conspicuous replacement-clutch observation with 10 eggs and a mean perimeter greater than 4 mm, I calculated leverage and Cook’s distance from the corresponding ordinary regression as screening diagnostics. Because the female was the repeated-measures unit, I then refitted the Bayesian model after excluding only that observation and, separately, after excluding the entire female. Finally, posterior predictive checks indicated that a heavy-tailed response distribution could be useful, so I refitted the full-data model with a Student-</w:t>
+        <w:t xml:space="preserve">Following a reviewer’s concern about the conspicuous replacement-clutch observation with 10 eggs and a mean perimeter greater than 4 mm, I calculated leverage and Cook’s distance from the corresponding ordinary regression as screening diagnostics. Because the female was the repeated-measures unit, I refitted the Bayesian model after excluding only that observation and, separately, after excluding the entire female. Finally, posterior predictive checks indicated that a heavy-tailed response distribution could be useful, so I refitted the full-data model with a Student-</w:t>
       </w:r>
       <w:r>
         <w:rPr>
@@ -554,7 +572,7 @@
         <w:pStyle w:val="BodyText"/>
       </w:pPr>
       <w:r>
-        <w:t xml:space="preserve">To express the replacement-clutch relationship in original units, I used posterior predictions from the primary model for an average-sized female producing either 20 or 40 eggs. These round, representative values span a substantial portion of the observed replacement-clutch distribution and both lie within its observed range. Predictions were back-transformed from standardized log egg perimeter to millimetres.</w:t>
+        <w:t xml:space="preserve">To express the replacement-clutch relationship in original units, I used posterior predictions from the primary model for an average-sized female producing either 20 or 40 eggs. These round, representative values span a substantial portion of the observed replacement-clutch distribution and both lie within its observed range. I back-transformed predictions from standardized log egg perimeter to millimetres.</w:t>
       </w:r>
     </w:p>
     <w:p>
@@ -568,10 +586,10 @@
         <w:t xml:space="preserve"> </w:t>
       </w:r>
       <w:r>
-        <w:t xml:space="preserve">(Pol and Wright 2009)</w:t>
-      </w:r>
-      <w:r>
-        <w:t xml:space="preserve">. Separate models used egg number and mean egg perimeter on their original scales or after log-transforming both traits, representing absolute and proportional differences, respectively. Standardized log pronotum length conditioned the between-female slope on structural size; the within-female slope is unaffected because pronotum does not vary within females. Second, because each female contributed exactly two observations, I calculated changes from the initial to the replacement clutch and regressed the change in egg perimeter on the change in egg number on both absolute and log scales. A negative slope indicates that females showing a relatively larger increase, or smaller decline, in egg number tended to show a relatively greater decline in egg perimeter. Pronotum length was omitted because differencing removes stable female characteristics by construction.</w:t>
+        <w:t xml:space="preserve">(van de Pol and Wright 2009)</w:t>
+      </w:r>
+      <w:r>
+        <w:t xml:space="preserve">. I used separate models with egg number and mean egg perimeter on their original scales or after log-transforming both traits, representing absolute and proportional differences, respectively. Standardized log pronotum length conditioned the between-female slope on structural size; the within-female slope is unaffected because pronotum does not vary within females. Second, because each female contributed exactly two observations, I calculated changes from the initial to the replacement clutch and regressed the change in egg perimeter on the change in egg number on both absolute and log scales. A negative slope indicates that females showing a relatively larger increase, or smaller decline, in egg number tended to show a relatively greater decline in egg perimeter. I omitted pronotum length because differencing removes stable female characteristics by construction.</w:t>
       </w:r>
     </w:p>
     <w:p>
@@ -579,7 +597,7 @@
         <w:pStyle w:val="BodyText"/>
       </w:pPr>
       <w:r>
-        <w:t xml:space="preserve">Regression coefficients in the bivariate model were assigned Normal(0, 1) priors and those in the univariate models were assigned Normal(0, 0.7) priors. Intercepts were assigned Normal(0, 1) priors, standard deviations Student-</w:t>
+        <w:t xml:space="preserve">I assigned regression coefficients in the bivariate model Normal(0, 1) priors and those in the univariate models Normal(0, 0.7) priors. I assigned intercepts Normal(0, 1) priors, standard deviations Student-</w:t>
       </w:r>
       <w:r>
         <w:rPr>
@@ -589,7 +607,7 @@
         <w:t xml:space="preserve">t</w:t>
       </w:r>
       <w:r>
-        <w:t xml:space="preserve">(3, 0, 1) priors, and correlation matrices LKJ(2) priors. The bivariate model was run using four chains of 6,000 iterations, including 2,000 warm-up iterations. Each univariate model was run using four chains of 5,000 iterations, including 1,500 warm-up iterations. All models used</w:t>
+        <w:t xml:space="preserve">(3, 0, 1) priors, and correlation matrices LKJ(2) priors. I ran the bivariate model using four chains of 6,000 iterations, including 2,000 warm-up iterations. I ran each univariate model using four chains of 5,000 iterations, including 1,500 warm-up iterations. All models used</w:t>
       </w:r>
       <w:r>
         <w:t xml:space="preserve"> </w:t>
@@ -619,7 +637,7 @@
         <w:t xml:space="preserve"> </w:t>
       </w:r>
       <w:r>
-        <w:t xml:space="preserve">sets a conservative target acceptance probability that can reduce divergent transitions, while maximum tree depth limits the length of each sampling trajectory and flags inefficient exploration. Convergence and sampling quality were evaluated using trace plots, effective sample sizes,</w:t>
+        <w:t xml:space="preserve">sets a conservative target acceptance probability that can reduce divergent transitions, while maximum tree depth limits the length of each sampling trajectory and flags inefficient exploration. I evaluated convergence and sampling quality using trace plots, effective sample sizes,</w:t>
       </w:r>
       <w:r>
         <w:t xml:space="preserve"> </w:t>
@@ -637,7 +655,7 @@
         </m:acc>
       </m:oMath>
       <w:r>
-        <w:t xml:space="preserve">, divergent-transition counts, and maximum-tree-depth diagnostics. Model adequacy was evaluated using posterior predictive checks. Estimates are posterior medians and equal-tailed 95% credible intervals (CrI); for focal directional relationships, I also report the posterior probability that the parameter was negative.</w:t>
+        <w:t xml:space="preserve">, divergent-transition counts, and maximum-tree-depth diagnostics. I evaluated model adequacy using posterior predictive checks. Estimates are posterior medians and equal-tailed 95% credible intervals (CrI); for focal directional relationships, I also report the posterior probability that the parameter was negative.</w:t>
       </w:r>
     </w:p>
     <w:bookmarkEnd w:id="23"/>
@@ -687,7 +705,7 @@
         <w:pStyle w:val="FirstParagraph"/>
       </w:pPr>
       <w:r>
-        <w:t xml:space="preserve">All estimates from the primary bivariate and event-specific models were adjusted for standardized log pronotum length. Initial clutches contained 51.64 ± 2.53 eggs (mean ± SE), whereas replacement clutches contained 34.60 ± 2.50 eggs. Mean egg perimeter declined from 3.55 ± 0.03 mm in initial clutches to 3.41 ± 0.03 mm in replacement clutches. In the bivariate model, standardized log egg number was lower in replacement clutches (</w:t>
+        <w:t xml:space="preserve">I adjusted all estimates from the primary bivariate and event-specific models for standardized log pronotum length. Initial clutches contained 51.64 ± 2.53 eggs (mean ± SE), whereas replacement clutches contained 34.60 ± 2.50 eggs. Mean egg perimeter declined from 3.55 ± 0.03 mm in initial clutches to 3.41 ± 0.03 mm in replacement clutches. In the bivariate model, standardized log egg number was lower in replacement clutches (</w:t>
       </w:r>
       <m:oMath>
         <m:r>
@@ -1181,7 +1199,7 @@
         <w:pStyle w:val="BodyText"/>
       </w:pPr>
       <w:r>
-        <w:t xml:space="preserve">The central biological qualification is that the later reproductive event was not an undisturbed natural second clutch. Removing the initial clutch created complete brood loss and prevented the maternal egg-care phase. European earwig females normally clean, guard, reposition, and protect eggs, and the costs and intensity of this care can vary among females</w:t>
+        <w:t xml:space="preserve">The central biological qualification is that the later reproductive event was not an undisturbed natural second clutch. By removing the initial clutch, I created complete brood loss and prevented the maternal egg-care phase. European earwig females normally clean, guard, reposition, and protect eggs, and the costs and intensity of this care can vary among females</w:t>
       </w:r>
       <w:r>
         <w:t xml:space="preserve"> </w:t>
@@ -1190,7 +1208,7 @@
         <w:t xml:space="preserve">(Staerkle and Kölliker 2008; Meunier 2024)</w:t>
       </w:r>
       <w:r>
-        <w:t xml:space="preserve">. Natural second clutches in iteroparous females have been studied as an alternative reproductive trajectory</w:t>
+        <w:t xml:space="preserve">. Researchers have studied natural second clutches in iteroparous females as an alternative reproductive trajectory</w:t>
       </w:r>
       <w:r>
         <w:t xml:space="preserve"> </w:t>
@@ -1199,7 +1217,7 @@
         <w:t xml:space="preserve">(Meunier et al. 2012)</w:t>
       </w:r>
       <w:r>
-        <w:t xml:space="preserve">, but the present protocol did not reproduce that sequence. A replacement clutch produced after loss may consequently be governed by different physiological and evolutionary decisions from a natural second clutch. The result is most appropriately interpreted as context-dependent reproduction after experimental clutch loss, not as a general rule about natural first-versus-second clutch allocation.</w:t>
+        <w:t xml:space="preserve">, but my protocol did not reproduce that sequence. A replacement clutch produced after loss may consequently be governed by different physiological and evolutionary decisions from a natural second clutch. The result is most appropriately interpreted as context-dependent reproduction after experimental clutch loss, not as a general rule about natural first-versus-second clutch allocation.</w:t>
       </w:r>
     </w:p>
     <w:p>
@@ -1215,7 +1233,7 @@
         <w:pStyle w:val="BodyText"/>
       </w:pPr>
       <w:r>
-        <w:t xml:space="preserve">Several other components of the protocol changed between events: temperature, photoperiod, time under common feeding conditions, female age, access to new males, and prior oviposition. Exposure to 23 °C could itself affect female physiology, and access to males could impose costs even if stored sperm would have been sufficient. Mating was not recorded, fertilization was not verified, and the sequential-male design was not experimentally contrasted with no remating. The reproductive-event coefficient therefore bundles clutch loss with these environmental and physiological changes. This limitation precludes causal attribution to clutch order, resource depletion, laboratory standardization, heat exposure, or remating. The 55 females selected for attempted replacement oviposition were also a logistical, haphazard subsample rather than a probability sample. Although selection did not use measured clutch traits, an inadvertent association with phenology or condition cannot be excluded, which may limit the representativeness of the estimates.</w:t>
+        <w:t xml:space="preserve">Several other components of the protocol changed between events: temperature, photoperiod, time under common feeding conditions, female age, access to new males, and prior oviposition. Exposure to 23 °C could itself affect female physiology, and access to males could impose costs even if stored sperm would have been sufficient. I did not record mating, verify fertilization, or experimentally contrast the sequential-male design with no remating. The reproductive-event coefficient therefore bundles clutch loss with these environmental and physiological changes. This limitation precludes causal attribution to clutch order, resource depletion, laboratory standardization, heat exposure, or remating. The 55 females selected for attempted replacement oviposition were also a logistical, haphazard subsample rather than a probability sample. Although I did not use measured clutch traits for selection, I cannot exclude an inadvertent association with phenology or condition, which may limit the representativeness of the estimates.</w:t>
       </w:r>
     </w:p>
     <w:p>
@@ -1229,7 +1247,7 @@
         <w:t xml:space="preserve"> </w:t>
       </w:r>
       <w:r>
-        <w:t xml:space="preserve">(Van Noordwijk and Jong 1986; De Jong and Van Noordwijk 1992; Reznick et al. 2000)</w:t>
+        <w:t xml:space="preserve">(Van Noordwijk and de Jong 1986; De Jong and Van Noordwijk 1992; Reznick et al. 2000)</w:t>
       </w:r>
       <w:r>
         <w:t xml:space="preserve">. Conversely, renewed egg production after clutch loss may have occurred under stronger physiological constraints. Replacement clutches contained both fewer and smaller eggs, and declining ovarian capacity has been proposed to limit later egg production in the Montréal population</w:t>
@@ -1272,7 +1290,7 @@
         <w:t xml:space="preserve"> </w:t>
       </w:r>
       <w:r>
-        <w:t xml:space="preserve">(Pol and Wright 2009; Careau and Wilson 2017; Westneat et al. 2020)</w:t>
+        <w:t xml:space="preserve">(van de Pol and Wright 2009; Careau and Wilson 2017; Westneat et al. 2020)</w:t>
       </w:r>
       <w:r>
         <w:t xml:space="preserve">.</w:t>
@@ -1283,7 +1301,7 @@
         <w:pStyle w:val="BodyText"/>
       </w:pPr>
       <w:r>
-        <w:t xml:space="preserve">The study also did not measure hatching, developmental time, embryo viability, or fertilization. Differences in the fraction of viable or trophic eggs could therefore contribute to differences in both counted egg number and mean perimeter. Moreover, perimeter is a repeatable two-dimensional measurement but does not quantify egg mass, volume, composition, or energetic content. The results concern egg dimensions, not energetic allocation directly, and their fitness consequences cannot be evaluated without offspring performance. These limitations substantially constrain inference about adaptive maternal investment.</w:t>
+        <w:t xml:space="preserve">I did not measure hatching, developmental time, embryo viability, or fertilization. Differences in the fraction of viable or trophic eggs could therefore contribute to differences in both counted egg number and mean perimeter. Moreover, perimeter is a repeatable two-dimensional measurement but does not quantify egg mass, volume, composition, or energetic content. The results concern egg dimensions, not energetic allocation directly, and their fitness consequences cannot be evaluated without offspring performance. These limitations substantially constrain inference about adaptive maternal investment.</w:t>
       </w:r>
     </w:p>
     <w:p>
@@ -1300,7 +1318,7 @@
         <w:t xml:space="preserve">(Koch and Meunier 2014)</w:t>
       </w:r>
       <w:r>
-        <w:t xml:space="preserve">. Here, structural size was controlled statistically, but repeated measurements additionally separated persistent among-female covariance from within-female deviations and showed that an association can be concentrated in a particular experimental context. The novelty is thus the hierarchical and context-specific decomposition following clutch loss, not a claim that condition is unimportant or that replacement clutches represent natural second broods.</w:t>
+        <w:t xml:space="preserve">. I did not test female condition in the present study. Instead, I controlled structural size, which addresses size-related variation in fecundity but is not a substitute for a size-adjusted measure of condition. Repeated measurements additionally separated persistent among-female covariance from within-female deviations and showed that an association can be concentrated in a particular experimental context. The novelty is thus the hierarchical and context-specific decomposition following clutch loss, not a claim that condition is unimportant or that replacement clutches represent natural second broods.</w:t>
       </w:r>
     </w:p>
     <w:p>
@@ -1308,7 +1326,7 @@
         <w:pStyle w:val="BodyText"/>
       </w:pPr>
       <w:r>
-        <w:t xml:space="preserve">More generally, the study shows why pooled phenotypic correlations can miss biologically structured associations. Combining an initial-clutch relationship centered near zero with a negative replacement-clutch relationship produced an overall correlation near zero. Future experiments should manipulate clutch loss and resources factorially while holding temperature, photoperiod, and access to males constant; allow some clutches to receive normal maternal care; identify the cryptic species molecularly; and measure egg mass, volume, viability, hatching, and offspring performance. For the present data, the strongest conclusion is deliberately narrow: a modest negative egg number–perimeter relationship was expressed among females during experimentally induced replacement reproduction and was robust to influence and likelihood checks, whereas its cause and relevance to natural clutch sequences remain unresolved.</w:t>
+        <w:t xml:space="preserve">More generally, the study shows why pooled phenotypic correlations can miss biologically structured associations. Combining an initial-clutch relationship centered near zero with a negative replacement-clutch relationship produced an overall correlation near zero. Future experiments should manipulate clutch loss and resources factorially while holding temperature, photoperiod, and access to males constant; allow some clutches to receive normal maternal care; identify the cryptic species using molecular methods; and measure egg mass, volume, viability, hatching, and offspring performance. For the present data, the strongest conclusion is deliberately narrow: a modest negative egg number–perimeter relationship was expressed among females during experimentally induced replacement reproduction and was robust to influence and likelihood checks, whereas its cause and relevance to natural clutch sequences remain unresolved.</w:t>
       </w:r>
     </w:p>
     <w:bookmarkEnd w:id="30"/>
@@ -1443,7 +1461,7 @@
       </w:r>
     </w:p>
     <w:bookmarkEnd w:id="37"/>
-    <w:bookmarkStart w:id="79" w:name="references"/>
+    <w:bookmarkStart w:id="98" w:name="references"/>
     <w:p>
       <w:pPr>
         <w:pStyle w:val="Heading1"/>
@@ -1452,67 +1470,123 @@
         <w:t xml:space="preserve">References</w:t>
       </w:r>
     </w:p>
-    <w:bookmarkStart w:id="63" w:name="refs"/>
-    <w:bookmarkStart w:id="38" w:name="ref-bernardo1996"/>
+    <w:bookmarkStart w:id="82" w:name="refs"/>
+    <w:bookmarkStart w:id="39" w:name="ref-bernardo1996"/>
     <w:p>
       <w:pPr>
         <w:pStyle w:val="Bibliography"/>
       </w:pPr>
       <w:r>
-        <w:t xml:space="preserve">Bernardo J (1996) The particular maternal effect of propagule size, especially egg size: Patterns, models, quality of evidence and interpretations. Am Zool 36:216–236</w:t>
-      </w:r>
-    </w:p>
-    <w:bookmarkEnd w:id="38"/>
-    <w:bookmarkStart w:id="39" w:name="ref-careau2017"/>
+        <w:t xml:space="preserve">Bernardo J (1996) The particular maternal effect of propagule size, especially egg size: Patterns, models, quality of evidence and interpretations. Am Zool 36:216–236.</w:t>
+      </w:r>
+      <w:r>
+        <w:t xml:space="preserve"> </w:t>
+      </w:r>
+      <w:hyperlink r:id="rId38">
+        <w:r>
+          <w:rPr>
+            <w:rStyle w:val="Hyperlink"/>
+          </w:rPr>
+          <w:t xml:space="preserve">https://doi.org/10.1093/icb/36.2.216</w:t>
+        </w:r>
+      </w:hyperlink>
+    </w:p>
+    <w:bookmarkEnd w:id="39"/>
+    <w:bookmarkStart w:id="41" w:name="ref-careau2017"/>
     <w:p>
       <w:pPr>
         <w:pStyle w:val="Bibliography"/>
       </w:pPr>
       <w:r>
-        <w:t xml:space="preserve">Careau V, Wilson R (2017) Of uberfleas and krakens: Detecting trade-offs using mixed models. Integr Comp Biol 57:362–371</w:t>
-      </w:r>
-    </w:p>
-    <w:bookmarkEnd w:id="39"/>
-    <w:bookmarkStart w:id="40" w:name="ref-clutton-brock1991"/>
+        <w:t xml:space="preserve">Careau V, Wilson RS (2017) Of uberfleas and krakens: Detecting trade-offs using mixed models. Integr Comp Biol 57:362–371.</w:t>
+      </w:r>
+      <w:r>
+        <w:t xml:space="preserve"> </w:t>
+      </w:r>
+      <w:hyperlink r:id="rId40">
+        <w:r>
+          <w:rPr>
+            <w:rStyle w:val="Hyperlink"/>
+          </w:rPr>
+          <w:t xml:space="preserve">https://doi.org/10.1093/icb/icx015</w:t>
+        </w:r>
+      </w:hyperlink>
+    </w:p>
+    <w:bookmarkEnd w:id="41"/>
+    <w:bookmarkStart w:id="42" w:name="ref-clutton-brock1991"/>
     <w:p>
       <w:pPr>
         <w:pStyle w:val="Bibliography"/>
       </w:pPr>
       <w:r>
-        <w:t xml:space="preserve">Clutton-Brock TH (1991)</w:t>
-      </w:r>
-      <w:r>
-        <w:t xml:space="preserve"> </w:t>
-      </w:r>
-      <w:r>
-        <w:t xml:space="preserve">The Evolution of Parental Care</w:t>
+        <w:t xml:space="preserve">Clutton-Brock TH (1991) The</w:t>
+      </w:r>
+      <w:r>
+        <w:t xml:space="preserve"> </w:t>
+      </w:r>
+      <w:r>
+        <w:t xml:space="preserve">Evolution</w:t>
+      </w:r>
+      <w:r>
+        <w:t xml:space="preserve"> </w:t>
+      </w:r>
+      <w:r>
+        <w:t xml:space="preserve">of</w:t>
+      </w:r>
+      <w:r>
+        <w:t xml:space="preserve"> </w:t>
+      </w:r>
+      <w:r>
+        <w:t xml:space="preserve">Parental Care</w:t>
       </w:r>
       <w:r>
         <w:t xml:space="preserve">. Princeton University Press</w:t>
       </w:r>
     </w:p>
-    <w:bookmarkEnd w:id="40"/>
-    <w:bookmarkStart w:id="41" w:name="ref-dejong1992"/>
+    <w:bookmarkEnd w:id="42"/>
+    <w:bookmarkStart w:id="44" w:name="ref-dejong1992"/>
     <w:p>
       <w:pPr>
         <w:pStyle w:val="Bibliography"/>
       </w:pPr>
       <w:r>
-        <w:t xml:space="preserve">De Jong G, Van Noordwijk A (1992) Acquisition and allocation of resources: Genetic (co) variances, selection, and life histories. Am Nat 139:749–770</w:t>
-      </w:r>
-    </w:p>
-    <w:bookmarkEnd w:id="41"/>
-    <w:bookmarkStart w:id="42" w:name="ref-fox2000"/>
+        <w:t xml:space="preserve">De Jong G, Van Noordwijk AJ (1992) Acquisition and allocation of resources: Genetic (co) variances, selection, and life histories. Am Nat 139:749–770.</w:t>
+      </w:r>
+      <w:r>
+        <w:t xml:space="preserve"> </w:t>
+      </w:r>
+      <w:hyperlink r:id="rId43">
+        <w:r>
+          <w:rPr>
+            <w:rStyle w:val="Hyperlink"/>
+          </w:rPr>
+          <w:t xml:space="preserve">https://doi.org/10.1086/285356</w:t>
+        </w:r>
+      </w:hyperlink>
+    </w:p>
+    <w:bookmarkEnd w:id="44"/>
+    <w:bookmarkStart w:id="46" w:name="ref-fox2000"/>
     <w:p>
       <w:pPr>
         <w:pStyle w:val="Bibliography"/>
       </w:pPr>
       <w:r>
-        <w:t xml:space="preserve">Fox CW, Czesak ME (2000) Evolutionary ecology of progeny size in arthropods. Annu Rev Entomol 45:341–369</w:t>
-      </w:r>
-    </w:p>
-    <w:bookmarkEnd w:id="42"/>
-    <w:bookmarkStart w:id="44" w:name="ref-gonzalezmiguens2020"/>
+        <w:t xml:space="preserve">Fox CW, Czesak ME (2000) Evolutionary ecology of progeny size in arthropods. Annu Rev Entomol 45:341–369.</w:t>
+      </w:r>
+      <w:r>
+        <w:t xml:space="preserve"> </w:t>
+      </w:r>
+      <w:hyperlink r:id="rId45">
+        <w:r>
+          <w:rPr>
+            <w:rStyle w:val="Hyperlink"/>
+          </w:rPr>
+          <w:t xml:space="preserve">https://doi.org/10.1146/annurev.ento.45.1.341</w:t>
+        </w:r>
+      </w:hyperlink>
+    </w:p>
+    <w:bookmarkEnd w:id="46"/>
+    <w:bookmarkStart w:id="48" w:name="ref-gonzalez-miguens2020"/>
     <w:p>
       <w:pPr>
         <w:pStyle w:val="Bibliography"/>
@@ -1524,30 +1598,22 @@
         <w:t xml:space="preserve"> </w:t>
       </w:r>
       <w:r>
+        <w:rPr>
+          <w:i/>
+          <w:iCs/>
+        </w:rPr>
         <w:t xml:space="preserve">Forficula auricularia</w:t>
       </w:r>
       <w:r>
         <w:t xml:space="preserve"> </w:t>
       </w:r>
       <w:r>
-        <w:t xml:space="preserve">species complex: Cryptic and not so cryptic taxa across the western</w:t>
-      </w:r>
-      <w:r>
-        <w:t xml:space="preserve"> </w:t>
-      </w:r>
-      <w:r>
-        <w:t xml:space="preserve">Palaearctic</w:t>
-      </w:r>
-      <w:r>
-        <w:t xml:space="preserve"> </w:t>
-      </w:r>
-      <w:r>
-        <w:t xml:space="preserve">region. Zool J Linn Soc 190:788–823.</w:t>
-      </w:r>
-      <w:r>
-        <w:t xml:space="preserve"> </w:t>
-      </w:r>
-      <w:hyperlink r:id="rId43">
+        <w:t xml:space="preserve">species complex: Cryptic and not so cryptic taxa across the western palaearctic region. Zool J Linn Soc 190:788–823.</w:t>
+      </w:r>
+      <w:r>
+        <w:t xml:space="preserve"> </w:t>
+      </w:r>
+      <w:hyperlink r:id="rId47">
         <w:r>
           <w:rPr>
             <w:rStyle w:val="Hyperlink"/>
@@ -1556,8 +1622,8 @@
         </w:r>
       </w:hyperlink>
     </w:p>
-    <w:bookmarkEnd w:id="44"/>
-    <w:bookmarkStart w:id="45" w:name="ref-hargitai2005"/>
+    <w:bookmarkEnd w:id="48"/>
+    <w:bookmarkStart w:id="50" w:name="ref-hargitai2005"/>
     <w:p>
       <w:pPr>
         <w:pStyle w:val="Bibliography"/>
@@ -1566,38 +1632,74 @@
         <w:t xml:space="preserve">Hargitai R, Török J, Tóth L, et al (2005) Effects of environmental conditions and parental quality on inter-and intraclutch egg-size variation in the collared flycatcher (</w:t>
       </w:r>
       <w:r>
-        <w:rPr>
-          <w:i/>
-          <w:iCs/>
-        </w:rPr>
-        <w:t xml:space="preserve">Ficedula albicollis</w:t>
-      </w:r>
-      <w:r>
-        <w:t xml:space="preserve">). Auk 122:509–522</w:t>
-      </w:r>
-    </w:p>
-    <w:bookmarkEnd w:id="45"/>
-    <w:bookmarkStart w:id="46" w:name="ref-houle1991"/>
+        <w:t xml:space="preserve">). Auk 122:509–522.</w:t>
+      </w:r>
+      <w:r>
+        <w:t xml:space="preserve"> </w:t>
+      </w:r>
+      <w:hyperlink r:id="rId49">
+        <w:r>
+          <w:rPr>
+            <w:rStyle w:val="Hyperlink"/>
+          </w:rPr>
+          <w:t xml:space="preserve">https://doi.org/10.1093/auk/122.2.509</w:t>
+        </w:r>
+      </w:hyperlink>
+    </w:p>
+    <w:bookmarkEnd w:id="50"/>
+    <w:bookmarkStart w:id="52" w:name="ref-honek1993"/>
     <w:p>
       <w:pPr>
         <w:pStyle w:val="Bibliography"/>
       </w:pPr>
       <w:r>
+        <w:t xml:space="preserve">Honek A (1993) Intraspecific variation in body size and fecundity in insects: A general relationship. Oikos 483–492.</w:t>
+      </w:r>
+      <w:r>
+        <w:t xml:space="preserve"> </w:t>
+      </w:r>
+      <w:hyperlink r:id="rId51">
+        <w:r>
+          <w:rPr>
+            <w:rStyle w:val="Hyperlink"/>
+          </w:rPr>
+          <w:t xml:space="preserve">https://doi.org/10.2307/3544943</w:t>
+        </w:r>
+      </w:hyperlink>
+    </w:p>
+    <w:bookmarkEnd w:id="52"/>
+    <w:bookmarkStart w:id="53" w:name="ref-houle1991"/>
+    <w:p>
+      <w:pPr>
+        <w:pStyle w:val="Bibliography"/>
+      </w:pPr>
+      <w:r>
         <w:t xml:space="preserve">Houle D (1991) Genetic covariance of fitness correlates: What genetic correlations are made of and why it matters. Evolution 45:630–648</w:t>
       </w:r>
     </w:p>
-    <w:bookmarkEnd w:id="46"/>
-    <w:bookmarkStart w:id="47" w:name="ref-koch2014"/>
+    <w:bookmarkEnd w:id="53"/>
+    <w:bookmarkStart w:id="55" w:name="ref-koch2014"/>
     <w:p>
       <w:pPr>
         <w:pStyle w:val="Bibliography"/>
       </w:pPr>
       <w:r>
-        <w:t xml:space="preserve">Koch LK, Meunier J (2014) Mother and offspring fitness in an insect with maternal care: Phenotypic trade-offs between egg number, egg mass and egg care. BMC Evol Biol 14:125</w:t>
-      </w:r>
-    </w:p>
-    <w:bookmarkEnd w:id="47"/>
-    <w:bookmarkStart w:id="48" w:name="ref-meunier2024"/>
+        <w:t xml:space="preserve">Koch LK, Meunier J (2014) Mother and offspring fitness in an insect with maternal care: Phenotypic trade-offs between egg number, egg mass and egg care. BMC Evol Biol 14:125–133.</w:t>
+      </w:r>
+      <w:r>
+        <w:t xml:space="preserve"> </w:t>
+      </w:r>
+      <w:hyperlink r:id="rId54">
+        <w:r>
+          <w:rPr>
+            <w:rStyle w:val="Hyperlink"/>
+          </w:rPr>
+          <w:t xml:space="preserve">https://doi.org/10.1186/1471-2148-14-125</w:t>
+        </w:r>
+      </w:hyperlink>
+    </w:p>
+    <w:bookmarkEnd w:id="55"/>
+    <w:bookmarkStart w:id="57" w:name="ref-meunier2024"/>
     <w:p>
       <w:pPr>
         <w:pStyle w:val="Bibliography"/>
@@ -1606,25 +1708,60 @@
         <w:t xml:space="preserve">Meunier J (2024) The biology and social life of earwigs (</w:t>
       </w:r>
       <w:r>
-        <w:t xml:space="preserve">D</w:t>
-      </w:r>
-      <w:r>
-        <w:t xml:space="preserve">ermaptera). Annu Rev Entomol 69:259–276</w:t>
-      </w:r>
-    </w:p>
-    <w:bookmarkEnd w:id="48"/>
-    <w:bookmarkStart w:id="50" w:name="ref-meunier2012clutches"/>
+        <w:t xml:space="preserve">Dermaptera</w:t>
+      </w:r>
+      <w:r>
+        <w:t xml:space="preserve">). Annu Rev Entomol 69:259–276.</w:t>
+      </w:r>
+      <w:r>
+        <w:t xml:space="preserve"> </w:t>
+      </w:r>
+      <w:hyperlink r:id="rId56">
+        <w:r>
+          <w:rPr>
+            <w:rStyle w:val="Hyperlink"/>
+          </w:rPr>
+          <w:t xml:space="preserve">https://doi.org/10.1146/annurev-ento-013023-015632</w:t>
+        </w:r>
+      </w:hyperlink>
+    </w:p>
+    <w:bookmarkEnd w:id="57"/>
+    <w:bookmarkStart w:id="59" w:name="ref-meunier2012a"/>
     <w:p>
       <w:pPr>
         <w:pStyle w:val="Bibliography"/>
       </w:pPr>
       <w:r>
-        <w:t xml:space="preserve">Meunier J, Wong JWY, Gómez Y, et al (2012) One clutch or two clutches? Fitness correlates of coexisting alternative female life-histories in the european earwig. Evolutionary Ecology 26:669–682.</w:t>
-      </w:r>
-      <w:r>
-        <w:t xml:space="preserve"> </w:t>
-      </w:r>
-      <w:hyperlink r:id="rId49">
+        <w:t xml:space="preserve">Meunier J, Wong JWY, Gómez Y, et al (2012) One clutch or two clutches?</w:t>
+      </w:r>
+      <w:r>
+        <w:t xml:space="preserve"> </w:t>
+      </w:r>
+      <w:r>
+        <w:t xml:space="preserve">Fitness</w:t>
+      </w:r>
+      <w:r>
+        <w:t xml:space="preserve"> </w:t>
+      </w:r>
+      <w:r>
+        <w:t xml:space="preserve">correlates of coexisting alternative female life-histories in the</w:t>
+      </w:r>
+      <w:r>
+        <w:t xml:space="preserve"> </w:t>
+      </w:r>
+      <w:r>
+        <w:t xml:space="preserve">European</w:t>
+      </w:r>
+      <w:r>
+        <w:t xml:space="preserve"> </w:t>
+      </w:r>
+      <w:r>
+        <w:t xml:space="preserve">earwig. Evol Ecol 26:669–682.</w:t>
+      </w:r>
+      <w:r>
+        <w:t xml:space="preserve"> </w:t>
+      </w:r>
+      <w:hyperlink r:id="rId58">
         <w:r>
           <w:rPr>
             <w:rStyle w:val="Hyperlink"/>
@@ -1633,149 +1770,229 @@
         </w:r>
       </w:hyperlink>
     </w:p>
-    <w:bookmarkEnd w:id="50"/>
-    <w:bookmarkStart w:id="51" w:name="ref-vandepol2009"/>
+    <w:bookmarkEnd w:id="59"/>
+    <w:bookmarkStart w:id="61" w:name="ref-reznick2000"/>
     <w:p>
       <w:pPr>
         <w:pStyle w:val="Bibliography"/>
       </w:pPr>
       <w:r>
-        <w:t xml:space="preserve">Pol M van de, Wright J (2009) A simple method for distinguishing within- versus between-subject effects using mixed models. Anim Behav 77:753–758</w:t>
-      </w:r>
-    </w:p>
-    <w:bookmarkEnd w:id="51"/>
-    <w:bookmarkStart w:id="52" w:name="ref-reznick2000"/>
+        <w:t xml:space="preserve">Reznick D, Nunney L, Tessier A (2000) Big houses, big cars, superfleas and the costs of reproduction. Trends Ecol Evol 15:421–425.</w:t>
+      </w:r>
+      <w:r>
+        <w:t xml:space="preserve"> </w:t>
+      </w:r>
+      <w:hyperlink r:id="rId60">
+        <w:r>
+          <w:rPr>
+            <w:rStyle w:val="Hyperlink"/>
+          </w:rPr>
+          <w:t xml:space="preserve">https://doi.org/10.1016/S0169-5347(00)01941-8</w:t>
+        </w:r>
+      </w:hyperlink>
+    </w:p>
+    <w:bookmarkEnd w:id="61"/>
+    <w:bookmarkStart w:id="62" w:name="ref-roff1992a"/>
     <w:p>
       <w:pPr>
         <w:pStyle w:val="Bibliography"/>
       </w:pPr>
       <w:r>
-        <w:t xml:space="preserve">Reznick D, Nunney L, Tessier A (2000) Big houses, big cars, superfleas and the costs of reproduction. Trends Ecol Evol 15:421–425</w:t>
-      </w:r>
-    </w:p>
-    <w:bookmarkEnd w:id="52"/>
-    <w:bookmarkStart w:id="53" w:name="ref-roff1992a"/>
+        <w:t xml:space="preserve">Roff D (1992) Evolution of</w:t>
+      </w:r>
+      <w:r>
+        <w:t xml:space="preserve"> </w:t>
+      </w:r>
+      <w:r>
+        <w:t xml:space="preserve">Life Histories</w:t>
+      </w:r>
+      <w:r>
+        <w:t xml:space="preserve">:</w:t>
+      </w:r>
+      <w:r>
+        <w:t xml:space="preserve"> </w:t>
+      </w:r>
+      <w:r>
+        <w:t xml:space="preserve">Theory</w:t>
+      </w:r>
+      <w:r>
+        <w:t xml:space="preserve"> </w:t>
+      </w:r>
+      <w:r>
+        <w:t xml:space="preserve">and</w:t>
+      </w:r>
+      <w:r>
+        <w:t xml:space="preserve"> </w:t>
+      </w:r>
+      <w:r>
+        <w:t xml:space="preserve">Analysis</w:t>
+      </w:r>
+      <w:r>
+        <w:t xml:space="preserve">. Chapman &amp; Hall, Inc., New York, NY</w:t>
+      </w:r>
+    </w:p>
+    <w:bookmarkEnd w:id="62"/>
+    <w:bookmarkStart w:id="64" w:name="ref-schindelin2012"/>
     <w:p>
       <w:pPr>
         <w:pStyle w:val="Bibliography"/>
       </w:pPr>
       <w:r>
-        <w:t xml:space="preserve">Roff D (1992)</w:t>
-      </w:r>
-      <w:r>
-        <w:t xml:space="preserve"> </w:t>
-      </w:r>
-      <w:r>
-        <w:t xml:space="preserve">Evolution of Life Histories: Theory and Analysis</w:t>
-      </w:r>
-      <w:r>
-        <w:t xml:space="preserve">. Chapman &amp; Hall, Inc., New York, NY</w:t>
-      </w:r>
-    </w:p>
-    <w:bookmarkEnd w:id="53"/>
-    <w:bookmarkStart w:id="54" w:name="ref-schindelin2012"/>
+        <w:t xml:space="preserve">Schindelin J, Arganda-Carreras I, Frise E, et al (2012) Fiji: An open-source platform for biological-image analysis. Nat Methods 9:676–82.</w:t>
+      </w:r>
+      <w:r>
+        <w:t xml:space="preserve"> </w:t>
+      </w:r>
+      <w:hyperlink r:id="rId63">
+        <w:r>
+          <w:rPr>
+            <w:rStyle w:val="Hyperlink"/>
+          </w:rPr>
+          <w:t xml:space="preserve">https://doi.org/10.1038/nmeth.2019</w:t>
+        </w:r>
+      </w:hyperlink>
+    </w:p>
+    <w:bookmarkEnd w:id="64"/>
+    <w:bookmarkStart w:id="66" w:name="ref-smith1974"/>
     <w:p>
       <w:pPr>
         <w:pStyle w:val="Bibliography"/>
       </w:pPr>
       <w:r>
-        <w:t xml:space="preserve">Schindelin J, Arganda-Carreras I, Frise E, et al (2012) Fiji: An open-source platform for biological-image analysis. Nat Method 9:676–682</w:t>
-      </w:r>
-    </w:p>
-    <w:bookmarkEnd w:id="54"/>
-    <w:bookmarkStart w:id="55" w:name="ref-smith1974"/>
+        <w:t xml:space="preserve">Smith CC, Fretwell SD (1974) The optimal balance between size and number of offspring. Am Nat 108:499–506.</w:t>
+      </w:r>
+      <w:r>
+        <w:t xml:space="preserve"> </w:t>
+      </w:r>
+      <w:hyperlink r:id="rId65">
+        <w:r>
+          <w:rPr>
+            <w:rStyle w:val="Hyperlink"/>
+          </w:rPr>
+          <w:t xml:space="preserve">https://doi.org/10.1086/282929</w:t>
+        </w:r>
+      </w:hyperlink>
+    </w:p>
+    <w:bookmarkEnd w:id="66"/>
+    <w:bookmarkStart w:id="68" w:name="ref-staerkle2008"/>
     <w:p>
       <w:pPr>
         <w:pStyle w:val="Bibliography"/>
       </w:pPr>
       <w:r>
-        <w:t xml:space="preserve">Smith CC, Fretwell SD (1974) The optimal balance between size and number of offspring. Am Nat 108:499–506</w:t>
-      </w:r>
-    </w:p>
-    <w:bookmarkEnd w:id="55"/>
-    <w:bookmarkStart w:id="56" w:name="ref-staerkle2008"/>
+        <w:t xml:space="preserve">Staerkle M, Kölliker M (2008) Maternal food regurgitation to nymphs in earwigs (</w:t>
+      </w:r>
+      <w:r>
+        <w:t xml:space="preserve">). Ethology 114:844–850.</w:t>
+      </w:r>
+      <w:r>
+        <w:t xml:space="preserve"> </w:t>
+      </w:r>
+      <w:hyperlink r:id="rId67">
+        <w:r>
+          <w:rPr>
+            <w:rStyle w:val="Hyperlink"/>
+          </w:rPr>
+          <w:t xml:space="preserve">https://doi.org/10.1111/j.1439-0310.2008.01526.x</w:t>
+        </w:r>
+      </w:hyperlink>
+    </w:p>
+    <w:bookmarkEnd w:id="68"/>
+    <w:bookmarkStart w:id="69" w:name="ref-stearns1992"/>
     <w:p>
       <w:pPr>
         <w:pStyle w:val="Bibliography"/>
       </w:pPr>
       <w:r>
-        <w:t xml:space="preserve">Staerkle M, Kölliker M (2008) Maternal food regurgitation to nymphs in earwigs (</w:t>
-      </w:r>
-      <w:r>
-        <w:rPr>
-          <w:i/>
-          <w:iCs/>
-        </w:rPr>
-        <w:t xml:space="preserve">Forficula auricularia</w:t>
-      </w:r>
-      <w:r>
-        <w:t xml:space="preserve">). Ethology 114:844–850</w:t>
-      </w:r>
-    </w:p>
-    <w:bookmarkEnd w:id="56"/>
-    <w:bookmarkStart w:id="57" w:name="ref-stearns1992"/>
+        <w:t xml:space="preserve">Stearns SC (1992) The</w:t>
+      </w:r>
+      <w:r>
+        <w:t xml:space="preserve"> </w:t>
+      </w:r>
+      <w:r>
+        <w:t xml:space="preserve">Evolution</w:t>
+      </w:r>
+      <w:r>
+        <w:t xml:space="preserve"> </w:t>
+      </w:r>
+      <w:r>
+        <w:t xml:space="preserve">of</w:t>
+      </w:r>
+      <w:r>
+        <w:t xml:space="preserve"> </w:t>
+      </w:r>
+      <w:r>
+        <w:t xml:space="preserve">Life Histories</w:t>
+      </w:r>
+      <w:r>
+        <w:t xml:space="preserve">. Oxford University Press</w:t>
+      </w:r>
+    </w:p>
+    <w:bookmarkEnd w:id="69"/>
+    <w:bookmarkStart w:id="71" w:name="ref-tourneur2018"/>
     <w:p>
       <w:pPr>
         <w:pStyle w:val="Bibliography"/>
       </w:pPr>
       <w:r>
-        <w:t xml:space="preserve">Stearns SC (1992)</w:t>
-      </w:r>
-      <w:r>
-        <w:t xml:space="preserve"> </w:t>
-      </w:r>
-      <w:r>
-        <w:t xml:space="preserve">The Evolution of Life Histories</w:t>
-      </w:r>
-      <w:r>
-        <w:t xml:space="preserve">. Oxford University Press</w:t>
-      </w:r>
-    </w:p>
-    <w:bookmarkEnd w:id="57"/>
-    <w:bookmarkStart w:id="58" w:name="ref-tourneur2018"/>
+        <w:t xml:space="preserve">Tourneur J-C (2018) Factors affecting the egg-laying pattern of</w:t>
+      </w:r>
+      <w:r>
+        <w:t xml:space="preserve"> </w:t>
+      </w:r>
+      <w:r>
+        <w:t xml:space="preserve"> </w:t>
+      </w:r>
+      <w:r>
+        <w:t xml:space="preserve">(</w:t>
+      </w:r>
+      <w:r>
+        <w:t xml:space="preserve">ermaptera:</w:t>
+      </w:r>
+      <w:r>
+        <w:t xml:space="preserve"> </w:t>
+      </w:r>
+      <w:r>
+        <w:t xml:space="preserve">Orficulidae) in three climatologically different zones of</w:t>
+      </w:r>
+      <w:r>
+        <w:t xml:space="preserve"> </w:t>
+      </w:r>
+      <w:r>
+        <w:t xml:space="preserve">orth</w:t>
+      </w:r>
+      <w:r>
+        <w:t xml:space="preserve"> </w:t>
+      </w:r>
+      <w:r>
+        <w:t xml:space="preserve">a</w:t>
+      </w:r>
+      <w:r>
+        <w:t xml:space="preserve">merica. Can Entomol 150:511–519.</w:t>
+      </w:r>
+      <w:r>
+        <w:t xml:space="preserve"> </w:t>
+      </w:r>
+      <w:hyperlink r:id="rId70">
+        <w:r>
+          <w:rPr>
+            <w:rStyle w:val="Hyperlink"/>
+          </w:rPr>
+          <w:t xml:space="preserve">https://doi.org/10.4039/tce.2018.24</w:t>
+        </w:r>
+      </w:hyperlink>
+    </w:p>
+    <w:bookmarkEnd w:id="71"/>
+    <w:bookmarkStart w:id="73" w:name="ref-tourneur1992"/>
     <w:p>
       <w:pPr>
         <w:pStyle w:val="Bibliography"/>
       </w:pPr>
       <w:r>
-        <w:t xml:space="preserve">Tourneur J-C (2018) Factors affecting the egg-laying pattern of</w:t>
-      </w:r>
-      <w:r>
-        <w:t xml:space="preserve"> </w:t>
-      </w:r>
-      <w:r>
-        <w:rPr>
-          <w:i/>
-          <w:iCs/>
-        </w:rPr>
-        <w:t xml:space="preserve">Forficula auricularia</w:t>
-      </w:r>
-      <w:r>
-        <w:t xml:space="preserve"> </w:t>
-      </w:r>
-      <w:r>
-        <w:t xml:space="preserve">(</w:t>
-      </w:r>
-      <w:r>
-        <w:t xml:space="preserve">D</w:t>
-      </w:r>
-      <w:r>
-        <w:t xml:space="preserve">ermaptera:</w:t>
-      </w:r>
-      <w:r>
-        <w:t xml:space="preserve"> </w:t>
-      </w:r>
-      <w:r>
-        <w:t xml:space="preserve">F</w:t>
-      </w:r>
-      <w:r>
-        <w:t xml:space="preserve">orficulidae) in three climatologically different zones of</w:t>
-      </w:r>
-      <w:r>
-        <w:t xml:space="preserve"> </w:t>
-      </w:r>
-      <w:r>
-        <w:t xml:space="preserve">N</w:t>
+        <w:t xml:space="preserve">Tourneur J-C, Gingras J (1992) Egg laying in a northeastern</w:t>
+      </w:r>
+      <w:r>
+        <w:t xml:space="preserve"> </w:t>
       </w:r>
       <w:r>
         <w:t xml:space="preserve">orth</w:t>
@@ -1784,139 +2001,142 @@
         <w:t xml:space="preserve"> </w:t>
       </w:r>
       <w:r>
-        <w:t xml:space="preserve">A</w:t>
-      </w:r>
-      <w:r>
-        <w:t xml:space="preserve">merica. Can Entomol 150:511–519</w:t>
-      </w:r>
-    </w:p>
-    <w:bookmarkEnd w:id="58"/>
-    <w:bookmarkStart w:id="59" w:name="ref-tourneur1992"/>
+        <w:t xml:space="preserve">a</w:t>
+      </w:r>
+      <w:r>
+        <w:t xml:space="preserve">merican (</w:t>
+      </w:r>
+      <w:r>
+        <w:t xml:space="preserve">ontréal,</w:t>
+      </w:r>
+      <w:r>
+        <w:t xml:space="preserve"> </w:t>
+      </w:r>
+      <w:r>
+        <w:t xml:space="preserve">uébec) population of</w:t>
+      </w:r>
+      <w:r>
+        <w:t xml:space="preserve"> </w:t>
+      </w:r>
+      <w:r>
+        <w:t xml:space="preserve"> </w:t>
+      </w:r>
+      <w:r>
+        <w:t xml:space="preserve">. (</w:t>
+      </w:r>
+      <w:r>
+        <w:t xml:space="preserve">Ermaptera:</w:t>
+      </w:r>
+      <w:r>
+        <w:t xml:space="preserve"> </w:t>
+      </w:r>
+      <w:r>
+        <w:t xml:space="preserve">orficulidae). Can Entomol 124:1055–1061.</w:t>
+      </w:r>
+      <w:r>
+        <w:t xml:space="preserve"> </w:t>
+      </w:r>
+      <w:hyperlink r:id="rId72">
+        <w:r>
+          <w:rPr>
+            <w:rStyle w:val="Hyperlink"/>
+          </w:rPr>
+          <w:t xml:space="preserve">https://doi.org/10.4039/ent1241055-6</w:t>
+        </w:r>
+      </w:hyperlink>
+    </w:p>
+    <w:bookmarkEnd w:id="73"/>
+    <w:bookmarkStart w:id="75" w:name="ref-vandepol2009"/>
     <w:p>
       <w:pPr>
         <w:pStyle w:val="Bibliography"/>
       </w:pPr>
       <w:r>
-        <w:t xml:space="preserve">Tourneur J-C, Gingras J (1992) Egg laying in a northeastern</w:t>
-      </w:r>
-      <w:r>
-        <w:t xml:space="preserve"> </w:t>
-      </w:r>
-      <w:r>
-        <w:t xml:space="preserve">N</w:t>
-      </w:r>
-      <w:r>
-        <w:t xml:space="preserve">orth</w:t>
-      </w:r>
-      <w:r>
-        <w:t xml:space="preserve"> </w:t>
-      </w:r>
-      <w:r>
-        <w:t xml:space="preserve">A</w:t>
-      </w:r>
-      <w:r>
-        <w:t xml:space="preserve">merican (</w:t>
-      </w:r>
-      <w:r>
-        <w:t xml:space="preserve">M</w:t>
-      </w:r>
-      <w:r>
-        <w:t xml:space="preserve">ontr</w:t>
-      </w:r>
-      <w:r>
-        <w:t xml:space="preserve">é</w:t>
-      </w:r>
-      <w:r>
-        <w:t xml:space="preserve">al,</w:t>
-      </w:r>
-      <w:r>
-        <w:t xml:space="preserve"> </w:t>
-      </w:r>
-      <w:r>
-        <w:t xml:space="preserve">Q</w:t>
-      </w:r>
-      <w:r>
-        <w:t xml:space="preserve">u</w:t>
-      </w:r>
-      <w:r>
-        <w:t xml:space="preserve">é</w:t>
-      </w:r>
-      <w:r>
-        <w:t xml:space="preserve">bec) population of</w:t>
-      </w:r>
-      <w:r>
-        <w:t xml:space="preserve"> </w:t>
-      </w:r>
-      <w:r>
-        <w:rPr>
-          <w:i/>
-          <w:iCs/>
-        </w:rPr>
-        <w:t xml:space="preserve">Forficula auricularia</w:t>
-      </w:r>
-      <w:r>
-        <w:t xml:space="preserve"> </w:t>
-      </w:r>
-      <w:r>
-        <w:t xml:space="preserve">L</w:t>
-      </w:r>
-      <w:r>
-        <w:t xml:space="preserve">. (</w:t>
-      </w:r>
-      <w:r>
-        <w:t xml:space="preserve">D</w:t>
-      </w:r>
-      <w:r>
-        <w:t xml:space="preserve">ermaptera:</w:t>
-      </w:r>
-      <w:r>
-        <w:t xml:space="preserve"> </w:t>
-      </w:r>
-      <w:r>
-        <w:t xml:space="preserve">F</w:t>
-      </w:r>
-      <w:r>
-        <w:t xml:space="preserve">orficulidae). Can Entomol 124:1055–1061</w:t>
-      </w:r>
-    </w:p>
-    <w:bookmarkEnd w:id="59"/>
-    <w:bookmarkStart w:id="60" w:name="ref-vannoordwijk1986"/>
+        <w:t xml:space="preserve">van de Pol M, Wright J (2009) A simple method for distinguishing within- versus between-subject effects using mixed models. Anim Behav 77:753–758.</w:t>
+      </w:r>
+      <w:r>
+        <w:t xml:space="preserve"> </w:t>
+      </w:r>
+      <w:hyperlink r:id="rId74">
+        <w:r>
+          <w:rPr>
+            <w:rStyle w:val="Hyperlink"/>
+          </w:rPr>
+          <w:t xml:space="preserve">https://doi.org/10.1016/j.anbehav.2008.11.006</w:t>
+        </w:r>
+      </w:hyperlink>
+    </w:p>
+    <w:bookmarkEnd w:id="75"/>
+    <w:bookmarkStart w:id="77" w:name="ref-vannoordwijk1986"/>
     <w:p>
       <w:pPr>
         <w:pStyle w:val="Bibliography"/>
       </w:pPr>
       <w:r>
-        <w:t xml:space="preserve">Van Noordwijk AJ, Jong G de (1986) Acquisition and allocation of resources: Their influence on variation in life history tactics. Am Nat 128:137–142</w:t>
-      </w:r>
-    </w:p>
-    <w:bookmarkEnd w:id="60"/>
-    <w:bookmarkStart w:id="61" w:name="ref-westneat2020"/>
+        <w:t xml:space="preserve">Van Noordwijk AJ, de Jong G (1986) Acquisition and allocation of resources: Their influence on variation in life history tactics. Am Nat 128:137–142.</w:t>
+      </w:r>
+      <w:r>
+        <w:t xml:space="preserve"> </w:t>
+      </w:r>
+      <w:hyperlink r:id="rId76">
+        <w:r>
+          <w:rPr>
+            <w:rStyle w:val="Hyperlink"/>
+          </w:rPr>
+          <w:t xml:space="preserve">https://doi.org/10.1086/284547</w:t>
+        </w:r>
+      </w:hyperlink>
+    </w:p>
+    <w:bookmarkEnd w:id="77"/>
+    <w:bookmarkStart w:id="79" w:name="ref-westneat2020"/>
     <w:p>
       <w:pPr>
         <w:pStyle w:val="Bibliography"/>
       </w:pPr>
       <w:r>
-        <w:t xml:space="preserve">Westneat DF, Araya-Ajoy YG, Allegue H, et al (2020) Collision between biological process and statistical analysis revealed by mean centring. J Anim Ecol 89:2813–2824</w:t>
-      </w:r>
-    </w:p>
-    <w:bookmarkEnd w:id="61"/>
-    <w:bookmarkStart w:id="62" w:name="ref-winkler1987"/>
+        <w:t xml:space="preserve">Westneat DF, Araya-Ajoy YG, Allegue H, et al (2020) Collision between biological process and statistical analysis revealed by mean centring. J Anim Ecol 89:2813–2824.</w:t>
+      </w:r>
+      <w:r>
+        <w:t xml:space="preserve"> </w:t>
+      </w:r>
+      <w:hyperlink r:id="rId78">
+        <w:r>
+          <w:rPr>
+            <w:rStyle w:val="Hyperlink"/>
+          </w:rPr>
+          <w:t xml:space="preserve">https://doi.org/10.1111/1365-2656.13360</w:t>
+        </w:r>
+      </w:hyperlink>
+    </w:p>
+    <w:bookmarkEnd w:id="79"/>
+    <w:bookmarkStart w:id="81" w:name="ref-winkler1987"/>
     <w:p>
       <w:pPr>
         <w:pStyle w:val="Bibliography"/>
       </w:pPr>
       <w:r>
-        <w:t xml:space="preserve">Winkler DW, Wallin K (1987) Offspring size and number: A life history model linking effort per offspring and total effort. Am Nat 129:708–720</w:t>
-      </w:r>
-    </w:p>
-    <w:bookmarkEnd w:id="62"/>
-    <w:bookmarkEnd w:id="63"/>
+        <w:t xml:space="preserve">Winkler DW, Wallin K (1987) Offspring size and number: A life history model linking effort per offspring and total effort. Am Nat 129:708–720.</w:t>
+      </w:r>
+      <w:r>
+        <w:t xml:space="preserve"> </w:t>
+      </w:r>
+      <w:hyperlink r:id="rId80">
+        <w:r>
+          <w:rPr>
+            <w:rStyle w:val="Hyperlink"/>
+          </w:rPr>
+          <w:t xml:space="preserve">https://doi.org/10.1086/284667</w:t>
+        </w:r>
+      </w:hyperlink>
+    </w:p>
+    <w:bookmarkEnd w:id="81"/>
+    <w:bookmarkEnd w:id="82"/>
     <w:p>
       <w:r>
         <w:br w:type="page"/>
       </w:r>
     </w:p>
-    <w:bookmarkStart w:id="65" w:name="tables"/>
+    <w:bookmarkStart w:id="84" w:name="tables"/>
     <w:p>
       <w:pPr>
         <w:pStyle w:val="Heading2"/>
@@ -1938,7 +2158,7 @@
       <w:tr>
         <w:tc>
           <w:tcPr/>
-          <w:bookmarkStart w:id="64" w:name="tbl-focal-results"/>
+          <w:bookmarkStart w:id="83" w:name="tbl-focal-results"/>
           <w:p>
             <w:pPr>
               <w:jc w:val="center"/>
@@ -6780,12 +7000,12 @@
               </w:tc>
             </w:tr>
           </w:tbl>
-          <w:bookmarkEnd w:id="64"/>
+          <w:bookmarkEnd w:id="83"/>
         </w:tc>
       </w:tr>
     </w:tbl>
-    <w:bookmarkEnd w:id="65"/>
-    <w:bookmarkStart w:id="78" w:name="figures"/>
+    <w:bookmarkEnd w:id="84"/>
+    <w:bookmarkStart w:id="97" w:name="figures"/>
     <w:p>
       <w:pPr>
         <w:pStyle w:val="Heading2"/>
@@ -6807,7 +7027,7 @@
       <w:tr>
         <w:tc>
           <w:tcPr/>
-          <w:bookmarkStart w:id="69" w:name="fig-context"/>
+          <w:bookmarkStart w:id="88" w:name="fig-context"/>
           <w:p>
             <w:pPr>
               <w:pStyle w:val="Compact"/>
@@ -6818,18 +7038,18 @@
                 <wp:inline>
                   <wp:extent cx="5969000" cy="3058225"/>
                   <wp:effectExtent b="0" l="0" r="0" t="0"/>
-                  <wp:docPr descr="" title="" id="67" name="Picture"/>
+                  <wp:docPr descr="" title="" id="86" name="Picture"/>
                   <a:graphic>
                     <a:graphicData uri="http://schemas.openxmlformats.org/drawingml/2006/picture">
                       <pic:pic>
                         <pic:nvPicPr>
-                          <pic:cNvPr descr="figures/figure_1_context.png" id="68" name="Picture"/>
+                          <pic:cNvPr descr="figures/figure_1_context.png" id="87" name="Picture"/>
                           <pic:cNvPicPr>
                             <a:picLocks noChangeArrowheads="1" noChangeAspect="1"/>
                           </pic:cNvPicPr>
                         </pic:nvPicPr>
                         <pic:blipFill>
-                          <a:blip r:embed="rId66"/>
+                          <a:blip r:embed="rId85"/>
                           <a:stretch>
                             <a:fillRect/>
                           </a:stretch>
@@ -6869,7 +7089,7 @@
               <w:t xml:space="preserve">Figure 1: Among-female relationships between egg number and mean egg perimeter in initial and experimentally induced replacement clutches. Points represent clutch means for individual females. Lines show posterior median predictions from a Bayesian mixed model containing reproductive event, pooled-standardized log egg number, their interaction, and standardized log pronotum length; shaded regions denote 95% credible intervals. Predictions are for a female of average structural size and are displayed on the original scales, producing curvature after back-transformation. Egg number was not clearly associated with perimeter in initial clutches, whereas females producing more eggs produced smaller eggs in replacement clutches. The model contrasts the combined experimental contexts, not natural clutch order alone.</w:t>
             </w:r>
           </w:p>
-          <w:bookmarkEnd w:id="69"/>
+          <w:bookmarkEnd w:id="88"/>
         </w:tc>
       </w:tr>
     </w:tbl>
@@ -6894,7 +7114,7 @@
       <w:tr>
         <w:tc>
           <w:tcPr/>
-          <w:bookmarkStart w:id="73" w:name="fig-change"/>
+          <w:bookmarkStart w:id="92" w:name="fig-change"/>
           <w:p>
             <w:pPr>
               <w:pStyle w:val="Compact"/>
@@ -6905,18 +7125,18 @@
                 <wp:inline>
                   <wp:extent cx="5683488" cy="4766796"/>
                   <wp:effectExtent b="0" l="0" r="0" t="0"/>
-                  <wp:docPr descr="" title="" id="71" name="Picture"/>
+                  <wp:docPr descr="" title="" id="90" name="Picture"/>
                   <a:graphic>
                     <a:graphicData uri="http://schemas.openxmlformats.org/drawingml/2006/picture">
                       <pic:pic>
                         <pic:nvPicPr>
-                          <pic:cNvPr descr="figures/figure_2_change.png" id="72" name="Picture"/>
+                          <pic:cNvPr descr="figures/figure_2_change.png" id="91" name="Picture"/>
                           <pic:cNvPicPr>
                             <a:picLocks noChangeArrowheads="1" noChangeAspect="1"/>
                           </pic:cNvPicPr>
                         </pic:nvPicPr>
                         <pic:blipFill>
-                          <a:blip r:embed="rId70"/>
+                          <a:blip r:embed="rId89"/>
                           <a:stretch>
                             <a:fillRect/>
                           </a:stretch>
@@ -6956,7 +7176,7 @@
               <w:t xml:space="preserve">Figure 2: Within-female changes in egg number and mean egg perimeter from the initial to the replacement clutch. Each point represents one female; negative values indicate a decline. The line shows the posterior median relationship from the absolute-scale change-score model, and the shaded region denotes its 95% credible interval. Dashed lines indicate no change. Egg number declined in 38 of 45 females, egg perimeter declined in 35, and both traits declined in 28; the magnitudes of the absolute changes were not clearly associated.</w:t>
             </w:r>
           </w:p>
-          <w:bookmarkEnd w:id="73"/>
+          <w:bookmarkEnd w:id="92"/>
         </w:tc>
       </w:tr>
     </w:tbl>
@@ -6981,7 +7201,7 @@
       <w:tr>
         <w:tc>
           <w:tcPr/>
-          <w:bookmarkStart w:id="77" w:name="fig-egg-number-distributions"/>
+          <w:bookmarkStart w:id="96" w:name="fig-egg-number-distributions"/>
           <w:p>
             <w:pPr>
               <w:pStyle w:val="Compact"/>
@@ -6992,18 +7212,18 @@
                 <wp:inline>
                   <wp:extent cx="5683488" cy="5683488"/>
                   <wp:effectExtent b="0" l="0" r="0" t="0"/>
-                  <wp:docPr descr="" title="" id="75" name="Picture"/>
+                  <wp:docPr descr="" title="" id="94" name="Picture"/>
                   <a:graphic>
                     <a:graphicData uri="http://schemas.openxmlformats.org/drawingml/2006/picture">
                       <pic:pic>
                         <pic:nvPicPr>
-                          <pic:cNvPr descr="figures/supplement_egg_number_distributions.png" id="76" name="Picture"/>
+                          <pic:cNvPr descr="figures/supplement_egg_number_distributions.png" id="95" name="Picture"/>
                           <pic:cNvPicPr>
                             <a:picLocks noChangeArrowheads="1" noChangeAspect="1"/>
                           </pic:cNvPicPr>
                         </pic:nvPicPr>
                         <pic:blipFill>
-                          <a:blip r:embed="rId74"/>
+                          <a:blip r:embed="rId93"/>
                           <a:stretch>
                             <a:fillRect/>
                           </a:stretch>
@@ -7043,12 +7263,12 @@
               <w:t xml:space="preserve">Figure 3: Distribution of egg number in initial and experimentally induced replacement clutches. Rug marks show individual females. The greater spread in replacement-clutch egg number motivates reporting the common-scale primary analysis together with the within-event standardization sensitivity analysis.</w:t>
             </w:r>
           </w:p>
-          <w:bookmarkEnd w:id="77"/>
+          <w:bookmarkEnd w:id="96"/>
         </w:tc>
       </w:tr>
     </w:tbl>
-    <w:bookmarkEnd w:id="78"/>
-    <w:bookmarkEnd w:id="79"/>
+    <w:bookmarkEnd w:id="97"/>
+    <w:bookmarkEnd w:id="98"/>
     <w:sectPr>
       <w:headerReference r:id="rId10" w:type="even"/>
       <w:headerReference r:id="rId9" w:type="default"/>

</xml_diff>

<commit_message>
Updated some parts of the Methods.
</commit_message>
<xml_diff>
--- a/2025_earwig_fecundity_Evolutionary_Ecology.docx
+++ b/2025_earwig_fecundity_Evolutionary_Ecology.docx
@@ -185,7 +185,7 @@
         <w:t xml:space="preserve"> </w:t>
       </w:r>
       <w:r>
-        <w:t xml:space="preserve">(Honek 1993)</w:t>
+        <w:t xml:space="preserve">(Honěk and Honek 1993)</w:t>
       </w:r>
       <w:r>
         <w:t xml:space="preserve">. This adjustment is not a measure of female condition: a mass-based condition index would need to be interpreted relative to structural size, and structural size alone cannot capture current reserves, feeding history, or physiological state. Repeated measurements address a different part of this problem by separating two hierarchical levels. Among-female covariance asks whether females that generally produce more eggs also generally produce larger or smaller eggs. Within-female covariance asks whether a given female’s departure from her expected egg number is associated with a corresponding departure in egg dimensions, after accounting for systematic differences between reproductive events and persistent differences among females</w:t>
@@ -447,7 +447,7 @@
         <w:t xml:space="preserve"> </w:t>
       </w:r>
       <w:r>
-        <w:t xml:space="preserve">(Honek 1993)</w:t>
+        <w:t xml:space="preserve">(Honěk and Honek 1993)</w:t>
       </w:r>
       <w:r>
         <w:t xml:space="preserve">. I preferred pronotum length to body mass because adult earwigs do not molt and pronotum dimensions were therefore fixed before collection and could not be altered by the intervening reproductive or laboratory conditions</w:t>
@@ -540,7 +540,7 @@
         <w:pStyle w:val="BodyText"/>
       </w:pPr>
       <w:r>
-        <w:t xml:space="preserve">Following a reviewer’s concern about the conspicuous replacement-clutch observation with 10 eggs and a mean perimeter greater than 4 mm, I calculated leverage and Cook’s distance from the corresponding ordinary regression as screening diagnostics. Because the female was the repeated-measures unit, I refitted the Bayesian model after excluding only that observation and, separately, after excluding the entire female. Finally, posterior predictive checks indicated that a heavy-tailed response distribution could be useful, so I refitted the full-data model with a Student-</w:t>
+        <w:t xml:space="preserve">To assess the influence of the conspicuous replacement-clutch observation with 10 eggs and a mean perimeter greater than 4 mm, I calculated leverage and Cook’s distance from the corresponding ordinary regression as screening diagnostics. Because the female was the repeated-measures unit, I refitted the Bayesian model after excluding only that observation and, separately, after excluding the entire female. Finally, posterior predictive checks indicated that a heavy-tailed response distribution could be useful, so I refitted the full-data model with a Student-</w:t>
       </w:r>
       <w:r>
         <w:rPr>
@@ -553,7 +553,10 @@
         <w:t xml:space="preserve"> </w:t>
       </w:r>
       <w:r>
-        <w:t xml:space="preserve">likelihood. A supplementary histogram with rug marks shows the egg-number distribution for each event (</w:t>
+        <w:t xml:space="preserve">likelihood. Egg-number distributions for each reproductive event are shown in</w:t>
+      </w:r>
+      <w:r>
+        <w:t xml:space="preserve"> </w:t>
       </w:r>
       <w:hyperlink w:anchor="fig-egg-number-distributions">
         <w:r>
@@ -564,7 +567,10 @@
         </w:r>
       </w:hyperlink>
       <w:r>
-        <w:t xml:space="preserve">).</w:t>
+        <w:t xml:space="preserve"> </w:t>
+      </w:r>
+      <w:r>
+        <w:t xml:space="preserve">using histograms with rug marks.</w:t>
       </w:r>
     </w:p>
     <w:p>
@@ -934,7 +940,7 @@
         <w:pStyle w:val="BodyText"/>
       </w:pPr>
       <w:r>
-        <w:t xml:space="preserve">The conspicuous replacement-clutch observation identified by the reviewer had a Cook’s distance of 0.196 and leverage of 0.088. Excluding that observation yielded a replacement-clutch slope of -0.24 (95% CrI [-0.45, -0.03]); excluding the entire female gave -0.25 (95% CrI [-0.45, -0.04]). The Student-</w:t>
+        <w:t xml:space="preserve">The conspicuous replacement-clutch observation (10 eggs; mean perimeter greater than 4 mm) had a Cook’s distance of 0.196 and leverage of 0.088. Excluding that observation yielded a replacement-clutch slope of -0.24 (95% CrI [-0.45, -0.03]); excluding the entire female gave -0.25 (95% CrI [-0.45, -0.04]). The Student-</w:t>
       </w:r>
       <w:r>
         <w:rPr>
@@ -1632,6 +1638,23 @@
         <w:t xml:space="preserve">Hargitai R, Török J, Tóth L, et al (2005) Effects of environmental conditions and parental quality on inter-and intraclutch egg-size variation in the collared flycatcher (</w:t>
       </w:r>
       <w:r>
+        <w:rPr>
+          <w:i/>
+          <w:iCs/>
+        </w:rPr>
+        <w:t xml:space="preserve">Ficedula</w:t>
+      </w:r>
+      <w:r>
+        <w:t xml:space="preserve"> </w:t>
+      </w:r>
+      <w:r>
+        <w:rPr>
+          <w:i/>
+          <w:iCs/>
+        </w:rPr>
+        <w:t xml:space="preserve">Albicollis</w:t>
+      </w:r>
+      <w:r>
         <w:t xml:space="preserve">). Auk 122:509–522.</w:t>
       </w:r>
       <w:r>
@@ -1653,7 +1676,7 @@
         <w:pStyle w:val="Bibliography"/>
       </w:pPr>
       <w:r>
-        <w:t xml:space="preserve">Honek A (1993) Intraspecific variation in body size and fecundity in insects: A general relationship. Oikos 483–492.</w:t>
+        <w:t xml:space="preserve">Honěk A, Honek A (1993) Intraspecific variation in body size and fecundity in insects: A general relationship. Oikos 66:483–492.</w:t>
       </w:r>
       <w:r>
         <w:t xml:space="preserve"> </w:t>
@@ -1883,6 +1906,23 @@
         <w:t xml:space="preserve">Staerkle M, Kölliker M (2008) Maternal food regurgitation to nymphs in earwigs (</w:t>
       </w:r>
       <w:r>
+        <w:rPr>
+          <w:i/>
+          <w:iCs/>
+        </w:rPr>
+        <w:t xml:space="preserve">Forficula</w:t>
+      </w:r>
+      <w:r>
+        <w:t xml:space="preserve"> </w:t>
+      </w:r>
+      <w:r>
+        <w:rPr>
+          <w:i/>
+          <w:iCs/>
+        </w:rPr>
+        <w:t xml:space="preserve">Auricularia</w:t>
+      </w:r>
+      <w:r>
         <w:t xml:space="preserve">). Ethology 114:844–850.</w:t>
       </w:r>
       <w:r>
@@ -1947,28 +1987,28 @@
         <w:t xml:space="preserve">(</w:t>
       </w:r>
       <w:r>
-        <w:t xml:space="preserve">ermaptera:</w:t>
-      </w:r>
-      <w:r>
-        <w:t xml:space="preserve"> </w:t>
-      </w:r>
-      <w:r>
-        <w:t xml:space="preserve">Orficulidae) in three climatologically different zones of</w:t>
-      </w:r>
-      <w:r>
-        <w:t xml:space="preserve"> </w:t>
-      </w:r>
-      <w:r>
-        <w:t xml:space="preserve">orth</w:t>
-      </w:r>
-      <w:r>
-        <w:t xml:space="preserve"> </w:t>
-      </w:r>
-      <w:r>
-        <w:t xml:space="preserve">a</w:t>
-      </w:r>
-      <w:r>
-        <w:t xml:space="preserve">merica. Can Entomol 150:511–519.</w:t>
+        <w:t xml:space="preserve">Dermaptera</w:t>
+      </w:r>
+      <w:r>
+        <w:t xml:space="preserve">:</w:t>
+      </w:r>
+      <w:r>
+        <w:t xml:space="preserve"> </w:t>
+      </w:r>
+      <w:r>
+        <w:t xml:space="preserve">Forficulidae</w:t>
+      </w:r>
+      <w:r>
+        <w:t xml:space="preserve">) in three climatologically different zones of</w:t>
+      </w:r>
+      <w:r>
+        <w:t xml:space="preserve"> </w:t>
+      </w:r>
+      <w:r>
+        <w:t xml:space="preserve">North America</w:t>
+      </w:r>
+      <w:r>
+        <w:t xml:space="preserve">. Can Entomol 150:511–519.</w:t>
       </w:r>
       <w:r>
         <w:t xml:space="preserve"> </w:t>
@@ -1995,43 +2035,72 @@
         <w:t xml:space="preserve"> </w:t>
       </w:r>
       <w:r>
-        <w:t xml:space="preserve">orth</w:t>
-      </w:r>
-      <w:r>
-        <w:t xml:space="preserve"> </w:t>
-      </w:r>
-      <w:r>
-        <w:t xml:space="preserve">a</w:t>
-      </w:r>
-      <w:r>
-        <w:t xml:space="preserve">merican (</w:t>
-      </w:r>
-      <w:r>
-        <w:t xml:space="preserve">ontréal,</w:t>
-      </w:r>
-      <w:r>
-        <w:t xml:space="preserve"> </w:t>
-      </w:r>
-      <w:r>
-        <w:t xml:space="preserve">uébec) population of</w:t>
-      </w:r>
-      <w:r>
-        <w:t xml:space="preserve"> </w:t>
-      </w:r>
-      <w:r>
-        <w:t xml:space="preserve"> </w:t>
+        <w:t xml:space="preserve">North American</w:t>
+      </w:r>
+      <w:r>
+        <w:t xml:space="preserve"> </w:t>
+      </w:r>
+      <w:r>
+        <w:t xml:space="preserve">(</w:t>
+      </w:r>
+      <w:r>
+        <w:t xml:space="preserve">Montréal</w:t>
+      </w:r>
+      <w:r>
+        <w:t xml:space="preserve">,</w:t>
+      </w:r>
+      <w:r>
+        <w:t xml:space="preserve"> </w:t>
+      </w:r>
+      <w:r>
+        <w:t xml:space="preserve">Québec</w:t>
+      </w:r>
+      <w:r>
+        <w:t xml:space="preserve">) population of</w:t>
+      </w:r>
+      <w:r>
+        <w:t xml:space="preserve"> </w:t>
+      </w:r>
+      <w:r>
+        <w:rPr>
+          <w:i/>
+          <w:iCs/>
+        </w:rPr>
+        <w:t xml:space="preserve">Forficula</w:t>
+      </w:r>
+      <w:r>
+        <w:t xml:space="preserve"> </w:t>
+      </w:r>
+      <w:r>
+        <w:rPr>
+          <w:i/>
+          <w:iCs/>
+        </w:rPr>
+        <w:t xml:space="preserve">Auricularia</w:t>
+      </w:r>
+      <w:r>
+        <w:t xml:space="preserve"> </w:t>
+      </w:r>
+      <w:r>
+        <w:t xml:space="preserve">L</w:t>
       </w:r>
       <w:r>
         <w:t xml:space="preserve">. (</w:t>
       </w:r>
       <w:r>
-        <w:t xml:space="preserve">Ermaptera:</w:t>
-      </w:r>
-      <w:r>
-        <w:t xml:space="preserve"> </w:t>
-      </w:r>
-      <w:r>
-        <w:t xml:space="preserve">orficulidae). Can Entomol 124:1055–1061.</w:t>
+        <w:t xml:space="preserve">Dermaptera</w:t>
+      </w:r>
+      <w:r>
+        <w:t xml:space="preserve">:</w:t>
+      </w:r>
+      <w:r>
+        <w:t xml:space="preserve"> </w:t>
+      </w:r>
+      <w:r>
+        <w:t xml:space="preserve">Forficulidae</w:t>
+      </w:r>
+      <w:r>
+        <w:t xml:space="preserve">). Can Entomol 124:1055–1061.</w:t>
       </w:r>
       <w:r>
         <w:t xml:space="preserve"> </w:t>
@@ -7217,7 +7286,7 @@
                     <a:graphicData uri="http://schemas.openxmlformats.org/drawingml/2006/picture">
                       <pic:pic>
                         <pic:nvPicPr>
-                          <pic:cNvPr descr="figures/supplement_egg_number_distributions.png" id="95" name="Picture"/>
+                          <pic:cNvPr descr="figures/figure_3_egg_number_distributions.png" id="95" name="Picture"/>
                           <pic:cNvPicPr>
                             <a:picLocks noChangeArrowheads="1" noChangeAspect="1"/>
                           </pic:cNvPicPr>

</xml_diff>